<commit_message>
Record the 1 GB home volume from the new VM.
TNMSDEMO keeps homelv at 1014M after root and /tmp are grown.
</commit_message>
<xml_diff>
--- a/docs/customer/TNMS-9.1-RHEL8-install-without-repo.docx
+++ b/docs/customer/TNMS-9.1-RHEL8-install-without-repo.docx
@@ -3756,7 +3756,7 @@
         <w:t xml:space="preserve"> </w:t>
       </w:r>
       <w:r>
-        <w:t xml:space="preserve">is about 8G.</w:t>
+        <w:t xml:space="preserve">is about 1G.</w:t>
       </w:r>
       <w:r>
         <w:t xml:space="preserve"> </w:t>
@@ -3783,7 +3783,7 @@
         <w:rPr>
           <w:rStyle w:val="VerbatimChar"/>
         </w:rPr>
-        <w:t xml:space="preserve">/dev/mapper/rootvg-rootlv  8.0G  123M  7.9G   2% /</w:t>
+        <w:t xml:space="preserve">/dev/mapper/rootvg-rootlv  8.0G  118M  7.9G   2% /</w:t>
       </w:r>
       <w:r>
         <w:br w:type="textWrapping"/>
@@ -3792,7 +3792,7 @@
         <w:rPr>
           <w:rStyle w:val="VerbatimChar"/>
         </w:rPr>
-        <w:t xml:space="preserve">/dev/mapper/rootvg-tmplv    16G  1.3G   15G   8% /tmp</w:t>
+        <w:t xml:space="preserve">/dev/mapper/rootvg-tmplv    16G  149M   16G   1% /tmp</w:t>
       </w:r>
       <w:r>
         <w:br w:type="textWrapping"/>
@@ -3801,7 +3801,7 @@
         <w:rPr>
           <w:rStyle w:val="VerbatimChar"/>
         </w:rPr>
-        <w:t xml:space="preserve">/dev/mapper/rootvg-homelv   8.0G  100M  7.9G   2% /home</w:t>
+        <w:t xml:space="preserve">/dev/mapper/rootvg-homelv 1014M   40M  975M   4% /home</w:t>
       </w:r>
       <w:r>
         <w:br w:type="textWrapping"/>
@@ -15620,7 +15620,7 @@
     </w:lvl>
   </w:abstractNum>
   <w:abstractNum w:abstractNumId="990">
-    <w:nsid w:val="f8aaf12f"/>
+    <w:nsid w:val="aea6a689"/>
     <w:multiLevelType w:val="multilevel"/>
     <w:lvl w:ilvl="0">
       <w:numFmt w:val="bullet"/>
@@ -15723,7 +15723,7 @@
     </w:lvl>
   </w:abstractNum>
   <w:abstractNum w:abstractNumId="991">
-    <w:nsid w:val="7408ccb3"/>
+    <w:nsid w:val="9a048263"/>
     <w:multiLevelType w:val="multilevel"/>
     <w:lvl w:ilvl="0">
       <w:numFmt w:val="bullet"/>
@@ -15826,7 +15826,7 @@
     </w:lvl>
   </w:abstractNum>
   <w:abstractNum w:abstractNumId="99411">
-    <w:nsid w:val="b8fbd47b"/>
+    <w:nsid w:val="cef76d9c"/>
     <w:multiLevelType w:val="multilevel"/>
     <w:lvl w:ilvl="0">
       <w:start w:val="1"/>
@@ -15938,7 +15938,7 @@
     </w:lvl>
   </w:abstractNum>
   <w:abstractNum w:abstractNumId="99412">
-    <w:nsid w:val="10b7cbd3"/>
+    <w:nsid w:val="26b364f5"/>
     <w:multiLevelType w:val="multilevel"/>
     <w:lvl w:ilvl="0">
       <w:start w:val="2"/>
@@ -16050,7 +16050,7 @@
     </w:lvl>
   </w:abstractNum>
   <w:abstractNum w:abstractNumId="99413">
-    <w:nsid w:val="7504e883"/>
+    <w:nsid w:val="9b009e32"/>
     <w:multiLevelType w:val="multilevel"/>
     <w:lvl w:ilvl="0">
       <w:start w:val="3"/>

</xml_diff>

<commit_message>
Put the VS Code server on the 1 TB volume.
The 1 GB home volume fills while Remote SSH unpacks ~/.vscode-server. Pre-install now links that path to /opt/azureuser/vscode-server, owned by azureuser.
</commit_message>
<xml_diff>
--- a/docs/customer/TNMS-9.1-RHEL8-install-without-repo.docx
+++ b/docs/customer/TNMS-9.1-RHEL8-install-without-repo.docx
@@ -4488,7 +4488,61 @@
         <w:t xml:space="preserve"> </w:t>
       </w:r>
       <w:r>
-        <w:t xml:space="preserve">on the server. Any SSH user can receive that copy. From the workstation directory that contains the five files:</w:t>
+        <w:t xml:space="preserve">on the server. Any SSH user can receive that copy.</w:t>
+      </w:r>
+      <w:r>
+        <w:t xml:space="preserve"> </w:t>
+      </w:r>
+      <w:r>
+        <w:rPr>
+          <w:rStyle w:val="VerbatimChar"/>
+        </w:rPr>
+        <w:t xml:space="preserve">/home</w:t>
+      </w:r>
+      <w:r>
+        <w:t xml:space="preserve"> </w:t>
+      </w:r>
+      <w:r>
+        <w:t xml:space="preserve">is about 1 GB, so a VS Code Remote SSH connection needs the symlink in pre-install section 6 before it can unpack. The five install files still go to</w:t>
+      </w:r>
+      <w:r>
+        <w:t xml:space="preserve"> </w:t>
+      </w:r>
+      <w:r>
+        <w:rPr>
+          <w:rStyle w:val="VerbatimChar"/>
+        </w:rPr>
+        <w:t xml:space="preserve">/tmp</w:t>
+      </w:r>
+      <w:r>
+        <w:t xml:space="preserve">, not into</w:t>
+      </w:r>
+      <w:r>
+        <w:t xml:space="preserve"> </w:t>
+      </w:r>
+      <w:r>
+        <w:rPr>
+          <w:rStyle w:val="VerbatimChar"/>
+        </w:rPr>
+        <w:t xml:space="preserve">/home</w:t>
+      </w:r>
+      <w:r>
+        <w:t xml:space="preserve"> </w:t>
+      </w:r>
+      <w:r>
+        <w:t xml:space="preserve">and not directly into</w:t>
+      </w:r>
+      <w:r>
+        <w:t xml:space="preserve"> </w:t>
+      </w:r>
+      <w:r>
+        <w:rPr>
+          <w:rStyle w:val="VerbatimChar"/>
+        </w:rPr>
+        <w:t xml:space="preserve">/opt/tnms-install</w:t>
+      </w:r>
+      <w:r>
+        <w:t xml:space="preserve">. From the workstation directory that contains the five files:</w:t>
       </w:r>
     </w:p>
     <w:p>
@@ -15620,7 +15674,7 @@
     </w:lvl>
   </w:abstractNum>
   <w:abstractNum w:abstractNumId="990">
-    <w:nsid w:val="aea6a689"/>
+    <w:nsid w:val="7b86090d"/>
     <w:multiLevelType w:val="multilevel"/>
     <w:lvl w:ilvl="0">
       <w:numFmt w:val="bullet"/>
@@ -15723,7 +15777,7 @@
     </w:lvl>
   </w:abstractNum>
   <w:abstractNum w:abstractNumId="991">
-    <w:nsid w:val="9a048263"/>
+    <w:nsid w:val="76e3e43b"/>
     <w:multiLevelType w:val="multilevel"/>
     <w:lvl w:ilvl="0">
       <w:numFmt w:val="bullet"/>
@@ -15826,7 +15880,7 @@
     </w:lvl>
   </w:abstractNum>
   <w:abstractNum w:abstractNumId="99411">
-    <w:nsid w:val="cef76d9c"/>
+    <w:nsid w:val="3bd6ec59"/>
     <w:multiLevelType w:val="multilevel"/>
     <w:lvl w:ilvl="0">
       <w:start w:val="1"/>
@@ -15938,7 +15992,7 @@
     </w:lvl>
   </w:abstractNum>
   <w:abstractNum w:abstractNumId="99412">
-    <w:nsid w:val="26b364f5"/>
+    <w:nsid w:val="8392e3b1"/>
     <w:multiLevelType w:val="multilevel"/>
     <w:lvl w:ilvl="0">
       <w:start w:val="2"/>
@@ -16050,7 +16104,7 @@
     </w:lvl>
   </w:abstractNum>
   <w:abstractNum w:abstractNumId="99413">
-    <w:nsid w:val="9b009e32"/>
+    <w:nsid w:val="77e01d45"/>
     <w:multiLevelType w:val="multilevel"/>
     <w:lvl w:ilvl="0">
       <w:start w:val="3"/>

</xml_diff>

<commit_message>
Let the SSH login read the TNMS install files.
Mode 700 on /opt/tnms-install blocked azureuser from opening tnms-install.properties.in. The directory is now mode 750 and the properties file mode 640, both group azureuser. Plaintext passwords stay in /root.
</commit_message>
<xml_diff>
--- a/docs/customer/TNMS-9.1-RHEL8-install-without-repo.docx
+++ b/docs/customer/TNMS-9.1-RHEL8-install-without-repo.docx
@@ -4732,7 +4732,7 @@
         <w:rPr>
           <w:rStyle w:val="NormalTok"/>
         </w:rPr>
-        <w:t xml:space="preserve"> -d -o root -g root -m 700 /opt/tnms-install /opt/tnms-install/resources</w:t>
+        <w:t xml:space="preserve"> -d -o root -g azureuser -m 750 /opt/tnms-install /opt/tnms-install/resources</w:t>
       </w:r>
       <w:r>
         <w:br w:type="textWrapping"/>
@@ -4747,7 +4747,7 @@
         <w:rPr>
           <w:rStyle w:val="NormalTok"/>
         </w:rPr>
-        <w:t xml:space="preserve"> -o root -g root -m 700 /tmp/install-tnms-wizard.sh /opt/tnms-install/install-tnms-wizard.sh</w:t>
+        <w:t xml:space="preserve"> -o root -g azureuser -m 740 /tmp/install-tnms-wizard.sh /opt/tnms-install/install-tnms-wizard.sh</w:t>
       </w:r>
       <w:r>
         <w:br w:type="textWrapping"/>
@@ -4762,7 +4762,7 @@
         <w:rPr>
           <w:rStyle w:val="NormalTok"/>
         </w:rPr>
-        <w:t xml:space="preserve"> -o root -g root -m 600 /tmp/tnms-install.properties.in /opt/tnms-install/tnms-install.properties.in</w:t>
+        <w:t xml:space="preserve"> -o root -g azureuser -m 640 /tmp/tnms-install.properties.in /opt/tnms-install/tnms-install.properties.in</w:t>
       </w:r>
       <w:r>
         <w:br w:type="textWrapping"/>
@@ -4777,7 +4777,7 @@
         <w:rPr>
           <w:rStyle w:val="NormalTok"/>
         </w:rPr>
-        <w:t xml:space="preserve"> -o root -g root -m 644 \</w:t>
+        <w:t xml:space="preserve"> -o root -g azureuser -m 640 \</w:t>
       </w:r>
       <w:r>
         <w:br w:type="textWrapping"/>
@@ -4914,6 +4914,81 @@
         <w:t xml:space="preserve">/opt/tnms-install</w:t>
       </w:r>
       <w:r>
+        <w:t xml:space="preserve">. Owner is root. Group is</w:t>
+      </w:r>
+      <w:r>
+        <w:t xml:space="preserve"> </w:t>
+      </w:r>
+      <w:r>
+        <w:rPr>
+          <w:rStyle w:val="VerbatimChar"/>
+        </w:rPr>
+        <w:t xml:space="preserve">azureuser</w:t>
+      </w:r>
+      <w:r>
+        <w:t xml:space="preserve">. The directory is mode</w:t>
+      </w:r>
+      <w:r>
+        <w:t xml:space="preserve"> </w:t>
+      </w:r>
+      <w:r>
+        <w:rPr>
+          <w:rStyle w:val="VerbatimChar"/>
+        </w:rPr>
+        <w:t xml:space="preserve">750</w:t>
+      </w:r>
+      <w:r>
+        <w:t xml:space="preserve">, the script is mode</w:t>
+      </w:r>
+      <w:r>
+        <w:t xml:space="preserve"> </w:t>
+      </w:r>
+      <w:r>
+        <w:rPr>
+          <w:rStyle w:val="VerbatimChar"/>
+        </w:rPr>
+        <w:t xml:space="preserve">740</w:t>
+      </w:r>
+      <w:r>
+        <w:t xml:space="preserve">, and</w:t>
+      </w:r>
+      <w:r>
+        <w:t xml:space="preserve"> </w:t>
+      </w:r>
+      <w:r>
+        <w:rPr>
+          <w:rStyle w:val="VerbatimChar"/>
+        </w:rPr>
+        <w:t xml:space="preserve">tnms-install.properties.in</w:t>
+      </w:r>
+      <w:r>
+        <w:t xml:space="preserve"> </w:t>
+      </w:r>
+      <w:r>
+        <w:t xml:space="preserve">is mode</w:t>
+      </w:r>
+      <w:r>
+        <w:t xml:space="preserve"> </w:t>
+      </w:r>
+      <w:r>
+        <w:rPr>
+          <w:rStyle w:val="VerbatimChar"/>
+        </w:rPr>
+        <w:t xml:space="preserve">640</w:t>
+      </w:r>
+      <w:r>
+        <w:t xml:space="preserve">. The SSH login can read the files. It cannot change them. Plaintext passwords stay in</w:t>
+      </w:r>
+      <w:r>
+        <w:t xml:space="preserve"> </w:t>
+      </w:r>
+      <w:r>
+        <w:rPr>
+          <w:rStyle w:val="VerbatimChar"/>
+        </w:rPr>
+        <w:t xml:space="preserve">/root</w:t>
+      </w:r>
+      <w:r>
         <w:t xml:space="preserve">.</w:t>
       </w:r>
     </w:p>
@@ -4922,10 +4997,46 @@
         <w:pStyle w:val="BodyText"/>
       </w:pPr>
       <w:r>
-        <w:rPr>
-          <w:b/>
-        </w:rPr>
-        <w:t xml:space="preserve">Confirm by running:</w:t>
+        <w:t xml:space="preserve">When the files are already in place and VS Code reports</w:t>
+      </w:r>
+      <w:r>
+        <w:t xml:space="preserve"> </w:t>
+      </w:r>
+      <w:r>
+        <w:rPr>
+          <w:rStyle w:val="VerbatimChar"/>
+        </w:rPr>
+        <w:t xml:space="preserve">EACCES</w:t>
+      </w:r>
+      <w:r>
+        <w:t xml:space="preserve"> </w:t>
+      </w:r>
+      <w:r>
+        <w:t xml:space="preserve">on</w:t>
+      </w:r>
+      <w:r>
+        <w:t xml:space="preserve"> </w:t>
+      </w:r>
+      <w:r>
+        <w:rPr>
+          <w:rStyle w:val="VerbatimChar"/>
+        </w:rPr>
+        <w:t xml:space="preserve">tnms-install.properties.in</w:t>
+      </w:r>
+      <w:r>
+        <w:t xml:space="preserve">, the directory is still mode</w:t>
+      </w:r>
+      <w:r>
+        <w:t xml:space="preserve"> </w:t>
+      </w:r>
+      <w:r>
+        <w:rPr>
+          <w:rStyle w:val="VerbatimChar"/>
+        </w:rPr>
+        <w:t xml:space="preserve">700</w:t>
+      </w:r>
+      <w:r>
+        <w:t xml:space="preserve">. Set the group and mode in place:</w:t>
       </w:r>
     </w:p>
     <w:p>
@@ -4937,13 +5048,196 @@
         <w:rPr>
           <w:rStyle w:val="FunctionTok"/>
         </w:rPr>
-        <w:t xml:space="preserve">ls</w:t>
-      </w:r>
-      <w:r>
-        <w:rPr>
-          <w:rStyle w:val="NormalTok"/>
-        </w:rPr>
-        <w:t xml:space="preserve"> -l /opt/tnms-install</w:t>
+        <w:t xml:space="preserve">chgrp</w:t>
+      </w:r>
+      <w:r>
+        <w:rPr>
+          <w:rStyle w:val="NormalTok"/>
+        </w:rPr>
+        <w:t xml:space="preserve"> azureuser /opt/tnms-install /opt/tnms-install/resources \</w:t>
+      </w:r>
+      <w:r>
+        <w:br w:type="textWrapping"/>
+      </w:r>
+      <w:r>
+        <w:rPr>
+          <w:rStyle w:val="NormalTok"/>
+        </w:rPr>
+        <w:t xml:space="preserve">  /opt/tnms-install/install-tnms-wizard.sh \</w:t>
+      </w:r>
+      <w:r>
+        <w:br w:type="textWrapping"/>
+      </w:r>
+      <w:r>
+        <w:rPr>
+          <w:rStyle w:val="NormalTok"/>
+        </w:rPr>
+        <w:t xml:space="preserve">  /opt/tnms-install/tnms-install.properties.in</w:t>
+      </w:r>
+      <w:r>
+        <w:br w:type="textWrapping"/>
+      </w:r>
+      <w:r>
+        <w:rPr>
+          <w:rStyle w:val="FunctionTok"/>
+        </w:rPr>
+        <w:t xml:space="preserve">chmod</w:t>
+      </w:r>
+      <w:r>
+        <w:rPr>
+          <w:rStyle w:val="NormalTok"/>
+        </w:rPr>
+        <w:t xml:space="preserve"> 750 /opt/tnms-install /opt/tnms-install/resources</w:t>
+      </w:r>
+      <w:r>
+        <w:br w:type="textWrapping"/>
+      </w:r>
+      <w:r>
+        <w:rPr>
+          <w:rStyle w:val="FunctionTok"/>
+        </w:rPr>
+        <w:t xml:space="preserve">chmod</w:t>
+      </w:r>
+      <w:r>
+        <w:rPr>
+          <w:rStyle w:val="NormalTok"/>
+        </w:rPr>
+        <w:t xml:space="preserve"> 740 /opt/tnms-install/install-tnms-wizard.sh</w:t>
+      </w:r>
+      <w:r>
+        <w:br w:type="textWrapping"/>
+      </w:r>
+      <w:r>
+        <w:rPr>
+          <w:rStyle w:val="FunctionTok"/>
+        </w:rPr>
+        <w:t xml:space="preserve">chmod</w:t>
+      </w:r>
+      <w:r>
+        <w:rPr>
+          <w:rStyle w:val="NormalTok"/>
+        </w:rPr>
+        <w:t xml:space="preserve"> 640 /opt/tnms-install/tnms-install.properties.in</w:t>
+      </w:r>
+      <w:r>
+        <w:br w:type="textWrapping"/>
+      </w:r>
+      <w:r>
+        <w:rPr>
+          <w:rStyle w:val="KeywordTok"/>
+        </w:rPr>
+        <w:t xml:space="preserve">if</w:t>
+      </w:r>
+      <w:r>
+        <w:rPr>
+          <w:rStyle w:val="NormalTok"/>
+        </w:rPr>
+        <w:t xml:space="preserve"> </w:t>
+      </w:r>
+      <w:r>
+        <w:rPr>
+          <w:rStyle w:val="BuiltInTok"/>
+        </w:rPr>
+        <w:t xml:space="preserve">compgen</w:t>
+      </w:r>
+      <w:r>
+        <w:rPr>
+          <w:rStyle w:val="NormalTok"/>
+        </w:rPr>
+        <w:t xml:space="preserve"> -G </w:t>
+      </w:r>
+      <w:r>
+        <w:rPr>
+          <w:rStyle w:val="StringTok"/>
+        </w:rPr>
+        <w:t xml:space="preserve">'/opt/tnms-install/resources/*.zip'</w:t>
+      </w:r>
+      <w:r>
+        <w:rPr>
+          <w:rStyle w:val="NormalTok"/>
+        </w:rPr>
+        <w:t xml:space="preserve"> </w:t>
+      </w:r>
+      <w:r>
+        <w:rPr>
+          <w:rStyle w:val="OperatorTok"/>
+        </w:rPr>
+        <w:t xml:space="preserve">&gt;</w:t>
+      </w:r>
+      <w:r>
+        <w:rPr>
+          <w:rStyle w:val="NormalTok"/>
+        </w:rPr>
+        <w:t xml:space="preserve"> /dev/null</w:t>
+      </w:r>
+      <w:r>
+        <w:rPr>
+          <w:rStyle w:val="KeywordTok"/>
+        </w:rPr>
+        <w:t xml:space="preserve">;</w:t>
+      </w:r>
+      <w:r>
+        <w:rPr>
+          <w:rStyle w:val="NormalTok"/>
+        </w:rPr>
+        <w:t xml:space="preserve"> </w:t>
+      </w:r>
+      <w:r>
+        <w:rPr>
+          <w:rStyle w:val="KeywordTok"/>
+        </w:rPr>
+        <w:t xml:space="preserve">then</w:t>
+      </w:r>
+      <w:r>
+        <w:br w:type="textWrapping"/>
+      </w:r>
+      <w:r>
+        <w:rPr>
+          <w:rStyle w:val="NormalTok"/>
+        </w:rPr>
+        <w:t xml:space="preserve">  </w:t>
+      </w:r>
+      <w:r>
+        <w:rPr>
+          <w:rStyle w:val="FunctionTok"/>
+        </w:rPr>
+        <w:t xml:space="preserve">chgrp</w:t>
+      </w:r>
+      <w:r>
+        <w:rPr>
+          <w:rStyle w:val="NormalTok"/>
+        </w:rPr>
+        <w:t xml:space="preserve"> azureuser /opt/tnms-install/resources/*.zip</w:t>
+      </w:r>
+      <w:r>
+        <w:br w:type="textWrapping"/>
+      </w:r>
+      <w:r>
+        <w:rPr>
+          <w:rStyle w:val="NormalTok"/>
+        </w:rPr>
+        <w:t xml:space="preserve">  </w:t>
+      </w:r>
+      <w:r>
+        <w:rPr>
+          <w:rStyle w:val="FunctionTok"/>
+        </w:rPr>
+        <w:t xml:space="preserve">chmod</w:t>
+      </w:r>
+      <w:r>
+        <w:rPr>
+          <w:rStyle w:val="NormalTok"/>
+        </w:rPr>
+        <w:t xml:space="preserve"> 640 /opt/tnms-install/resources/*.zip</w:t>
+      </w:r>
+      <w:r>
+        <w:br w:type="textWrapping"/>
+      </w:r>
+      <w:r>
+        <w:rPr>
+          <w:rStyle w:val="KeywordTok"/>
+        </w:rPr>
+        <w:t xml:space="preserve">fi</w:t>
       </w:r>
     </w:p>
     <w:p>
@@ -4952,32 +5246,56 @@
       </w:pPr>
       <w:r>
         <w:rPr>
+          <w:rStyle w:val="VerbatimChar"/>
+        </w:rPr>
+        <w:t xml:space="preserve">chgrp</w:t>
+      </w:r>
+      <w:r>
+        <w:t xml:space="preserve"> </w:t>
+      </w:r>
+      <w:r>
+        <w:t xml:space="preserve">and</w:t>
+      </w:r>
+      <w:r>
+        <w:t xml:space="preserve"> </w:t>
+      </w:r>
+      <w:r>
+        <w:rPr>
+          <w:rStyle w:val="VerbatimChar"/>
+        </w:rPr>
+        <w:t xml:space="preserve">chmod</w:t>
+      </w:r>
+      <w:r>
+        <w:t xml:space="preserve"> </w:t>
+      </w:r>
+      <w:r>
+        <w:t xml:space="preserve">print nothing.</w:t>
+      </w:r>
+      <w:r>
+        <w:t xml:space="preserve"> </w:t>
+      </w:r>
+      <w:r>
+        <w:rPr>
+          <w:rStyle w:val="VerbatimChar"/>
+        </w:rPr>
+        <w:t xml:space="preserve">compgen</w:t>
+      </w:r>
+      <w:r>
+        <w:t xml:space="preserve"> </w:t>
+      </w:r>
+      <w:r>
+        <w:t xml:space="preserve">prints nothing when no zip is present yet.</w:t>
+      </w:r>
+    </w:p>
+    <w:p>
+      <w:pPr>
+        <w:pStyle w:val="BodyText"/>
+      </w:pPr>
+      <w:r>
+        <w:rPr>
           <w:b/>
         </w:rPr>
-        <w:t xml:space="preserve">Expected output:</w:t>
-      </w:r>
-    </w:p>
-    <w:p>
-      <w:pPr>
-        <w:pStyle w:val="BodyText"/>
-      </w:pPr>
-      <w:r>
-        <w:t xml:space="preserve">Both wizard names are listed, plus the</w:t>
-      </w:r>
-      <w:r>
-        <w:t xml:space="preserve"> </w:t>
-      </w:r>
-      <w:r>
-        <w:rPr>
-          <w:rStyle w:val="VerbatimChar"/>
-        </w:rPr>
-        <w:t xml:space="preserve">resources</w:t>
-      </w:r>
-      <w:r>
-        <w:t xml:space="preserve"> </w:t>
-      </w:r>
-      <w:r>
-        <w:t xml:space="preserve">directory. The modes are the check. Sizes and dates follow the files you copied. On RHEL the mode column ends with a dot.</w:t>
+        <w:t xml:space="preserve">Confirm by running:</w:t>
       </w:r>
     </w:p>
     <w:p>
@@ -4987,9 +5305,61 @@
       </w:pPr>
       <w:r>
         <w:rPr>
-          <w:rStyle w:val="VerbatimChar"/>
-        </w:rPr>
-        <w:t xml:space="preserve">-rwx------. 1 root root &lt;size&gt; &lt;date&gt; install-tnms-wizard.sh</w:t>
+          <w:rStyle w:val="FunctionTok"/>
+        </w:rPr>
+        <w:t xml:space="preserve">ls</w:t>
+      </w:r>
+      <w:r>
+        <w:rPr>
+          <w:rStyle w:val="NormalTok"/>
+        </w:rPr>
+        <w:t xml:space="preserve"> -l /opt/tnms-install</w:t>
+      </w:r>
+    </w:p>
+    <w:p>
+      <w:pPr>
+        <w:pStyle w:val="FirstParagraph"/>
+      </w:pPr>
+      <w:r>
+        <w:rPr>
+          <w:b/>
+        </w:rPr>
+        <w:t xml:space="preserve">Expected output:</w:t>
+      </w:r>
+    </w:p>
+    <w:p>
+      <w:pPr>
+        <w:pStyle w:val="BodyText"/>
+      </w:pPr>
+      <w:r>
+        <w:t xml:space="preserve">Both wizard names are listed, plus the</w:t>
+      </w:r>
+      <w:r>
+        <w:t xml:space="preserve"> </w:t>
+      </w:r>
+      <w:r>
+        <w:rPr>
+          <w:rStyle w:val="VerbatimChar"/>
+        </w:rPr>
+        <w:t xml:space="preserve">resources</w:t>
+      </w:r>
+      <w:r>
+        <w:t xml:space="preserve"> </w:t>
+      </w:r>
+      <w:r>
+        <w:t xml:space="preserve">directory. The modes are the check. Sizes and dates follow the files you copied. On RHEL the mode column ends with a dot.</w:t>
+      </w:r>
+    </w:p>
+    <w:p>
+      <w:pPr>
+        <w:pStyle w:val="SourceCode"/>
+        <w:spacing w:before="120" w:after="120" w:line="276" w:lineRule="auto"/>
+      </w:pPr>
+      <w:r>
+        <w:rPr>
+          <w:rStyle w:val="VerbatimChar"/>
+        </w:rPr>
+        <w:t xml:space="preserve">-rwxr-----. 1 root azureuser &lt;size&gt; &lt;date&gt; install-tnms-wizard.sh</w:t>
       </w:r>
       <w:r>
         <w:br w:type="textWrapping"/>
@@ -4998,7 +5368,7 @@
         <w:rPr>
           <w:rStyle w:val="VerbatimChar"/>
         </w:rPr>
-        <w:t xml:space="preserve">drwx------. 2 root root &lt;size&gt; &lt;date&gt; resources</w:t>
+        <w:t xml:space="preserve">drwxr-x---. 2 root azureuser &lt;size&gt; &lt;date&gt; resources</w:t>
       </w:r>
       <w:r>
         <w:br w:type="textWrapping"/>
@@ -5007,7 +5377,7 @@
         <w:rPr>
           <w:rStyle w:val="VerbatimChar"/>
         </w:rPr>
-        <w:t xml:space="preserve">-rw-------. 1 root root &lt;size&gt; &lt;date&gt; tnms-install.properties.in</w:t>
+        <w:t xml:space="preserve">-rw-r-----. 1 root azureuser &lt;size&gt; &lt;date&gt; tnms-install.properties.in</w:t>
       </w:r>
     </w:p>
     <w:p>
@@ -15674,7 +16044,7 @@
     </w:lvl>
   </w:abstractNum>
   <w:abstractNum w:abstractNumId="990">
-    <w:nsid w:val="7b86090d"/>
+    <w:nsid w:val="16b8c833"/>
     <w:multiLevelType w:val="multilevel"/>
     <w:lvl w:ilvl="0">
       <w:numFmt w:val="bullet"/>
@@ -15777,7 +16147,7 @@
     </w:lvl>
   </w:abstractNum>
   <w:abstractNum w:abstractNumId="991">
-    <w:nsid w:val="76e3e43b"/>
+    <w:nsid w:val="8216a3b7"/>
     <w:multiLevelType w:val="multilevel"/>
     <w:lvl w:ilvl="0">
       <w:numFmt w:val="bullet"/>
@@ -15880,7 +16250,7 @@
     </w:lvl>
   </w:abstractNum>
   <w:abstractNum w:abstractNumId="99411">
-    <w:nsid w:val="3bd6ec59"/>
+    <w:nsid w:val="4709abd4"/>
     <w:multiLevelType w:val="multilevel"/>
     <w:lvl w:ilvl="0">
       <w:start w:val="1"/>
@@ -15992,7 +16362,7 @@
     </w:lvl>
   </w:abstractNum>
   <w:abstractNum w:abstractNumId="99412">
-    <w:nsid w:val="8392e3b1"/>
+    <w:nsid w:val="8ec5a32d"/>
     <w:multiLevelType w:val="multilevel"/>
     <w:lvl w:ilvl="0">
       <w:start w:val="2"/>
@@ -16104,7 +16474,7 @@
     </w:lvl>
   </w:abstractNum>
   <w:abstractNum w:abstractNumId="99413">
-    <w:nsid w:val="77e01d45"/>
+    <w:nsid w:val="8312dcc0"/>
     <w:multiLevelType w:val="multilevel"/>
     <w:lvl w:ilvl="0">
       <w:start w:val="3"/>

</xml_diff>

<commit_message>
Tell the reader to stage the five install files in /tmp first.
Before section 1, copy the wizard script, the properties file, and the three zip files to /tmp. The guide moves them to /opt/tnms-install after the disk checks.
</commit_message>
<xml_diff>
--- a/docs/customer/TNMS-9.1-RHEL8-install-without-repo.docx
+++ b/docs/customer/TNMS-9.1-RHEL8-install-without-repo.docx
@@ -54,7 +54,754 @@
         <w:t xml:space="preserve">/opt</w:t>
       </w:r>
       <w:r>
-        <w:t xml:space="preserve">. Then run this guide. The wizard files and the three vendor zip files go in</w:t>
+        <w:t xml:space="preserve">. Then run this guide.</w:t>
+      </w:r>
+    </w:p>
+    <w:p>
+      <w:pPr>
+        <w:pStyle w:val="BodyText"/>
+      </w:pPr>
+      <w:r>
+        <w:t xml:space="preserve">One machine. Small Plus. TNMS Server and Mediation together. New database.</w:t>
+      </w:r>
+    </w:p>
+    <w:p>
+      <w:pPr>
+        <w:pStyle w:val="BodyText"/>
+      </w:pPr>
+      <w:r>
+        <w:t xml:space="preserve">The TNMS client login follows the wizard-file section. The database and SFTP passwords are in the table after that. Write the database passwords into</w:t>
+      </w:r>
+      <w:r>
+        <w:t xml:space="preserve"> </w:t>
+      </w:r>
+      <w:r>
+        <w:rPr>
+          <w:rStyle w:val="VerbatimChar"/>
+        </w:rPr>
+        <w:t xml:space="preserve">/root/tnms-db-credentials</w:t>
+      </w:r>
+      <w:r>
+        <w:t xml:space="preserve"> </w:t>
+      </w:r>
+      <w:r>
+        <w:t xml:space="preserve">(mode 600). A step headed</w:t>
+      </w:r>
+      <w:r>
+        <w:t xml:space="preserve"> </w:t>
+      </w:r>
+      <w:r>
+        <w:rPr>
+          <w:b/>
+        </w:rPr>
+        <w:t xml:space="preserve">This host</w:t>
+      </w:r>
+      <w:r>
+        <w:t xml:space="preserve"> </w:t>
+      </w:r>
+      <w:r>
+        <w:t xml:space="preserve">applies when the fresh server matches the condition in that step.</w:t>
+      </w:r>
+    </w:p>
+    <w:p>
+      <w:pPr>
+        <w:pStyle w:val="BodyText"/>
+      </w:pPr>
+      <w:r>
+        <w:t xml:space="preserve">A line that says</w:t>
+      </w:r>
+      <w:r>
+        <w:t xml:space="preserve"> </w:t>
+      </w:r>
+      <w:r>
+        <w:rPr>
+          <w:b/>
+        </w:rPr>
+        <w:t xml:space="preserve">Confirm by running</w:t>
+      </w:r>
+      <w:r>
+        <w:t xml:space="preserve"> </w:t>
+      </w:r>
+      <w:r>
+        <w:t xml:space="preserve">is a separate command. Run that command. The next</w:t>
+      </w:r>
+      <w:r>
+        <w:t xml:space="preserve"> </w:t>
+      </w:r>
+      <w:r>
+        <w:rPr>
+          <w:b/>
+        </w:rPr>
+        <w:t xml:space="preserve">Expected output</w:t>
+      </w:r>
+      <w:r>
+        <w:t xml:space="preserve"> </w:t>
+      </w:r>
+      <w:r>
+        <w:t xml:space="preserve">block is what that command should print. Compare the two. A work command that prints nothing is finished when the shell prompt returns. Names and addresses below are this host. Sizes move with the disk. Replace</w:t>
+      </w:r>
+      <w:r>
+        <w:t xml:space="preserve"> </w:t>
+      </w:r>
+      <w:r>
+        <w:rPr>
+          <w:rStyle w:val="VerbatimChar"/>
+        </w:rPr>
+        <w:t xml:space="preserve">TNMS</w:t>
+      </w:r>
+      <w:r>
+        <w:t xml:space="preserve"> </w:t>
+      </w:r>
+      <w:r>
+        <w:t xml:space="preserve">and</w:t>
+      </w:r>
+      <w:r>
+        <w:t xml:space="preserve"> </w:t>
+      </w:r>
+      <w:r>
+        <w:rPr>
+          <w:rStyle w:val="VerbatimChar"/>
+        </w:rPr>
+        <w:t xml:space="preserve">172.16.0.4</w:t>
+      </w:r>
+      <w:r>
+        <w:t xml:space="preserve"> </w:t>
+      </w:r>
+      <w:r>
+        <w:t xml:space="preserve">with the site values.</w:t>
+      </w:r>
+    </w:p>
+    <w:p>
+      <w:pPr>
+        <w:pStyle w:val="Heading2"/>
+      </w:pPr>
+      <w:bookmarkStart w:id="23" w:name="before-you-start"/>
+      <w:r>
+        <w:t xml:space="preserve">Before you start</w:t>
+      </w:r>
+      <w:bookmarkEnd w:id="23"/>
+    </w:p>
+    <w:p>
+      <w:pPr>
+        <w:pStyle w:val="FirstParagraph"/>
+      </w:pPr>
+      <w:r>
+        <w:t xml:space="preserve">Copy these five files to</w:t>
+      </w:r>
+      <w:r>
+        <w:t xml:space="preserve"> </w:t>
+      </w:r>
+      <w:r>
+        <w:rPr>
+          <w:rStyle w:val="VerbatimChar"/>
+        </w:rPr>
+        <w:t xml:space="preserve">/tmp</w:t>
+      </w:r>
+      <w:r>
+        <w:t xml:space="preserve"> </w:t>
+      </w:r>
+      <w:r>
+        <w:t xml:space="preserve">on the server before section 1. Do this from the workstation before hostname, packages, Oracle, or TNMS.</w:t>
+      </w:r>
+      <w:r>
+        <w:t xml:space="preserve"> </w:t>
+      </w:r>
+      <w:r>
+        <w:rPr>
+          <w:rStyle w:val="VerbatimChar"/>
+        </w:rPr>
+        <w:t xml:space="preserve">/tmp</w:t>
+      </w:r>
+      <w:r>
+        <w:t xml:space="preserve"> </w:t>
+      </w:r>
+      <w:r>
+        <w:t xml:space="preserve">is the 16 GB filesystem. The Oracle zip is about 5 GB.</w:t>
+      </w:r>
+      <w:r>
+        <w:t xml:space="preserve"> </w:t>
+      </w:r>
+      <w:r>
+        <w:rPr>
+          <w:rStyle w:val="VerbatimChar"/>
+        </w:rPr>
+        <w:t xml:space="preserve">/home</w:t>
+      </w:r>
+      <w:r>
+        <w:t xml:space="preserve"> </w:t>
+      </w:r>
+      <w:r>
+        <w:t xml:space="preserve">is about 1 GB, so leave these files out of</w:t>
+      </w:r>
+      <w:r>
+        <w:t xml:space="preserve"> </w:t>
+      </w:r>
+      <w:r>
+        <w:rPr>
+          <w:rStyle w:val="VerbatimChar"/>
+        </w:rPr>
+        <w:t xml:space="preserve">/home</w:t>
+      </w:r>
+      <w:r>
+        <w:t xml:space="preserve">.</w:t>
+      </w:r>
+    </w:p>
+    <w:p>
+      <w:pPr>
+        <w:spacing w:before="80" w:after="80" w:line="160" w:lineRule="exact"/>
+      </w:pPr>
+    </w:p>
+    <w:tbl>
+      <w:tblPr>
+        <w:tblStyle w:val="Table"/>
+        <w:tblW w:type="dxa" w:w="10080"/>
+        <w:tblLayout w:type="fixed"/>
+        <w:tblLook w:firstRow="1" w:noHBand="0" w:noVBand="1"/>
+      </w:tblPr>
+      <w:tblGrid>
+        <w:gridCol w:w="5040"/>
+        <w:gridCol w:w="5040"/>
+      </w:tblGrid>
+      <w:tr>
+        <w:trPr>
+          <w:tblHeader/>
+          <w:cnfStyle w:firstRow="1"/>
+        </w:trPr>
+        <w:tc>
+          <w:tcPr>
+            <w:tcW w:w="5040" w:type="dxa"/>
+            <w:tcBorders>
+              <w:bottom w:val="single"/>
+            </w:tcBorders>
+            <w:vAlign w:val="bottom"/>
+          </w:tcPr>
+          <w:p>
+            <w:pPr>
+              <w:pStyle w:val="Compact"/>
+              <w:jc w:val="left"/>
+            </w:pPr>
+            <w:r>
+              <w:t xml:space="preserve">Staged file</w:t>
+            </w:r>
+          </w:p>
+        </w:tc>
+        <w:tc>
+          <w:tcPr>
+            <w:tcW w:w="5040" w:type="dxa"/>
+            <w:tcBorders>
+              <w:bottom w:val="single"/>
+            </w:tcBorders>
+            <w:vAlign w:val="bottom"/>
+          </w:tcPr>
+          <w:p>
+            <w:pPr>
+              <w:pStyle w:val="Compact"/>
+              <w:jc w:val="left"/>
+            </w:pPr>
+            <w:r>
+              <w:t xml:space="preserve">Path on the server</w:t>
+            </w:r>
+          </w:p>
+        </w:tc>
+      </w:tr>
+      <w:tr>
+        <w:tc>
+          <w:tcPr>
+            <w:tcW w:w="5040" w:type="dxa"/>
+          </w:tcPr>
+          <w:p>
+            <w:pPr>
+              <w:pStyle w:val="Compact"/>
+              <w:jc w:val="left"/>
+            </w:pPr>
+            <w:r>
+              <w:t xml:space="preserve">install-tnms-wizard.sh</w:t>
+            </w:r>
+          </w:p>
+        </w:tc>
+        <w:tc>
+          <w:tcPr>
+            <w:tcW w:w="5040" w:type="dxa"/>
+          </w:tcPr>
+          <w:p>
+            <w:pPr>
+              <w:pStyle w:val="Compact"/>
+              <w:jc w:val="left"/>
+            </w:pPr>
+            <w:r>
+              <w:t xml:space="preserve">/tmp/install-tnms-wizard.sh</w:t>
+            </w:r>
+          </w:p>
+        </w:tc>
+      </w:tr>
+      <w:tr>
+        <w:tc>
+          <w:tcPr>
+            <w:tcW w:w="5040" w:type="dxa"/>
+          </w:tcPr>
+          <w:p>
+            <w:pPr>
+              <w:pStyle w:val="Compact"/>
+              <w:jc w:val="left"/>
+            </w:pPr>
+            <w:r>
+              <w:t xml:space="preserve">tnms-install.properties.in</w:t>
+            </w:r>
+          </w:p>
+        </w:tc>
+        <w:tc>
+          <w:tcPr>
+            <w:tcW w:w="5040" w:type="dxa"/>
+          </w:tcPr>
+          <w:p>
+            <w:pPr>
+              <w:pStyle w:val="Compact"/>
+              <w:jc w:val="left"/>
+            </w:pPr>
+            <w:r>
+              <w:t xml:space="preserve">/tmp/tnms-install.properties.in</w:t>
+            </w:r>
+          </w:p>
+        </w:tc>
+      </w:tr>
+      <w:tr>
+        <w:tc>
+          <w:tcPr>
+            <w:tcW w:w="5040" w:type="dxa"/>
+          </w:tcPr>
+          <w:p>
+            <w:pPr>
+              <w:pStyle w:val="Compact"/>
+              <w:jc w:val="left"/>
+            </w:pPr>
+            <w:r>
+              <w:t xml:space="preserve">LINUX.X64_193000_db_home_and_patches.zip</w:t>
+            </w:r>
+          </w:p>
+        </w:tc>
+        <w:tc>
+          <w:tcPr>
+            <w:tcW w:w="5040" w:type="dxa"/>
+          </w:tcPr>
+          <w:p>
+            <w:pPr>
+              <w:pStyle w:val="Compact"/>
+              <w:jc w:val="left"/>
+            </w:pPr>
+            <w:r>
+              <w:t xml:space="preserve">/tmp/LINUX.X64_193000_db_home_and_patches.zip</w:t>
+            </w:r>
+          </w:p>
+        </w:tc>
+      </w:tr>
+      <w:tr>
+        <w:tc>
+          <w:tcPr>
+            <w:tcW w:w="5040" w:type="dxa"/>
+          </w:tcPr>
+          <w:p>
+            <w:pPr>
+              <w:pStyle w:val="Compact"/>
+              <w:jc w:val="left"/>
+            </w:pPr>
+            <w:r>
+              <w:t xml:space="preserve">TNMS_LUX_R9.1.0.593.0_1904_Prerequisites.zip</w:t>
+            </w:r>
+          </w:p>
+        </w:tc>
+        <w:tc>
+          <w:tcPr>
+            <w:tcW w:w="5040" w:type="dxa"/>
+          </w:tcPr>
+          <w:p>
+            <w:pPr>
+              <w:pStyle w:val="Compact"/>
+              <w:jc w:val="left"/>
+            </w:pPr>
+            <w:r>
+              <w:t xml:space="preserve">/tmp/TNMS_LUX_R9.1.0.593.0_1904_Prerequisites.zip</w:t>
+            </w:r>
+          </w:p>
+        </w:tc>
+      </w:tr>
+      <w:tr>
+        <w:tc>
+          <w:tcPr>
+            <w:tcW w:w="5040" w:type="dxa"/>
+          </w:tcPr>
+          <w:p>
+            <w:pPr>
+              <w:pStyle w:val="Compact"/>
+              <w:jc w:val="left"/>
+            </w:pPr>
+            <w:r>
+              <w:t xml:space="preserve">TNMS_LUX_R9.1.0.593.0_1904.zip</w:t>
+            </w:r>
+          </w:p>
+        </w:tc>
+        <w:tc>
+          <w:tcPr>
+            <w:tcW w:w="5040" w:type="dxa"/>
+          </w:tcPr>
+          <w:p>
+            <w:pPr>
+              <w:pStyle w:val="Compact"/>
+              <w:jc w:val="left"/>
+            </w:pPr>
+            <w:r>
+              <w:t xml:space="preserve">/tmp/TNMS_LUX_R9.1.0.593.0_1904.zip</w:t>
+            </w:r>
+          </w:p>
+        </w:tc>
+      </w:tr>
+    </w:tbl>
+    <w:p>
+      <w:pPr>
+        <w:pStyle w:val="BodyText"/>
+      </w:pPr>
+      <w:r>
+        <w:t xml:space="preserve">From the workstation directory that contains the five files:</w:t>
+      </w:r>
+    </w:p>
+    <w:p>
+      <w:pPr>
+        <w:pStyle w:val="SourceCode"/>
+        <w:spacing w:before="120" w:after="120" w:line="276" w:lineRule="auto"/>
+      </w:pPr>
+      <w:r>
+        <w:rPr>
+          <w:rStyle w:val="FunctionTok"/>
+        </w:rPr>
+        <w:t xml:space="preserve">scp</w:t>
+      </w:r>
+      <w:r>
+        <w:rPr>
+          <w:rStyle w:val="NormalTok"/>
+        </w:rPr>
+        <w:t xml:space="preserve"> install-tnms-wizard.sh tnms-install.properties.in \</w:t>
+      </w:r>
+      <w:r>
+        <w:br w:type="textWrapping"/>
+      </w:r>
+      <w:r>
+        <w:rPr>
+          <w:rStyle w:val="NormalTok"/>
+        </w:rPr>
+        <w:t xml:space="preserve">  LINUX.X64_193000_db_home_and_patches.zip \</w:t>
+      </w:r>
+      <w:r>
+        <w:br w:type="textWrapping"/>
+      </w:r>
+      <w:r>
+        <w:rPr>
+          <w:rStyle w:val="NormalTok"/>
+        </w:rPr>
+        <w:t xml:space="preserve">  TNMS_LUX_R9.1.0.593.0_1904_Prerequisites.zip \</w:t>
+      </w:r>
+      <w:r>
+        <w:br w:type="textWrapping"/>
+      </w:r>
+      <w:r>
+        <w:rPr>
+          <w:rStyle w:val="NormalTok"/>
+        </w:rPr>
+        <w:t xml:space="preserve">  TNMS_LUX_R9.1.0.593.0_1904.zip \</w:t>
+      </w:r>
+      <w:r>
+        <w:br w:type="textWrapping"/>
+      </w:r>
+      <w:r>
+        <w:rPr>
+          <w:rStyle w:val="NormalTok"/>
+        </w:rPr>
+        <w:t xml:space="preserve">  </w:t>
+      </w:r>
+      <w:r>
+        <w:rPr>
+          <w:rStyle w:val="OperatorTok"/>
+        </w:rPr>
+        <w:t xml:space="preserve">&lt;</w:t>
+      </w:r>
+      <w:r>
+        <w:rPr>
+          <w:rStyle w:val="NormalTok"/>
+        </w:rPr>
+        <w:t xml:space="preserve">user</w:t>
+      </w:r>
+      <w:r>
+        <w:rPr>
+          <w:rStyle w:val="OperatorTok"/>
+        </w:rPr>
+        <w:t xml:space="preserve">&gt;</w:t>
+      </w:r>
+      <w:r>
+        <w:rPr>
+          <w:rStyle w:val="NormalTok"/>
+        </w:rPr>
+        <w:t xml:space="preserve">@</w:t>
+      </w:r>
+      <w:r>
+        <w:rPr>
+          <w:rStyle w:val="OperatorTok"/>
+        </w:rPr>
+        <w:t xml:space="preserve">&lt;</w:t>
+      </w:r>
+      <w:r>
+        <w:rPr>
+          <w:rStyle w:val="NormalTok"/>
+        </w:rPr>
+        <w:t xml:space="preserve">server-ip</w:t>
+      </w:r>
+      <w:r>
+        <w:rPr>
+          <w:rStyle w:val="OperatorTok"/>
+        </w:rPr>
+        <w:t xml:space="preserve">&gt;</w:t>
+      </w:r>
+      <w:r>
+        <w:rPr>
+          <w:rStyle w:val="NormalTok"/>
+        </w:rPr>
+        <w:t xml:space="preserve">:/tmp/</w:t>
+      </w:r>
+    </w:p>
+    <w:p>
+      <w:pPr>
+        <w:pStyle w:val="FirstParagraph"/>
+      </w:pPr>
+      <w:r>
+        <w:rPr>
+          <w:rStyle w:val="VerbatimChar"/>
+        </w:rPr>
+        <w:t xml:space="preserve">&lt;user&gt;</w:t>
+      </w:r>
+      <w:r>
+        <w:t xml:space="preserve"> </w:t>
+      </w:r>
+      <w:r>
+        <w:t xml:space="preserve">is the SSH account.</w:t>
+      </w:r>
+      <w:r>
+        <w:t xml:space="preserve"> </w:t>
+      </w:r>
+      <w:r>
+        <w:rPr>
+          <w:rStyle w:val="VerbatimChar"/>
+        </w:rPr>
+        <w:t xml:space="preserve">&lt;server-ip&gt;</w:t>
+      </w:r>
+      <w:r>
+        <w:t xml:space="preserve"> </w:t>
+      </w:r>
+      <w:r>
+        <w:t xml:space="preserve">is the server address. The command finishes when all five files have been copied.</w:t>
+      </w:r>
+      <w:r>
+        <w:t xml:space="preserve"> </w:t>
+      </w:r>
+      <w:r>
+        <w:rPr>
+          <w:rStyle w:val="VerbatimChar"/>
+        </w:rPr>
+        <w:t xml:space="preserve">Permission denied</w:t>
+      </w:r>
+      <w:r>
+        <w:t xml:space="preserve"> </w:t>
+      </w:r>
+      <w:r>
+        <w:t xml:space="preserve">or</w:t>
+      </w:r>
+      <w:r>
+        <w:t xml:space="preserve"> </w:t>
+      </w:r>
+      <w:r>
+        <w:rPr>
+          <w:rStyle w:val="VerbatimChar"/>
+        </w:rPr>
+        <w:t xml:space="preserve">No such file</w:t>
+      </w:r>
+      <w:r>
+        <w:t xml:space="preserve"> </w:t>
+      </w:r>
+      <w:r>
+        <w:t xml:space="preserve">means stop and fix the path before continuing.</w:t>
+      </w:r>
+    </w:p>
+    <w:p>
+      <w:pPr>
+        <w:pStyle w:val="BodyText"/>
+      </w:pPr>
+      <w:r>
+        <w:rPr>
+          <w:b/>
+        </w:rPr>
+        <w:t xml:space="preserve">Confirm by running:</w:t>
+      </w:r>
+    </w:p>
+    <w:p>
+      <w:pPr>
+        <w:pStyle w:val="SourceCode"/>
+        <w:spacing w:before="120" w:after="120" w:line="276" w:lineRule="auto"/>
+      </w:pPr>
+      <w:r>
+        <w:rPr>
+          <w:rStyle w:val="FunctionTok"/>
+        </w:rPr>
+        <w:t xml:space="preserve">ls</w:t>
+      </w:r>
+      <w:r>
+        <w:rPr>
+          <w:rStyle w:val="NormalTok"/>
+        </w:rPr>
+        <w:t xml:space="preserve"> -1 /tmp/install-tnms-wizard.sh \</w:t>
+      </w:r>
+      <w:r>
+        <w:br w:type="textWrapping"/>
+      </w:r>
+      <w:r>
+        <w:rPr>
+          <w:rStyle w:val="NormalTok"/>
+        </w:rPr>
+        <w:t xml:space="preserve">  /tmp/tnms-install.properties.in \</w:t>
+      </w:r>
+      <w:r>
+        <w:br w:type="textWrapping"/>
+      </w:r>
+      <w:r>
+        <w:rPr>
+          <w:rStyle w:val="NormalTok"/>
+        </w:rPr>
+        <w:t xml:space="preserve">  /tmp/LINUX.X64_193000_db_home_and_patches.zip \</w:t>
+      </w:r>
+      <w:r>
+        <w:br w:type="textWrapping"/>
+      </w:r>
+      <w:r>
+        <w:rPr>
+          <w:rStyle w:val="NormalTok"/>
+        </w:rPr>
+        <w:t xml:space="preserve">  /tmp/TNMS_LUX_R9.1.0.593.0_1904_Prerequisites.zip \</w:t>
+      </w:r>
+      <w:r>
+        <w:br w:type="textWrapping"/>
+      </w:r>
+      <w:r>
+        <w:rPr>
+          <w:rStyle w:val="NormalTok"/>
+        </w:rPr>
+        <w:t xml:space="preserve">  /tmp/TNMS_LUX_R9.1.0.593.0_1904.zip</w:t>
+      </w:r>
+    </w:p>
+    <w:p>
+      <w:pPr>
+        <w:pStyle w:val="FirstParagraph"/>
+      </w:pPr>
+      <w:r>
+        <w:rPr>
+          <w:b/>
+        </w:rPr>
+        <w:t xml:space="preserve">Expected output:</w:t>
+      </w:r>
+    </w:p>
+    <w:p>
+      <w:pPr>
+        <w:pStyle w:val="SourceCode"/>
+        <w:spacing w:before="120" w:after="120" w:line="276" w:lineRule="auto"/>
+      </w:pPr>
+      <w:r>
+        <w:rPr>
+          <w:rStyle w:val="VerbatimChar"/>
+        </w:rPr>
+        <w:t xml:space="preserve">/tmp/install-tnms-wizard.sh</w:t>
+      </w:r>
+      <w:r>
+        <w:br w:type="textWrapping"/>
+      </w:r>
+      <w:r>
+        <w:rPr>
+          <w:rStyle w:val="VerbatimChar"/>
+        </w:rPr>
+        <w:t xml:space="preserve">/tmp/tnms-install.properties.in</w:t>
+      </w:r>
+      <w:r>
+        <w:br w:type="textWrapping"/>
+      </w:r>
+      <w:r>
+        <w:rPr>
+          <w:rStyle w:val="VerbatimChar"/>
+        </w:rPr>
+        <w:t xml:space="preserve">/tmp/LINUX.X64_193000_db_home_and_patches.zip</w:t>
+      </w:r>
+      <w:r>
+        <w:br w:type="textWrapping"/>
+      </w:r>
+      <w:r>
+        <w:rPr>
+          <w:rStyle w:val="VerbatimChar"/>
+        </w:rPr>
+        <w:t xml:space="preserve">/tmp/TNMS_LUX_R9.1.0.593.0_1904_Prerequisites.zip</w:t>
+      </w:r>
+      <w:r>
+        <w:br w:type="textWrapping"/>
+      </w:r>
+      <w:r>
+        <w:rPr>
+          <w:rStyle w:val="VerbatimChar"/>
+        </w:rPr>
+        <w:t xml:space="preserve">/tmp/TNMS_LUX_R9.1.0.593.0_1904.zip</w:t>
+      </w:r>
+    </w:p>
+    <w:p>
+      <w:pPr>
+        <w:pStyle w:val="FirstParagraph"/>
+      </w:pPr>
+      <w:r>
+        <w:t xml:space="preserve">Leave</w:t>
+      </w:r>
+      <w:r>
+        <w:t xml:space="preserve"> </w:t>
+      </w:r>
+      <w:r>
+        <w:rPr>
+          <w:rStyle w:val="VerbatimChar"/>
+        </w:rPr>
+        <w:t xml:space="preserve">tnms-install.properties.in</w:t>
+      </w:r>
+      <w:r>
+        <w:t xml:space="preserve"> </w:t>
+      </w:r>
+      <w:r>
+        <w:t xml:space="preserve">unchanged. Section 1 does not use these files. After step 4,</w:t>
+      </w:r>
+      <w:r>
+        <w:t xml:space="preserve"> </w:t>
+      </w:r>
+      <w:r>
+        <w:rPr>
+          <w:b/>
+        </w:rPr>
+        <w:t xml:space="preserve">Copy the install files</w:t>
+      </w:r>
+      <w:r>
+        <w:t xml:space="preserve"> </w:t>
+      </w:r>
+      <w:r>
+        <w:t xml:space="preserve">moves them from</w:t>
+      </w:r>
+      <w:r>
+        <w:t xml:space="preserve"> </w:t>
+      </w:r>
+      <w:r>
+        <w:rPr>
+          <w:rStyle w:val="VerbatimChar"/>
+        </w:rPr>
+        <w:t xml:space="preserve">/tmp</w:t>
+      </w:r>
+      <w:r>
+        <w:t xml:space="preserve"> </w:t>
+      </w:r>
+      <w:r>
+        <w:t xml:space="preserve">to</w:t>
       </w:r>
       <w:r>
         <w:t xml:space="preserve"> </w:t>
@@ -66,38 +813,43 @@
         <w:t xml:space="preserve">/opt/tnms-install</w:t>
       </w:r>
       <w:r>
-        <w:t xml:space="preserve">.</w:t>
-      </w:r>
-    </w:p>
-    <w:p>
-      <w:pPr>
-        <w:pStyle w:val="BodyText"/>
-      </w:pPr>
-      <w:r>
-        <w:t xml:space="preserve">One machine. Small Plus. TNMS Server and Mediation together. New database.</w:t>
-      </w:r>
-    </w:p>
-    <w:p>
-      <w:pPr>
-        <w:pStyle w:val="BodyText"/>
-      </w:pPr>
-      <w:r>
-        <w:t xml:space="preserve">The TNMS client login follows the wizard-file section. The database and SFTP passwords are in the table after that. Write the database passwords into</w:t>
-      </w:r>
-      <w:r>
-        <w:t xml:space="preserve"> </w:t>
-      </w:r>
-      <w:r>
-        <w:rPr>
-          <w:rStyle w:val="VerbatimChar"/>
-        </w:rPr>
-        <w:t xml:space="preserve">/root/tnms-db-credentials</w:t>
-      </w:r>
-      <w:r>
-        <w:t xml:space="preserve"> </w:t>
-      </w:r>
-      <w:r>
-        <w:t xml:space="preserve">(mode 600). A step headed</w:t>
+        <w:t xml:space="preserve"> </w:t>
+      </w:r>
+      <w:r>
+        <w:t xml:space="preserve">as root.</w:t>
+      </w:r>
+    </w:p>
+    <w:p>
+      <w:pPr>
+        <w:pStyle w:val="Heading2"/>
+      </w:pPr>
+      <w:bookmarkStart w:id="24" w:name="where-the-install-files-go"/>
+      <w:r>
+        <w:t xml:space="preserve">Where the install files go</w:t>
+      </w:r>
+      <w:bookmarkEnd w:id="24"/>
+    </w:p>
+    <w:p>
+      <w:pPr>
+        <w:pStyle w:val="BlockText"/>
+      </w:pPr>
+      <w:r>
+        <w:t xml:space="preserve">The five files are in</w:t>
+      </w:r>
+      <w:r>
+        <w:t xml:space="preserve"> </w:t>
+      </w:r>
+      <w:r>
+        <w:rPr>
+          <w:rStyle w:val="VerbatimChar"/>
+        </w:rPr>
+        <w:t xml:space="preserve">/tmp</w:t>
+      </w:r>
+      <w:r>
+        <w:t xml:space="preserve"> </w:t>
+      </w:r>
+      <w:r>
+        <w:t xml:space="preserve">from</w:t>
       </w:r>
       <w:r>
         <w:t xml:space="preserve"> </w:t>
@@ -106,123 +858,10 @@
         <w:rPr>
           <w:b/>
         </w:rPr>
-        <w:t xml:space="preserve">This host</w:t>
-      </w:r>
-      <w:r>
-        <w:t xml:space="preserve"> </w:t>
-      </w:r>
-      <w:r>
-        <w:t xml:space="preserve">applies when the fresh server matches the condition in that step.</w:t>
-      </w:r>
-    </w:p>
-    <w:p>
-      <w:pPr>
-        <w:pStyle w:val="BodyText"/>
-      </w:pPr>
-      <w:r>
-        <w:t xml:space="preserve">A line that says</w:t>
-      </w:r>
-      <w:r>
-        <w:t xml:space="preserve"> </w:t>
-      </w:r>
-      <w:r>
-        <w:rPr>
-          <w:b/>
-        </w:rPr>
-        <w:t xml:space="preserve">Confirm by running</w:t>
-      </w:r>
-      <w:r>
-        <w:t xml:space="preserve"> </w:t>
-      </w:r>
-      <w:r>
-        <w:t xml:space="preserve">is a separate command. Run that command. The next</w:t>
-      </w:r>
-      <w:r>
-        <w:t xml:space="preserve"> </w:t>
-      </w:r>
-      <w:r>
-        <w:rPr>
-          <w:b/>
-        </w:rPr>
-        <w:t xml:space="preserve">Expected output</w:t>
-      </w:r>
-      <w:r>
-        <w:t xml:space="preserve"> </w:t>
-      </w:r>
-      <w:r>
-        <w:t xml:space="preserve">block is what that command should print. Compare the two. A work command that prints nothing is finished when the shell prompt returns. Names and addresses below are this host. Sizes move with the disk. Replace</w:t>
-      </w:r>
-      <w:r>
-        <w:t xml:space="preserve"> </w:t>
-      </w:r>
-      <w:r>
-        <w:rPr>
-          <w:rStyle w:val="VerbatimChar"/>
-        </w:rPr>
-        <w:t xml:space="preserve">TNMS</w:t>
-      </w:r>
-      <w:r>
-        <w:t xml:space="preserve"> </w:t>
-      </w:r>
-      <w:r>
-        <w:t xml:space="preserve">and</w:t>
-      </w:r>
-      <w:r>
-        <w:t xml:space="preserve"> </w:t>
-      </w:r>
-      <w:r>
-        <w:rPr>
-          <w:rStyle w:val="VerbatimChar"/>
-        </w:rPr>
-        <w:t xml:space="preserve">172.16.0.4</w:t>
-      </w:r>
-      <w:r>
-        <w:t xml:space="preserve"> </w:t>
-      </w:r>
-      <w:r>
-        <w:t xml:space="preserve">with the site values.</w:t>
-      </w:r>
-    </w:p>
-    <w:p>
-      <w:pPr>
-        <w:pStyle w:val="Heading2"/>
-      </w:pPr>
-      <w:bookmarkStart w:id="23" w:name="where-the-install-files-go"/>
-      <w:r>
-        <w:t xml:space="preserve">Where the install files go</w:t>
-      </w:r>
-      <w:bookmarkEnd w:id="23"/>
-    </w:p>
-    <w:p>
-      <w:pPr>
-        <w:pStyle w:val="BlockText"/>
-      </w:pPr>
-      <w:r>
-        <w:t xml:space="preserve">Get</w:t>
-      </w:r>
-      <w:r>
-        <w:t xml:space="preserve"> </w:t>
-      </w:r>
-      <w:r>
-        <w:rPr>
-          <w:rStyle w:val="VerbatimChar"/>
-        </w:rPr>
-        <w:t xml:space="preserve">install-tnms-wizard.sh</w:t>
-      </w:r>
-      <w:r>
-        <w:t xml:space="preserve">,</w:t>
-      </w:r>
-      <w:r>
-        <w:t xml:space="preserve"> </w:t>
-      </w:r>
-      <w:r>
-        <w:rPr>
-          <w:rStyle w:val="VerbatimChar"/>
-        </w:rPr>
-        <w:t xml:space="preserve">tnms-install.properties.in</w:t>
-      </w:r>
-      <w:r>
-        <w:t xml:space="preserve">, and the three vendor zip files with this guide. Put them in</w:t>
+        <w:t xml:space="preserve">Before you start</w:t>
+      </w:r>
+      <w:r>
+        <w:t xml:space="preserve">. After step 4 they move to the paths in this table. The script reads the properties file from</w:t>
       </w:r>
       <w:r>
         <w:t xml:space="preserve"> </w:t>
@@ -234,10 +873,7 @@
         <w:t xml:space="preserve">/opt/tnms-install</w:t>
       </w:r>
       <w:r>
-        <w:t xml:space="preserve"> </w:t>
-      </w:r>
-      <w:r>
-        <w:t xml:space="preserve">after the pre-install checks pass. The script reads the properties file from that same directory. One file without the other stops the script.</w:t>
+        <w:t xml:space="preserve">. One file without the other stops the script.</w:t>
       </w:r>
     </w:p>
     <w:p>
@@ -450,7 +1086,22 @@
         <w:t xml:space="preserve"> </w:t>
       </w:r>
       <w:r>
-        <w:t xml:space="preserve">are directories on that volume. Copy the files after</w:t>
+        <w:t xml:space="preserve">are directories on that volume. Move the five files from</w:t>
+      </w:r>
+      <w:r>
+        <w:t xml:space="preserve"> </w:t>
+      </w:r>
+      <w:r>
+        <w:rPr>
+          <w:rStyle w:val="VerbatimChar"/>
+        </w:rPr>
+        <w:t xml:space="preserve">/tmp</w:t>
+      </w:r>
+      <w:r>
+        <w:t xml:space="preserve"> </w:t>
+      </w:r>
+      <w:r>
+        <w:t xml:space="preserve">after</w:t>
       </w:r>
       <w:r>
         <w:t xml:space="preserve"> </w:t>
@@ -557,7 +1208,7 @@
         <w:t xml:space="preserve"> </w:t>
       </w:r>
       <w:r>
-        <w:t xml:space="preserve">directory. The copy commands are in</w:t>
+        <w:t xml:space="preserve">directory.</w:t>
       </w:r>
       <w:r>
         <w:t xml:space="preserve"> </w:t>
@@ -569,18 +1220,33 @@
         <w:t xml:space="preserve">Copy the install files</w:t>
       </w:r>
       <w:r>
-        <w:t xml:space="preserve">, after step 4. Run the script in step 9.</w:t>
+        <w:t xml:space="preserve">, after step 4, moves the five files from</w:t>
+      </w:r>
+      <w:r>
+        <w:t xml:space="preserve"> </w:t>
+      </w:r>
+      <w:r>
+        <w:rPr>
+          <w:rStyle w:val="VerbatimChar"/>
+        </w:rPr>
+        <w:t xml:space="preserve">/tmp</w:t>
+      </w:r>
+      <w:r>
+        <w:t xml:space="preserve"> </w:t>
+      </w:r>
+      <w:r>
+        <w:t xml:space="preserve">onto the paths above. Run the script in step 9.</w:t>
       </w:r>
     </w:p>
     <w:p>
       <w:pPr>
         <w:pStyle w:val="Heading2"/>
       </w:pPr>
-      <w:bookmarkStart w:id="24" w:name="tnms-client-login"/>
+      <w:bookmarkStart w:id="25" w:name="tnms-client-login"/>
       <w:r>
         <w:t xml:space="preserve">TNMS client login</w:t>
       </w:r>
-      <w:bookmarkEnd w:id="24"/>
+      <w:bookmarkEnd w:id="25"/>
     </w:p>
     <w:p>
       <w:pPr>
@@ -841,11 +1507,11 @@
       <w:pPr>
         <w:pStyle w:val="Heading2"/>
       </w:pPr>
-      <w:bookmarkStart w:id="25" w:name="values-used-on-this-host"/>
+      <w:bookmarkStart w:id="26" w:name="values-used-on-this-host"/>
       <w:r>
         <w:t xml:space="preserve">Values used on this host</w:t>
       </w:r>
-      <w:bookmarkEnd w:id="25"/>
+      <w:bookmarkEnd w:id="26"/>
     </w:p>
     <w:p>
       <w:pPr>
@@ -1853,18 +2519,63 @@
       <w:pPr>
         <w:pStyle w:val="Heading2"/>
       </w:pPr>
-      <w:bookmarkStart w:id="26" w:name="media-to-copy-onto-the-server"/>
+      <w:bookmarkStart w:id="27" w:name="media-to-copy-onto-the-server"/>
       <w:r>
         <w:t xml:space="preserve">Media to copy onto the server</w:t>
       </w:r>
-      <w:bookmarkEnd w:id="26"/>
+      <w:bookmarkEnd w:id="27"/>
     </w:p>
     <w:p>
       <w:pPr>
         <w:pStyle w:val="FirstParagraph"/>
       </w:pPr>
       <w:r>
-        <w:t xml:space="preserve">These three zip files are the Oracle and TNMS media. Copy them into</w:t>
+        <w:t xml:space="preserve">These three zip files are the Oracle and TNMS media.</w:t>
+      </w:r>
+      <w:r>
+        <w:t xml:space="preserve"> </w:t>
+      </w:r>
+      <w:r>
+        <w:rPr>
+          <w:b/>
+        </w:rPr>
+        <w:t xml:space="preserve">Before you start</w:t>
+      </w:r>
+      <w:r>
+        <w:t xml:space="preserve"> </w:t>
+      </w:r>
+      <w:r>
+        <w:t xml:space="preserve">copies them to</w:t>
+      </w:r>
+      <w:r>
+        <w:t xml:space="preserve"> </w:t>
+      </w:r>
+      <w:r>
+        <w:rPr>
+          <w:rStyle w:val="VerbatimChar"/>
+        </w:rPr>
+        <w:t xml:space="preserve">/tmp</w:t>
+      </w:r>
+      <w:r>
+        <w:t xml:space="preserve"> </w:t>
+      </w:r>
+      <w:r>
+        <w:t xml:space="preserve">with the wizard files.</w:t>
+      </w:r>
+      <w:r>
+        <w:t xml:space="preserve"> </w:t>
+      </w:r>
+      <w:r>
+        <w:rPr>
+          <w:b/>
+        </w:rPr>
+        <w:t xml:space="preserve">Copy the install files</w:t>
+      </w:r>
+      <w:r>
+        <w:t xml:space="preserve"> </w:t>
+      </w:r>
+      <w:r>
+        <w:t xml:space="preserve">then moves the zip files into</w:t>
       </w:r>
       <w:r>
         <w:t xml:space="preserve"> </w:t>
@@ -1874,21 +2585,6 @@
           <w:rStyle w:val="VerbatimChar"/>
         </w:rPr>
         <w:t xml:space="preserve">/opt/tnms-install/resources</w:t>
-      </w:r>
-      <w:r>
-        <w:t xml:space="preserve"> </w:t>
-      </w:r>
-      <w:r>
-        <w:t xml:space="preserve">with the wizard files, in</w:t>
-      </w:r>
-      <w:r>
-        <w:t xml:space="preserve"> </w:t>
-      </w:r>
-      <w:r>
-        <w:rPr>
-          <w:b/>
-        </w:rPr>
-        <w:t xml:space="preserve">Copy the install files</w:t>
       </w:r>
       <w:r>
         <w:t xml:space="preserve">.</w:t>
@@ -2197,11 +2893,11 @@
       <w:pPr>
         <w:pStyle w:val="Heading2"/>
       </w:pPr>
-      <w:bookmarkStart w:id="27" w:name="hostname-hosts-locale"/>
+      <w:bookmarkStart w:id="28" w:name="hostname-hosts-locale"/>
       <w:r>
         <w:t xml:space="preserve">1. Hostname, hosts, locale</w:t>
       </w:r>
-      <w:bookmarkEnd w:id="27"/>
+      <w:bookmarkEnd w:id="28"/>
     </w:p>
     <w:p>
       <w:pPr>
@@ -2629,11 +3325,11 @@
       <w:pPr>
         <w:pStyle w:val="Heading2"/>
       </w:pPr>
-      <w:bookmarkStart w:id="28" w:name="packages"/>
+      <w:bookmarkStart w:id="29" w:name="packages"/>
       <w:r>
         <w:t xml:space="preserve">2. Packages</w:t>
       </w:r>
-      <w:bookmarkEnd w:id="28"/>
+      <w:bookmarkEnd w:id="29"/>
     </w:p>
     <w:p>
       <w:pPr>
@@ -2919,11 +3615,11 @@
       <w:pPr>
         <w:pStyle w:val="Heading2"/>
       </w:pPr>
-      <w:bookmarkStart w:id="29" w:name="kernel-settings-and-the-firewall"/>
+      <w:bookmarkStart w:id="30" w:name="kernel-settings-and-the-firewall"/>
       <w:r>
         <w:t xml:space="preserve">3. Kernel settings and the firewall</w:t>
       </w:r>
-      <w:bookmarkEnd w:id="29"/>
+      <w:bookmarkEnd w:id="30"/>
     </w:p>
     <w:p>
       <w:pPr>
@@ -3335,11 +4031,11 @@
       <w:pPr>
         <w:pStyle w:val="Heading2"/>
       </w:pPr>
-      <w:bookmarkStart w:id="30" w:name="disk-space-the-installers-actually-check"/>
+      <w:bookmarkStart w:id="31" w:name="disk-space-the-installers-actually-check"/>
       <w:r>
         <w:t xml:space="preserve">4. Disk space the installers actually check</w:t>
       </w:r>
-      <w:bookmarkEnd w:id="30"/>
+      <w:bookmarkEnd w:id="31"/>
     </w:p>
     <w:p>
       <w:pPr>
@@ -4424,11 +5120,11 @@
       <w:pPr>
         <w:pStyle w:val="Heading2"/>
       </w:pPr>
-      <w:bookmarkStart w:id="31" w:name="copy-the-install-files"/>
+      <w:bookmarkStart w:id="32" w:name="copy-the-install-files"/>
       <w:r>
         <w:t xml:space="preserve">Copy the install files</w:t>
       </w:r>
-      <w:bookmarkEnd w:id="31"/>
+      <w:bookmarkEnd w:id="32"/>
     </w:p>
     <w:p>
       <w:pPr>
@@ -4473,7 +5169,7 @@
         <w:pStyle w:val="BodyText"/>
       </w:pPr>
       <w:r>
-        <w:t xml:space="preserve">Copy the two wizard files and the three zip files to</w:t>
+        <w:t xml:space="preserve">The five files should already be in</w:t>
       </w:r>
       <w:r>
         <w:t xml:space="preserve"> </w:t>
@@ -4488,7 +5184,19 @@
         <w:t xml:space="preserve"> </w:t>
       </w:r>
       <w:r>
-        <w:t xml:space="preserve">on the server. Any SSH user can receive that copy.</w:t>
+        <w:t xml:space="preserve">from</w:t>
+      </w:r>
+      <w:r>
+        <w:t xml:space="preserve"> </w:t>
+      </w:r>
+      <w:r>
+        <w:rPr>
+          <w:b/>
+        </w:rPr>
+        <w:t xml:space="preserve">Before you start</w:t>
+      </w:r>
+      <w:r>
+        <w:t xml:space="preserve">. Any SSH user can receive that copy.</w:t>
       </w:r>
       <w:r>
         <w:t xml:space="preserve"> </w:t>
@@ -4503,7 +5211,34 @@
         <w:t xml:space="preserve"> </w:t>
       </w:r>
       <w:r>
-        <w:t xml:space="preserve">is about 1 GB, so a VS Code Remote SSH connection needs the symlink in pre-install section 6 before it can unpack. The five install files still go to</w:t>
+        <w:t xml:space="preserve">is about 1 GB, so a VS Code Remote SSH connection needs the symlink in pre-install section 6 before it can unpack. The five install files stay out of</w:t>
+      </w:r>
+      <w:r>
+        <w:t xml:space="preserve"> </w:t>
+      </w:r>
+      <w:r>
+        <w:rPr>
+          <w:rStyle w:val="VerbatimChar"/>
+        </w:rPr>
+        <w:t xml:space="preserve">/home</w:t>
+      </w:r>
+      <w:r>
+        <w:t xml:space="preserve"> </w:t>
+      </w:r>
+      <w:r>
+        <w:t xml:space="preserve">and are not copied straight into</w:t>
+      </w:r>
+      <w:r>
+        <w:t xml:space="preserve"> </w:t>
+      </w:r>
+      <w:r>
+        <w:rPr>
+          <w:rStyle w:val="VerbatimChar"/>
+        </w:rPr>
+        <w:t xml:space="preserve">/opt/tnms-install</w:t>
+      </w:r>
+      <w:r>
+        <w:t xml:space="preserve">. When a name is missing from</w:t>
       </w:r>
       <w:r>
         <w:t xml:space="preserve"> </w:t>
@@ -4515,34 +5250,7 @@
         <w:t xml:space="preserve">/tmp</w:t>
       </w:r>
       <w:r>
-        <w:t xml:space="preserve">, not into</w:t>
-      </w:r>
-      <w:r>
-        <w:t xml:space="preserve"> </w:t>
-      </w:r>
-      <w:r>
-        <w:rPr>
-          <w:rStyle w:val="VerbatimChar"/>
-        </w:rPr>
-        <w:t xml:space="preserve">/home</w:t>
-      </w:r>
-      <w:r>
-        <w:t xml:space="preserve"> </w:t>
-      </w:r>
-      <w:r>
-        <w:t xml:space="preserve">and not directly into</w:t>
-      </w:r>
-      <w:r>
-        <w:t xml:space="preserve"> </w:t>
-      </w:r>
-      <w:r>
-        <w:rPr>
-          <w:rStyle w:val="VerbatimChar"/>
-        </w:rPr>
-        <w:t xml:space="preserve">/opt/tnms-install</w:t>
-      </w:r>
-      <w:r>
-        <w:t xml:space="preserve">. From the workstation directory that contains the five files:</w:t>
+        <w:t xml:space="preserve">, run this from the workstation directory that contains the five files:</w:t>
       </w:r>
     </w:p>
     <w:p>
@@ -5688,11 +6396,11 @@
       <w:pPr>
         <w:pStyle w:val="Heading2"/>
       </w:pPr>
-      <w:bookmarkStart w:id="32" w:name="unpack-the-media"/>
+      <w:bookmarkStart w:id="33" w:name="unpack-the-media"/>
       <w:r>
         <w:t xml:space="preserve">5. Unpack the media</w:t>
       </w:r>
-      <w:bookmarkEnd w:id="32"/>
+      <w:bookmarkEnd w:id="33"/>
     </w:p>
     <w:p>
       <w:pPr>
@@ -6551,11 +7259,11 @@
       <w:pPr>
         <w:pStyle w:val="Heading2"/>
       </w:pPr>
-      <w:bookmarkStart w:id="33" w:name="database-passwords"/>
+      <w:bookmarkStart w:id="34" w:name="database-passwords"/>
       <w:r>
         <w:t xml:space="preserve">6. Database passwords</w:t>
       </w:r>
-      <w:bookmarkEnd w:id="33"/>
+      <w:bookmarkEnd w:id="34"/>
     </w:p>
     <w:p>
       <w:pPr>
@@ -6881,11 +7589,11 @@
       <w:pPr>
         <w:pStyle w:val="Heading2"/>
       </w:pPr>
-      <w:bookmarkStart w:id="34" w:name="install-oracle-19c"/>
+      <w:bookmarkStart w:id="35" w:name="install-oracle-19c"/>
       <w:r>
         <w:t xml:space="preserve">7. Install Oracle 19c</w:t>
       </w:r>
-      <w:bookmarkEnd w:id="34"/>
+      <w:bookmarkEnd w:id="35"/>
     </w:p>
     <w:p>
       <w:pPr>
@@ -7961,11 +8669,11 @@
       <w:pPr>
         <w:pStyle w:val="Heading2"/>
       </w:pPr>
-      <w:bookmarkStart w:id="35" w:name="memory-check-before-the-tnms-wizard"/>
+      <w:bookmarkStart w:id="36" w:name="memory-check-before-the-tnms-wizard"/>
       <w:r>
         <w:t xml:space="preserve">8. Memory check before the TNMS wizard</w:t>
       </w:r>
-      <w:bookmarkEnd w:id="35"/>
+      <w:bookmarkEnd w:id="36"/>
     </w:p>
     <w:p>
       <w:pPr>
@@ -8039,11 +8747,11 @@
       <w:pPr>
         <w:pStyle w:val="Heading2"/>
       </w:pPr>
-      <w:bookmarkStart w:id="36" w:name="install-tnms-server-and-mediation"/>
+      <w:bookmarkStart w:id="37" w:name="install-tnms-server-and-mediation"/>
       <w:r>
         <w:t xml:space="preserve">9. Install TNMS Server and Mediation</w:t>
       </w:r>
-      <w:bookmarkEnd w:id="36"/>
+      <w:bookmarkEnd w:id="37"/>
     </w:p>
     <w:p>
       <w:pPr>
@@ -9959,11 +10667,11 @@
       <w:pPr>
         <w:pStyle w:val="Heading2"/>
       </w:pPr>
-      <w:bookmarkStart w:id="37" w:name="put-lsmem-back"/>
+      <w:bookmarkStart w:id="38" w:name="put-lsmem-back"/>
       <w:r>
         <w:t xml:space="preserve">10. Put lsmem back</w:t>
       </w:r>
-      <w:bookmarkEnd w:id="37"/>
+      <w:bookmarkEnd w:id="38"/>
     </w:p>
     <w:p>
       <w:pPr>
@@ -10140,11 +10848,11 @@
       <w:pPr>
         <w:pStyle w:val="Heading2"/>
       </w:pPr>
-      <w:bookmarkStart w:id="38" w:name="sftp-account"/>
+      <w:bookmarkStart w:id="39" w:name="sftp-account"/>
       <w:r>
         <w:t xml:space="preserve">11. SFTP account</w:t>
       </w:r>
-      <w:bookmarkEnd w:id="38"/>
+      <w:bookmarkEnd w:id="39"/>
     </w:p>
     <w:p>
       <w:pPr>
@@ -11395,11 +12103,11 @@
       <w:pPr>
         <w:pStyle w:val="Heading2"/>
       </w:pPr>
-      <w:bookmarkStart w:id="39" w:name="sudo-for-the-tnms-user"/>
+      <w:bookmarkStart w:id="40" w:name="sudo-for-the-tnms-user"/>
       <w:r>
         <w:t xml:space="preserve">12. sudo for the tnms user</w:t>
       </w:r>
-      <w:bookmarkEnd w:id="39"/>
+      <w:bookmarkEnd w:id="40"/>
     </w:p>
     <w:p>
       <w:pPr>
@@ -11657,11 +12365,11 @@
       <w:pPr>
         <w:pStyle w:val="Heading2"/>
       </w:pPr>
-      <w:bookmarkStart w:id="40" w:name="start-the-service"/>
+      <w:bookmarkStart w:id="41" w:name="start-the-service"/>
       <w:r>
         <w:t xml:space="preserve">13. Start the service</w:t>
       </w:r>
-      <w:bookmarkEnd w:id="40"/>
+      <w:bookmarkEnd w:id="41"/>
     </w:p>
     <w:p>
       <w:pPr>
@@ -12423,11 +13131,11 @@
       <w:pPr>
         <w:pStyle w:val="Heading2"/>
       </w:pPr>
-      <w:bookmarkStart w:id="41" w:name="checks"/>
+      <w:bookmarkStart w:id="42" w:name="checks"/>
       <w:r>
         <w:t xml:space="preserve">14. Checks</w:t>
       </w:r>
-      <w:bookmarkEnd w:id="41"/>
+      <w:bookmarkEnd w:id="42"/>
     </w:p>
     <w:p>
       <w:pPr>
@@ -13028,11 +13736,11 @@
       <w:pPr>
         <w:pStyle w:val="Heading2"/>
       </w:pPr>
-      <w:bookmarkStart w:id="42" w:name="what-happened-on-this-host"/>
+      <w:bookmarkStart w:id="43" w:name="what-happened-on-this-host"/>
       <w:r>
         <w:t xml:space="preserve">What happened on this host</w:t>
       </w:r>
-      <w:bookmarkEnd w:id="42"/>
+      <w:bookmarkEnd w:id="43"/>
     </w:p>
     <w:p>
       <w:pPr>
@@ -13103,11 +13811,11 @@
       <w:pPr>
         <w:pStyle w:val="Heading2"/>
       </w:pPr>
-      <w:bookmarkStart w:id="43" w:name="manual-step-9-two-ssh-sessions"/>
+      <w:bookmarkStart w:id="44" w:name="manual-step-9-two-ssh-sessions"/>
       <w:r>
         <w:t xml:space="preserve">Manual step 9: two SSH sessions</w:t>
       </w:r>
-      <w:bookmarkEnd w:id="43"/>
+      <w:bookmarkEnd w:id="44"/>
     </w:p>
     <w:p>
       <w:pPr>
@@ -16044,7 +16752,7 @@
     </w:lvl>
   </w:abstractNum>
   <w:abstractNum w:abstractNumId="990">
-    <w:nsid w:val="16b8c833"/>
+    <w:nsid w:val="daac9523"/>
     <w:multiLevelType w:val="multilevel"/>
     <w:lvl w:ilvl="0">
       <w:numFmt w:val="bullet"/>
@@ -16147,7 +16855,7 @@
     </w:lvl>
   </w:abstractNum>
   <w:abstractNum w:abstractNumId="991">
-    <w:nsid w:val="8216a3b7"/>
+    <w:nsid w:val="560a70a7"/>
     <w:multiLevelType w:val="multilevel"/>
     <w:lvl w:ilvl="0">
       <w:numFmt w:val="bullet"/>
@@ -16250,7 +16958,7 @@
     </w:lvl>
   </w:abstractNum>
   <w:abstractNum w:abstractNumId="99411">
-    <w:nsid w:val="4709abd4"/>
+    <w:nsid w:val="9afd786f"/>
     <w:multiLevelType w:val="multilevel"/>
     <w:lvl w:ilvl="0">
       <w:start w:val="1"/>
@@ -16362,7 +17070,7 @@
     </w:lvl>
   </w:abstractNum>
   <w:abstractNum w:abstractNumId="99412">
-    <w:nsid w:val="8ec5a32d"/>
+    <w:nsid w:val="e2b96fc7"/>
     <w:multiLevelType w:val="multilevel"/>
     <w:lvl w:ilvl="0">
       <w:start w:val="2"/>
@@ -16474,7 +17182,7 @@
     </w:lvl>
   </w:abstractNum>
   <w:abstractNum w:abstractNumId="99413">
-    <w:nsid w:val="8312dcc0"/>
+    <w:nsid w:val="57068c76"/>
     <w:multiLevelType w:val="multilevel"/>
     <w:lvl w:ilvl="0">
       <w:start w:val="3"/>

</xml_diff>

<commit_message>
Create the /opt directories before placing the install files.
The new section makes the product directories and sets mode 755 on the Oracle and TNMS paths and mode 750 on /opt/tnms-install for the SSH login.
</commit_message>
<xml_diff>
--- a/docs/customer/TNMS-9.1-RHEL8-install-without-repo.docx
+++ b/docs/customer/TNMS-9.1-RHEL8-install-without-repo.docx
@@ -637,7 +637,19 @@
         <w:t xml:space="preserve"> </w:t>
       </w:r>
       <w:r>
-        <w:t xml:space="preserve">unchanged. Section 1 does not use these files.</w:t>
+        <w:t xml:space="preserve">unchanged. Section 1 does not use these files. The next section creates the directories on</w:t>
+      </w:r>
+      <w:r>
+        <w:t xml:space="preserve"> </w:t>
+      </w:r>
+      <w:r>
+        <w:rPr>
+          <w:rStyle w:val="VerbatimChar"/>
+        </w:rPr>
+        <w:t xml:space="preserve">/opt</w:t>
+      </w:r>
+      <w:r>
+        <w:t xml:space="preserve">.</w:t>
       </w:r>
       <w:r>
         <w:t xml:space="preserve"> </w:t>
@@ -652,7 +664,1237 @@
         <w:t xml:space="preserve"> </w:t>
       </w:r>
       <w:r>
-        <w:t xml:space="preserve">moves them from</w:t>
+        <w:t xml:space="preserve">then moves the five files into those directories and sets the file modes.</w:t>
+      </w:r>
+    </w:p>
+    <w:p>
+      <w:pPr>
+        <w:pStyle w:val="Heading2"/>
+      </w:pPr>
+      <w:bookmarkStart w:id="24" w:name="create-the-opt-directories"/>
+      <w:r>
+        <w:t xml:space="preserve">Create the /opt directories</w:t>
+      </w:r>
+      <w:bookmarkEnd w:id="24"/>
+    </w:p>
+    <w:p>
+      <w:pPr>
+        <w:pStyle w:val="FirstParagraph"/>
+      </w:pPr>
+      <w:r>
+        <w:t xml:space="preserve">Run this as root after</w:t>
+      </w:r>
+      <w:r>
+        <w:t xml:space="preserve"> </w:t>
+      </w:r>
+      <w:hyperlink r:id="rId22">
+        <w:r>
+          <w:rPr>
+            <w:rStyle w:val="Hyperlink"/>
+          </w:rPr>
+          <w:t xml:space="preserve">pre-install.md</w:t>
+        </w:r>
+      </w:hyperlink>
+      <w:r>
+        <w:t xml:space="preserve"> </w:t>
+      </w:r>
+      <w:r>
+        <w:t xml:space="preserve">has mounted the 1 TB disk on</w:t>
+      </w:r>
+      <w:r>
+        <w:t xml:space="preserve"> </w:t>
+      </w:r>
+      <w:r>
+        <w:rPr>
+          <w:rStyle w:val="VerbatimChar"/>
+        </w:rPr>
+        <w:t xml:space="preserve">/opt</w:t>
+      </w:r>
+      <w:r>
+        <w:t xml:space="preserve">. The commands create the product directories and set their modes.</w:t>
+      </w:r>
+      <w:r>
+        <w:t xml:space="preserve"> </w:t>
+      </w:r>
+      <w:r>
+        <w:rPr>
+          <w:rStyle w:val="VerbatimChar"/>
+        </w:rPr>
+        <w:t xml:space="preserve">install -d</w:t>
+      </w:r>
+      <w:r>
+        <w:t xml:space="preserve"> </w:t>
+      </w:r>
+      <w:r>
+        <w:t xml:space="preserve">on a directory that already exists sets the owner, group, and mode again.</w:t>
+      </w:r>
+    </w:p>
+    <w:p>
+      <w:pPr>
+        <w:pStyle w:val="BodyText"/>
+      </w:pPr>
+      <w:r>
+        <w:rPr>
+          <w:b/>
+        </w:rPr>
+        <w:t xml:space="preserve">Confirm by running:</w:t>
+      </w:r>
+    </w:p>
+    <w:p>
+      <w:pPr>
+        <w:pStyle w:val="SourceCode"/>
+        <w:spacing w:before="120" w:after="120" w:line="276" w:lineRule="auto"/>
+      </w:pPr>
+      <w:r>
+        <w:rPr>
+          <w:rStyle w:val="ExtensionTok"/>
+        </w:rPr>
+        <w:t xml:space="preserve">findmnt</w:t>
+      </w:r>
+      <w:r>
+        <w:rPr>
+          <w:rStyle w:val="NormalTok"/>
+        </w:rPr>
+        <w:t xml:space="preserve"> -n -o SOURCE,SIZE,TARGET /opt</w:t>
+      </w:r>
+    </w:p>
+    <w:p>
+      <w:pPr>
+        <w:pStyle w:val="FirstParagraph"/>
+      </w:pPr>
+      <w:r>
+        <w:rPr>
+          <w:b/>
+        </w:rPr>
+        <w:t xml:space="preserve">Expected output:</w:t>
+      </w:r>
+    </w:p>
+    <w:p>
+      <w:pPr>
+        <w:pStyle w:val="BodyText"/>
+      </w:pPr>
+      <w:r>
+        <w:t xml:space="preserve">One line.</w:t>
+      </w:r>
+      <w:r>
+        <w:t xml:space="preserve"> </w:t>
+      </w:r>
+      <w:r>
+        <w:rPr>
+          <w:rStyle w:val="VerbatimChar"/>
+        </w:rPr>
+        <w:t xml:space="preserve">SOURCE</w:t>
+      </w:r>
+      <w:r>
+        <w:t xml:space="preserve"> </w:t>
+      </w:r>
+      <w:r>
+        <w:t xml:space="preserve">is</w:t>
+      </w:r>
+      <w:r>
+        <w:t xml:space="preserve"> </w:t>
+      </w:r>
+      <w:r>
+        <w:rPr>
+          <w:rStyle w:val="VerbatimChar"/>
+        </w:rPr>
+        <w:t xml:space="preserve">/dev/mapper/datavg-optlv</w:t>
+      </w:r>
+      <w:r>
+        <w:t xml:space="preserve"> </w:t>
+      </w:r>
+      <w:r>
+        <w:t xml:space="preserve">and</w:t>
+      </w:r>
+      <w:r>
+        <w:t xml:space="preserve"> </w:t>
+      </w:r>
+      <w:r>
+        <w:rPr>
+          <w:rStyle w:val="VerbatimChar"/>
+        </w:rPr>
+        <w:t xml:space="preserve">SIZE</w:t>
+      </w:r>
+      <w:r>
+        <w:t xml:space="preserve"> </w:t>
+      </w:r>
+      <w:r>
+        <w:t xml:space="preserve">is</w:t>
+      </w:r>
+      <w:r>
+        <w:t xml:space="preserve"> </w:t>
+      </w:r>
+      <w:r>
+        <w:rPr>
+          <w:rStyle w:val="VerbatimChar"/>
+        </w:rPr>
+        <w:t xml:space="preserve">1023.5G</w:t>
+      </w:r>
+      <w:r>
+        <w:t xml:space="preserve"> </w:t>
+      </w:r>
+      <w:r>
+        <w:t xml:space="preserve">on this image. Empty output means</w:t>
+      </w:r>
+      <w:r>
+        <w:t xml:space="preserve"> </w:t>
+      </w:r>
+      <w:r>
+        <w:rPr>
+          <w:rStyle w:val="VerbatimChar"/>
+        </w:rPr>
+        <w:t xml:space="preserve">/opt</w:t>
+      </w:r>
+      <w:r>
+        <w:t xml:space="preserve"> </w:t>
+      </w:r>
+      <w:r>
+        <w:t xml:space="preserve">is not a mount. Stop and finish the pre-install guide before creating these directories.</w:t>
+      </w:r>
+    </w:p>
+    <w:p>
+      <w:pPr>
+        <w:pStyle w:val="SourceCode"/>
+        <w:spacing w:before="120" w:after="120" w:line="276" w:lineRule="auto"/>
+      </w:pPr>
+      <w:r>
+        <w:rPr>
+          <w:rStyle w:val="VerbatimChar"/>
+        </w:rPr>
+        <w:t xml:space="preserve">/dev/mapper/datavg-optlv 1023.5G /opt</w:t>
+      </w:r>
+    </w:p>
+    <w:p>
+      <w:pPr>
+        <w:pStyle w:val="FirstParagraph"/>
+      </w:pPr>
+      <w:r>
+        <w:rPr>
+          <w:rStyle w:val="VerbatimChar"/>
+        </w:rPr>
+        <w:t xml:space="preserve">/opt/oracle</w:t>
+      </w:r>
+      <w:r>
+        <w:t xml:space="preserve"> </w:t>
+      </w:r>
+      <w:r>
+        <w:t xml:space="preserve">holds the database software.</w:t>
+      </w:r>
+      <w:r>
+        <w:t xml:space="preserve"> </w:t>
+      </w:r>
+      <w:r>
+        <w:rPr>
+          <w:rStyle w:val="VerbatimChar"/>
+        </w:rPr>
+        <w:t xml:space="preserve">/opt/nokia</w:t>
+      </w:r>
+      <w:r>
+        <w:t xml:space="preserve"> </w:t>
+      </w:r>
+      <w:r>
+        <w:t xml:space="preserve">holds the TNMS software.</w:t>
+      </w:r>
+      <w:r>
+        <w:t xml:space="preserve"> </w:t>
+      </w:r>
+      <w:r>
+        <w:rPr>
+          <w:rStyle w:val="VerbatimChar"/>
+        </w:rPr>
+        <w:t xml:space="preserve">/opt/tnms-data</w:t>
+      </w:r>
+      <w:r>
+        <w:t xml:space="preserve"> </w:t>
+      </w:r>
+      <w:r>
+        <w:t xml:space="preserve">is the TNMS data directory.</w:t>
+      </w:r>
+      <w:r>
+        <w:t xml:space="preserve"> </w:t>
+      </w:r>
+      <w:r>
+        <w:rPr>
+          <w:rStyle w:val="VerbatimChar"/>
+        </w:rPr>
+        <w:t xml:space="preserve">/opt/oradata</w:t>
+      </w:r>
+      <w:r>
+        <w:t xml:space="preserve"> </w:t>
+      </w:r>
+      <w:r>
+        <w:t xml:space="preserve">holds</w:t>
+      </w:r>
+      <w:r>
+        <w:t xml:space="preserve"> </w:t>
+      </w:r>
+      <w:r>
+        <w:rPr>
+          <w:rStyle w:val="VerbatimChar"/>
+        </w:rPr>
+        <w:t xml:space="preserve">ora1</w:t>
+      </w:r>
+      <w:r>
+        <w:t xml:space="preserve">,</w:t>
+      </w:r>
+      <w:r>
+        <w:t xml:space="preserve"> </w:t>
+      </w:r>
+      <w:r>
+        <w:rPr>
+          <w:rStyle w:val="VerbatimChar"/>
+        </w:rPr>
+        <w:t xml:space="preserve">ora2</w:t>
+      </w:r>
+      <w:r>
+        <w:t xml:space="preserve">, and</w:t>
+      </w:r>
+      <w:r>
+        <w:t xml:space="preserve"> </w:t>
+      </w:r>
+      <w:r>
+        <w:rPr>
+          <w:rStyle w:val="VerbatimChar"/>
+        </w:rPr>
+        <w:t xml:space="preserve">ora3</w:t>
+      </w:r>
+      <w:r>
+        <w:t xml:space="preserve">. Pre-install bind-mounts</w:t>
+      </w:r>
+      <w:r>
+        <w:t xml:space="preserve"> </w:t>
+      </w:r>
+      <w:r>
+        <w:rPr>
+          <w:rStyle w:val="VerbatimChar"/>
+        </w:rPr>
+        <w:t xml:space="preserve">/opt/tnms-data</w:t>
+      </w:r>
+      <w:r>
+        <w:t xml:space="preserve"> </w:t>
+      </w:r>
+      <w:r>
+        <w:t xml:space="preserve">on</w:t>
+      </w:r>
+      <w:r>
+        <w:t xml:space="preserve"> </w:t>
+      </w:r>
+      <w:r>
+        <w:rPr>
+          <w:rStyle w:val="VerbatimChar"/>
+        </w:rPr>
+        <w:t xml:space="preserve">/nokia</w:t>
+      </w:r>
+      <w:r>
+        <w:t xml:space="preserve"> </w:t>
+      </w:r>
+      <w:r>
+        <w:t xml:space="preserve">and</w:t>
+      </w:r>
+      <w:r>
+        <w:t xml:space="preserve"> </w:t>
+      </w:r>
+      <w:r>
+        <w:rPr>
+          <w:rStyle w:val="VerbatimChar"/>
+        </w:rPr>
+        <w:t xml:space="preserve">/opt/oradata</w:t>
+      </w:r>
+      <w:r>
+        <w:t xml:space="preserve"> </w:t>
+      </w:r>
+      <w:r>
+        <w:t xml:space="preserve">on</w:t>
+      </w:r>
+      <w:r>
+        <w:t xml:space="preserve"> </w:t>
+      </w:r>
+      <w:r>
+        <w:rPr>
+          <w:rStyle w:val="VerbatimChar"/>
+        </w:rPr>
+        <w:t xml:space="preserve">/oradata</w:t>
+      </w:r>
+      <w:r>
+        <w:t xml:space="preserve">.</w:t>
+      </w:r>
+      <w:r>
+        <w:t xml:space="preserve"> </w:t>
+      </w:r>
+      <w:r>
+        <w:rPr>
+          <w:rStyle w:val="VerbatimChar"/>
+        </w:rPr>
+        <w:t xml:space="preserve">/opt/tnms-install</w:t>
+      </w:r>
+      <w:r>
+        <w:t xml:space="preserve"> </w:t>
+      </w:r>
+      <w:r>
+        <w:t xml:space="preserve">holds the wizard files.</w:t>
+      </w:r>
+      <w:r>
+        <w:t xml:space="preserve"> </w:t>
+      </w:r>
+      <w:r>
+        <w:rPr>
+          <w:rStyle w:val="VerbatimChar"/>
+        </w:rPr>
+        <w:t xml:space="preserve">/opt/tnms-install/resources</w:t>
+      </w:r>
+      <w:r>
+        <w:t xml:space="preserve"> </w:t>
+      </w:r>
+      <w:r>
+        <w:t xml:space="preserve">holds the three zip files.</w:t>
+      </w:r>
+    </w:p>
+    <w:p>
+      <w:pPr>
+        <w:spacing w:before="80" w:after="80" w:line="160" w:lineRule="exact"/>
+      </w:pPr>
+    </w:p>
+    <w:tbl>
+      <w:tblPr>
+        <w:tblStyle w:val="Table"/>
+        <w:tblW w:type="dxa" w:w="10080"/>
+        <w:tblLayout w:type="fixed"/>
+        <w:tblLook w:firstRow="1" w:noHBand="0" w:noVBand="1"/>
+      </w:tblPr>
+      <w:tblGrid>
+        <w:gridCol w:w="3360"/>
+        <w:gridCol w:w="3360"/>
+        <w:gridCol w:w="3360"/>
+      </w:tblGrid>
+      <w:tr>
+        <w:trPr>
+          <w:tblHeader/>
+          <w:cnfStyle w:firstRow="1"/>
+        </w:trPr>
+        <w:tc>
+          <w:tcPr>
+            <w:tcW w:w="3360" w:type="dxa"/>
+            <w:tcBorders>
+              <w:bottom w:val="single"/>
+            </w:tcBorders>
+            <w:vAlign w:val="bottom"/>
+          </w:tcPr>
+          <w:p>
+            <w:pPr>
+              <w:pStyle w:val="Compact"/>
+              <w:jc w:val="left"/>
+            </w:pPr>
+            <w:r>
+              <w:t xml:space="preserve">Path</w:t>
+            </w:r>
+          </w:p>
+        </w:tc>
+        <w:tc>
+          <w:tcPr>
+            <w:tcW w:w="3360" w:type="dxa"/>
+            <w:tcBorders>
+              <w:bottom w:val="single"/>
+            </w:tcBorders>
+            <w:vAlign w:val="bottom"/>
+          </w:tcPr>
+          <w:p>
+            <w:pPr>
+              <w:pStyle w:val="Compact"/>
+              <w:jc w:val="left"/>
+            </w:pPr>
+            <w:r>
+              <w:t xml:space="preserve">Mode</w:t>
+            </w:r>
+          </w:p>
+        </w:tc>
+        <w:tc>
+          <w:tcPr>
+            <w:tcW w:w="3360" w:type="dxa"/>
+            <w:tcBorders>
+              <w:bottom w:val="single"/>
+            </w:tcBorders>
+            <w:vAlign w:val="bottom"/>
+          </w:tcPr>
+          <w:p>
+            <w:pPr>
+              <w:pStyle w:val="Compact"/>
+              <w:jc w:val="left"/>
+            </w:pPr>
+            <w:r>
+              <w:t xml:space="preserve">Owner and group</w:t>
+            </w:r>
+          </w:p>
+        </w:tc>
+      </w:tr>
+      <w:tr>
+        <w:tc>
+          <w:tcPr>
+            <w:tcW w:w="3360" w:type="dxa"/>
+          </w:tcPr>
+          <w:p>
+            <w:pPr>
+              <w:pStyle w:val="Compact"/>
+              <w:jc w:val="left"/>
+            </w:pPr>
+            <w:r>
+              <w:t xml:space="preserve">/opt/oracle</w:t>
+            </w:r>
+          </w:p>
+        </w:tc>
+        <w:tc>
+          <w:tcPr>
+            <w:tcW w:w="3360" w:type="dxa"/>
+          </w:tcPr>
+          <w:p>
+            <w:pPr>
+              <w:pStyle w:val="Compact"/>
+              <w:jc w:val="left"/>
+            </w:pPr>
+            <w:r>
+              <w:t xml:space="preserve">755</w:t>
+            </w:r>
+          </w:p>
+        </w:tc>
+        <w:tc>
+          <w:tcPr>
+            <w:tcW w:w="3360" w:type="dxa"/>
+          </w:tcPr>
+          <w:p>
+            <w:pPr>
+              <w:pStyle w:val="Compact"/>
+              <w:jc w:val="left"/>
+            </w:pPr>
+            <w:r>
+              <w:t xml:space="preserve">root root</w:t>
+            </w:r>
+          </w:p>
+        </w:tc>
+      </w:tr>
+      <w:tr>
+        <w:tc>
+          <w:tcPr>
+            <w:tcW w:w="3360" w:type="dxa"/>
+          </w:tcPr>
+          <w:p>
+            <w:pPr>
+              <w:pStyle w:val="Compact"/>
+              <w:jc w:val="left"/>
+            </w:pPr>
+            <w:r>
+              <w:t xml:space="preserve">/opt/nokia</w:t>
+            </w:r>
+          </w:p>
+        </w:tc>
+        <w:tc>
+          <w:tcPr>
+            <w:tcW w:w="3360" w:type="dxa"/>
+          </w:tcPr>
+          <w:p>
+            <w:pPr>
+              <w:pStyle w:val="Compact"/>
+              <w:jc w:val="left"/>
+            </w:pPr>
+            <w:r>
+              <w:t xml:space="preserve">755</w:t>
+            </w:r>
+          </w:p>
+        </w:tc>
+        <w:tc>
+          <w:tcPr>
+            <w:tcW w:w="3360" w:type="dxa"/>
+          </w:tcPr>
+          <w:p>
+            <w:pPr>
+              <w:pStyle w:val="Compact"/>
+              <w:jc w:val="left"/>
+            </w:pPr>
+            <w:r>
+              <w:t xml:space="preserve">root root</w:t>
+            </w:r>
+          </w:p>
+        </w:tc>
+      </w:tr>
+      <w:tr>
+        <w:tc>
+          <w:tcPr>
+            <w:tcW w:w="3360" w:type="dxa"/>
+          </w:tcPr>
+          <w:p>
+            <w:pPr>
+              <w:pStyle w:val="Compact"/>
+              <w:jc w:val="left"/>
+            </w:pPr>
+            <w:r>
+              <w:t xml:space="preserve">/opt/tnms-data</w:t>
+            </w:r>
+          </w:p>
+        </w:tc>
+        <w:tc>
+          <w:tcPr>
+            <w:tcW w:w="3360" w:type="dxa"/>
+          </w:tcPr>
+          <w:p>
+            <w:pPr>
+              <w:pStyle w:val="Compact"/>
+              <w:jc w:val="left"/>
+            </w:pPr>
+            <w:r>
+              <w:t xml:space="preserve">755</w:t>
+            </w:r>
+          </w:p>
+        </w:tc>
+        <w:tc>
+          <w:tcPr>
+            <w:tcW w:w="3360" w:type="dxa"/>
+          </w:tcPr>
+          <w:p>
+            <w:pPr>
+              <w:pStyle w:val="Compact"/>
+              <w:jc w:val="left"/>
+            </w:pPr>
+            <w:r>
+              <w:t xml:space="preserve">root root</w:t>
+            </w:r>
+          </w:p>
+        </w:tc>
+      </w:tr>
+      <w:tr>
+        <w:tc>
+          <w:tcPr>
+            <w:tcW w:w="3360" w:type="dxa"/>
+          </w:tcPr>
+          <w:p>
+            <w:pPr>
+              <w:pStyle w:val="Compact"/>
+              <w:jc w:val="left"/>
+            </w:pPr>
+            <w:r>
+              <w:t xml:space="preserve">/opt/oradata</w:t>
+            </w:r>
+          </w:p>
+        </w:tc>
+        <w:tc>
+          <w:tcPr>
+            <w:tcW w:w="3360" w:type="dxa"/>
+          </w:tcPr>
+          <w:p>
+            <w:pPr>
+              <w:pStyle w:val="Compact"/>
+              <w:jc w:val="left"/>
+            </w:pPr>
+            <w:r>
+              <w:t xml:space="preserve">755</w:t>
+            </w:r>
+          </w:p>
+        </w:tc>
+        <w:tc>
+          <w:tcPr>
+            <w:tcW w:w="3360" w:type="dxa"/>
+          </w:tcPr>
+          <w:p>
+            <w:pPr>
+              <w:pStyle w:val="Compact"/>
+              <w:jc w:val="left"/>
+            </w:pPr>
+            <w:r>
+              <w:t xml:space="preserve">root root</w:t>
+            </w:r>
+          </w:p>
+        </w:tc>
+      </w:tr>
+      <w:tr>
+        <w:tc>
+          <w:tcPr>
+            <w:tcW w:w="3360" w:type="dxa"/>
+          </w:tcPr>
+          <w:p>
+            <w:pPr>
+              <w:pStyle w:val="Compact"/>
+              <w:jc w:val="left"/>
+            </w:pPr>
+            <w:r>
+              <w:t xml:space="preserve">/opt/oradata/ora1</w:t>
+            </w:r>
+          </w:p>
+        </w:tc>
+        <w:tc>
+          <w:tcPr>
+            <w:tcW w:w="3360" w:type="dxa"/>
+          </w:tcPr>
+          <w:p>
+            <w:pPr>
+              <w:pStyle w:val="Compact"/>
+              <w:jc w:val="left"/>
+            </w:pPr>
+            <w:r>
+              <w:t xml:space="preserve">755</w:t>
+            </w:r>
+          </w:p>
+        </w:tc>
+        <w:tc>
+          <w:tcPr>
+            <w:tcW w:w="3360" w:type="dxa"/>
+          </w:tcPr>
+          <w:p>
+            <w:pPr>
+              <w:pStyle w:val="Compact"/>
+              <w:jc w:val="left"/>
+            </w:pPr>
+            <w:r>
+              <w:t xml:space="preserve">root root</w:t>
+            </w:r>
+          </w:p>
+        </w:tc>
+      </w:tr>
+      <w:tr>
+        <w:tc>
+          <w:tcPr>
+            <w:tcW w:w="3360" w:type="dxa"/>
+          </w:tcPr>
+          <w:p>
+            <w:pPr>
+              <w:pStyle w:val="Compact"/>
+              <w:jc w:val="left"/>
+            </w:pPr>
+            <w:r>
+              <w:t xml:space="preserve">/opt/oradata/ora2</w:t>
+            </w:r>
+          </w:p>
+        </w:tc>
+        <w:tc>
+          <w:tcPr>
+            <w:tcW w:w="3360" w:type="dxa"/>
+          </w:tcPr>
+          <w:p>
+            <w:pPr>
+              <w:pStyle w:val="Compact"/>
+              <w:jc w:val="left"/>
+            </w:pPr>
+            <w:r>
+              <w:t xml:space="preserve">755</w:t>
+            </w:r>
+          </w:p>
+        </w:tc>
+        <w:tc>
+          <w:tcPr>
+            <w:tcW w:w="3360" w:type="dxa"/>
+          </w:tcPr>
+          <w:p>
+            <w:pPr>
+              <w:pStyle w:val="Compact"/>
+              <w:jc w:val="left"/>
+            </w:pPr>
+            <w:r>
+              <w:t xml:space="preserve">root root</w:t>
+            </w:r>
+          </w:p>
+        </w:tc>
+      </w:tr>
+      <w:tr>
+        <w:tc>
+          <w:tcPr>
+            <w:tcW w:w="3360" w:type="dxa"/>
+          </w:tcPr>
+          <w:p>
+            <w:pPr>
+              <w:pStyle w:val="Compact"/>
+              <w:jc w:val="left"/>
+            </w:pPr>
+            <w:r>
+              <w:t xml:space="preserve">/opt/oradata/ora3</w:t>
+            </w:r>
+          </w:p>
+        </w:tc>
+        <w:tc>
+          <w:tcPr>
+            <w:tcW w:w="3360" w:type="dxa"/>
+          </w:tcPr>
+          <w:p>
+            <w:pPr>
+              <w:pStyle w:val="Compact"/>
+              <w:jc w:val="left"/>
+            </w:pPr>
+            <w:r>
+              <w:t xml:space="preserve">755</w:t>
+            </w:r>
+          </w:p>
+        </w:tc>
+        <w:tc>
+          <w:tcPr>
+            <w:tcW w:w="3360" w:type="dxa"/>
+          </w:tcPr>
+          <w:p>
+            <w:pPr>
+              <w:pStyle w:val="Compact"/>
+              <w:jc w:val="left"/>
+            </w:pPr>
+            <w:r>
+              <w:t xml:space="preserve">root root</w:t>
+            </w:r>
+          </w:p>
+        </w:tc>
+      </w:tr>
+      <w:tr>
+        <w:tc>
+          <w:tcPr>
+            <w:tcW w:w="3360" w:type="dxa"/>
+          </w:tcPr>
+          <w:p>
+            <w:pPr>
+              <w:pStyle w:val="Compact"/>
+              <w:jc w:val="left"/>
+            </w:pPr>
+            <w:r>
+              <w:t xml:space="preserve">/opt/tnms-install</w:t>
+            </w:r>
+          </w:p>
+        </w:tc>
+        <w:tc>
+          <w:tcPr>
+            <w:tcW w:w="3360" w:type="dxa"/>
+          </w:tcPr>
+          <w:p>
+            <w:pPr>
+              <w:pStyle w:val="Compact"/>
+              <w:jc w:val="left"/>
+            </w:pPr>
+            <w:r>
+              <w:t xml:space="preserve">750</w:t>
+            </w:r>
+          </w:p>
+        </w:tc>
+        <w:tc>
+          <w:tcPr>
+            <w:tcW w:w="3360" w:type="dxa"/>
+          </w:tcPr>
+          <w:p>
+            <w:pPr>
+              <w:pStyle w:val="Compact"/>
+              <w:jc w:val="left"/>
+            </w:pPr>
+            <w:r>
+              <w:t xml:space="preserve">root azureuser</w:t>
+            </w:r>
+          </w:p>
+        </w:tc>
+      </w:tr>
+      <w:tr>
+        <w:tc>
+          <w:tcPr>
+            <w:tcW w:w="3360" w:type="dxa"/>
+          </w:tcPr>
+          <w:p>
+            <w:pPr>
+              <w:pStyle w:val="Compact"/>
+              <w:jc w:val="left"/>
+            </w:pPr>
+            <w:r>
+              <w:t xml:space="preserve">/opt/tnms-install/resources</w:t>
+            </w:r>
+          </w:p>
+        </w:tc>
+        <w:tc>
+          <w:tcPr>
+            <w:tcW w:w="3360" w:type="dxa"/>
+          </w:tcPr>
+          <w:p>
+            <w:pPr>
+              <w:pStyle w:val="Compact"/>
+              <w:jc w:val="left"/>
+            </w:pPr>
+            <w:r>
+              <w:t xml:space="preserve">750</w:t>
+            </w:r>
+          </w:p>
+        </w:tc>
+        <w:tc>
+          <w:tcPr>
+            <w:tcW w:w="3360" w:type="dxa"/>
+          </w:tcPr>
+          <w:p>
+            <w:pPr>
+              <w:pStyle w:val="Compact"/>
+              <w:jc w:val="left"/>
+            </w:pPr>
+            <w:r>
+              <w:t xml:space="preserve">root azureuser</w:t>
+            </w:r>
+          </w:p>
+        </w:tc>
+      </w:tr>
+    </w:tbl>
+    <w:p>
+      <w:pPr>
+        <w:pStyle w:val="BodyText"/>
+      </w:pPr>
+      <w:r>
+        <w:t xml:space="preserve">Mode</w:t>
+      </w:r>
+      <w:r>
+        <w:t xml:space="preserve"> </w:t>
+      </w:r>
+      <w:r>
+        <w:rPr>
+          <w:rStyle w:val="VerbatimChar"/>
+        </w:rPr>
+        <w:t xml:space="preserve">755</w:t>
+      </w:r>
+      <w:r>
+        <w:t xml:space="preserve"> </w:t>
+      </w:r>
+      <w:r>
+        <w:t xml:space="preserve">lets the</w:t>
+      </w:r>
+      <w:r>
+        <w:t xml:space="preserve"> </w:t>
+      </w:r>
+      <w:r>
+        <w:rPr>
+          <w:rStyle w:val="VerbatimChar"/>
+        </w:rPr>
+        <w:t xml:space="preserve">oracle</w:t>
+      </w:r>
+      <w:r>
+        <w:t xml:space="preserve"> </w:t>
+      </w:r>
+      <w:r>
+        <w:t xml:space="preserve">and</w:t>
+      </w:r>
+      <w:r>
+        <w:t xml:space="preserve"> </w:t>
+      </w:r>
+      <w:r>
+        <w:rPr>
+          <w:rStyle w:val="VerbatimChar"/>
+        </w:rPr>
+        <w:t xml:space="preserve">tnms</w:t>
+      </w:r>
+      <w:r>
+        <w:t xml:space="preserve"> </w:t>
+      </w:r>
+      <w:r>
+        <w:t xml:space="preserve">users enter those directories when the install creates them. Mode</w:t>
+      </w:r>
+      <w:r>
+        <w:t xml:space="preserve"> </w:t>
+      </w:r>
+      <w:r>
+        <w:rPr>
+          <w:rStyle w:val="VerbatimChar"/>
+        </w:rPr>
+        <w:t xml:space="preserve">750</w:t>
+      </w:r>
+      <w:r>
+        <w:t xml:space="preserve"> </w:t>
+      </w:r>
+      <w:r>
+        <w:t xml:space="preserve">and group</w:t>
+      </w:r>
+      <w:r>
+        <w:t xml:space="preserve"> </w:t>
+      </w:r>
+      <w:r>
+        <w:rPr>
+          <w:rStyle w:val="VerbatimChar"/>
+        </w:rPr>
+        <w:t xml:space="preserve">azureuser</w:t>
+      </w:r>
+      <w:r>
+        <w:t xml:space="preserve"> </w:t>
+      </w:r>
+      <w:r>
+        <w:t xml:space="preserve">let the SSH login open</w:t>
+      </w:r>
+      <w:r>
+        <w:t xml:space="preserve"> </w:t>
+      </w:r>
+      <w:r>
+        <w:rPr>
+          <w:rStyle w:val="VerbatimChar"/>
+        </w:rPr>
+        <w:t xml:space="preserve">/opt/tnms-install</w:t>
+      </w:r>
+      <w:r>
+        <w:t xml:space="preserve">. Other accounts cannot. Root remains the owner.</w:t>
+      </w:r>
+    </w:p>
+    <w:p>
+      <w:pPr>
+        <w:pStyle w:val="SourceCode"/>
+        <w:spacing w:before="120" w:after="120" w:line="276" w:lineRule="auto"/>
+      </w:pPr>
+      <w:r>
+        <w:rPr>
+          <w:rStyle w:val="FunctionTok"/>
+        </w:rPr>
+        <w:t xml:space="preserve">install</w:t>
+      </w:r>
+      <w:r>
+        <w:rPr>
+          <w:rStyle w:val="NormalTok"/>
+        </w:rPr>
+        <w:t xml:space="preserve"> -d -o root -g root -m 755 /opt/oracle /opt/nokia /opt/tnms-data</w:t>
+      </w:r>
+      <w:r>
+        <w:br w:type="textWrapping"/>
+      </w:r>
+      <w:r>
+        <w:rPr>
+          <w:rStyle w:val="FunctionTok"/>
+        </w:rPr>
+        <w:t xml:space="preserve">install</w:t>
+      </w:r>
+      <w:r>
+        <w:rPr>
+          <w:rStyle w:val="NormalTok"/>
+        </w:rPr>
+        <w:t xml:space="preserve"> -d -o root -g root -m 755 /opt/oradata/ora1 /opt/oradata/ora2 /opt/oradata/ora3</w:t>
+      </w:r>
+      <w:r>
+        <w:br w:type="textWrapping"/>
+      </w:r>
+      <w:r>
+        <w:rPr>
+          <w:rStyle w:val="FunctionTok"/>
+        </w:rPr>
+        <w:t xml:space="preserve">install</w:t>
+      </w:r>
+      <w:r>
+        <w:rPr>
+          <w:rStyle w:val="NormalTok"/>
+        </w:rPr>
+        <w:t xml:space="preserve"> -d -o root -g azureuser -m 750 /opt/tnms-install /opt/tnms-install/resources</w:t>
+      </w:r>
+      <w:r>
+        <w:br w:type="textWrapping"/>
+      </w:r>
+      <w:r>
+        <w:rPr>
+          <w:rStyle w:val="ExtensionTok"/>
+        </w:rPr>
+        <w:t xml:space="preserve">restorecon</w:t>
+      </w:r>
+      <w:r>
+        <w:rPr>
+          <w:rStyle w:val="NormalTok"/>
+        </w:rPr>
+        <w:t xml:space="preserve"> -RF /opt/oracle /opt/nokia /opt/tnms-data /opt/oradata /opt/tnms-install</w:t>
+      </w:r>
+    </w:p>
+    <w:p>
+      <w:pPr>
+        <w:pStyle w:val="FirstParagraph"/>
+      </w:pPr>
+      <w:r>
+        <w:rPr>
+          <w:rStyle w:val="VerbatimChar"/>
+        </w:rPr>
+        <w:t xml:space="preserve">install</w:t>
+      </w:r>
+      <w:r>
+        <w:t xml:space="preserve"> </w:t>
+      </w:r>
+      <w:r>
+        <w:t xml:space="preserve">prints nothing.</w:t>
+      </w:r>
+      <w:r>
+        <w:t xml:space="preserve"> </w:t>
+      </w:r>
+      <w:r>
+        <w:rPr>
+          <w:rStyle w:val="VerbatimChar"/>
+        </w:rPr>
+        <w:t xml:space="preserve">restorecon</w:t>
+      </w:r>
+      <w:r>
+        <w:t xml:space="preserve"> </w:t>
+      </w:r>
+      <w:r>
+        <w:t xml:space="preserve">prints a line for each directory it relabels, or nothing when the labels are already right.</w:t>
+      </w:r>
+    </w:p>
+    <w:p>
+      <w:pPr>
+        <w:pStyle w:val="BodyText"/>
+      </w:pPr>
+      <w:r>
+        <w:rPr>
+          <w:b/>
+        </w:rPr>
+        <w:t xml:space="preserve">Confirm by running:</w:t>
+      </w:r>
+    </w:p>
+    <w:p>
+      <w:pPr>
+        <w:pStyle w:val="SourceCode"/>
+        <w:spacing w:before="120" w:after="120" w:line="276" w:lineRule="auto"/>
+      </w:pPr>
+      <w:r>
+        <w:rPr>
+          <w:rStyle w:val="FunctionTok"/>
+        </w:rPr>
+        <w:t xml:space="preserve">stat</w:t>
+      </w:r>
+      <w:r>
+        <w:rPr>
+          <w:rStyle w:val="NormalTok"/>
+        </w:rPr>
+        <w:t xml:space="preserve"> -c </w:t>
+      </w:r>
+      <w:r>
+        <w:rPr>
+          <w:rStyle w:val="StringTok"/>
+        </w:rPr>
+        <w:t xml:space="preserve">'%A %U %G %n'</w:t>
+      </w:r>
+      <w:r>
+        <w:rPr>
+          <w:rStyle w:val="NormalTok"/>
+        </w:rPr>
+        <w:t xml:space="preserve"> /opt/oracle /opt/nokia /opt/tnms-data \</w:t>
+      </w:r>
+      <w:r>
+        <w:br w:type="textWrapping"/>
+      </w:r>
+      <w:r>
+        <w:rPr>
+          <w:rStyle w:val="NormalTok"/>
+        </w:rPr>
+        <w:t xml:space="preserve">  /opt/oradata /opt/oradata/ora1 /opt/oradata/ora2 /opt/oradata/ora3 \</w:t>
+      </w:r>
+      <w:r>
+        <w:br w:type="textWrapping"/>
+      </w:r>
+      <w:r>
+        <w:rPr>
+          <w:rStyle w:val="NormalTok"/>
+        </w:rPr>
+        <w:t xml:space="preserve">  /opt/tnms-install /opt/tnms-install/resources</w:t>
+      </w:r>
+    </w:p>
+    <w:p>
+      <w:pPr>
+        <w:pStyle w:val="FirstParagraph"/>
+      </w:pPr>
+      <w:r>
+        <w:rPr>
+          <w:b/>
+        </w:rPr>
+        <w:t xml:space="preserve">Expected output:</w:t>
+      </w:r>
+    </w:p>
+    <w:p>
+      <w:pPr>
+        <w:pStyle w:val="SourceCode"/>
+        <w:spacing w:before="120" w:after="120" w:line="276" w:lineRule="auto"/>
+      </w:pPr>
+      <w:r>
+        <w:rPr>
+          <w:rStyle w:val="VerbatimChar"/>
+        </w:rPr>
+        <w:t xml:space="preserve">drwxr-xr-x root root /opt/oracle</w:t>
+      </w:r>
+      <w:r>
+        <w:br w:type="textWrapping"/>
+      </w:r>
+      <w:r>
+        <w:rPr>
+          <w:rStyle w:val="VerbatimChar"/>
+        </w:rPr>
+        <w:t xml:space="preserve">drwxr-xr-x root root /opt/nokia</w:t>
+      </w:r>
+      <w:r>
+        <w:br w:type="textWrapping"/>
+      </w:r>
+      <w:r>
+        <w:rPr>
+          <w:rStyle w:val="VerbatimChar"/>
+        </w:rPr>
+        <w:t xml:space="preserve">drwxr-xr-x root root /opt/tnms-data</w:t>
+      </w:r>
+      <w:r>
+        <w:br w:type="textWrapping"/>
+      </w:r>
+      <w:r>
+        <w:rPr>
+          <w:rStyle w:val="VerbatimChar"/>
+        </w:rPr>
+        <w:t xml:space="preserve">drwxr-xr-x root root /opt/oradata</w:t>
+      </w:r>
+      <w:r>
+        <w:br w:type="textWrapping"/>
+      </w:r>
+      <w:r>
+        <w:rPr>
+          <w:rStyle w:val="VerbatimChar"/>
+        </w:rPr>
+        <w:t xml:space="preserve">drwxr-xr-x root root /opt/oradata/ora1</w:t>
+      </w:r>
+      <w:r>
+        <w:br w:type="textWrapping"/>
+      </w:r>
+      <w:r>
+        <w:rPr>
+          <w:rStyle w:val="VerbatimChar"/>
+        </w:rPr>
+        <w:t xml:space="preserve">drwxr-xr-x root root /opt/oradata/ora2</w:t>
+      </w:r>
+      <w:r>
+        <w:br w:type="textWrapping"/>
+      </w:r>
+      <w:r>
+        <w:rPr>
+          <w:rStyle w:val="VerbatimChar"/>
+        </w:rPr>
+        <w:t xml:space="preserve">drwxr-xr-x root root /opt/oradata/ora3</w:t>
+      </w:r>
+      <w:r>
+        <w:br w:type="textWrapping"/>
+      </w:r>
+      <w:r>
+        <w:rPr>
+          <w:rStyle w:val="VerbatimChar"/>
+        </w:rPr>
+        <w:t xml:space="preserve">drwxr-x--- root azureuser /opt/tnms-install</w:t>
+      </w:r>
+      <w:r>
+        <w:br w:type="textWrapping"/>
+      </w:r>
+      <w:r>
+        <w:rPr>
+          <w:rStyle w:val="VerbatimChar"/>
+        </w:rPr>
+        <w:t xml:space="preserve">drwxr-x--- root azureuser /opt/tnms-install/resources</w:t>
+      </w:r>
+    </w:p>
+    <w:p>
+      <w:pPr>
+        <w:pStyle w:val="Heading2"/>
+      </w:pPr>
+      <w:bookmarkStart w:id="25" w:name="where-the-install-files-go"/>
+      <w:r>
+        <w:t xml:space="preserve">Where the install files go</w:t>
+      </w:r>
+      <w:bookmarkEnd w:id="25"/>
+    </w:p>
+    <w:p>
+      <w:pPr>
+        <w:pStyle w:val="BlockText"/>
+      </w:pPr>
+      <w:r>
+        <w:t xml:space="preserve">The directories were created in</w:t>
+      </w:r>
+      <w:r>
+        <w:t xml:space="preserve"> </w:t>
+      </w:r>
+      <w:r>
+        <w:rPr>
+          <w:b/>
+        </w:rPr>
+        <w:t xml:space="preserve">Create the /opt directories</w:t>
+      </w:r>
+      <w:r>
+        <w:t xml:space="preserve">. The five files are in</w:t>
       </w:r>
       <w:r>
         <w:t xml:space="preserve"> </w:t>
@@ -667,54 +1909,6 @@
         <w:t xml:space="preserve"> </w:t>
       </w:r>
       <w:r>
-        <w:t xml:space="preserve">to</w:t>
-      </w:r>
-      <w:r>
-        <w:t xml:space="preserve"> </w:t>
-      </w:r>
-      <w:r>
-        <w:rPr>
-          <w:rStyle w:val="VerbatimChar"/>
-        </w:rPr>
-        <w:t xml:space="preserve">/opt/tnms-install</w:t>
-      </w:r>
-      <w:r>
-        <w:t xml:space="preserve"> </w:t>
-      </w:r>
-      <w:r>
-        <w:t xml:space="preserve">and sets the permissions.</w:t>
-      </w:r>
-    </w:p>
-    <w:p>
-      <w:pPr>
-        <w:pStyle w:val="Heading2"/>
-      </w:pPr>
-      <w:bookmarkStart w:id="24" w:name="where-the-install-files-go"/>
-      <w:r>
-        <w:t xml:space="preserve">Where the install files go</w:t>
-      </w:r>
-      <w:bookmarkEnd w:id="24"/>
-    </w:p>
-    <w:p>
-      <w:pPr>
-        <w:pStyle w:val="BlockText"/>
-      </w:pPr>
-      <w:r>
-        <w:t xml:space="preserve">The five files are in</w:t>
-      </w:r>
-      <w:r>
-        <w:t xml:space="preserve"> </w:t>
-      </w:r>
-      <w:r>
-        <w:rPr>
-          <w:rStyle w:val="VerbatimChar"/>
-        </w:rPr>
-        <w:t xml:space="preserve">/tmp</w:t>
-      </w:r>
-      <w:r>
-        <w:t xml:space="preserve"> </w:t>
-      </w:r>
-      <w:r>
         <w:t xml:space="preserve">from</w:t>
       </w:r>
       <w:r>
@@ -742,7 +1936,7 @@
         <w:t xml:space="preserve"> </w:t>
       </w:r>
       <w:r>
-        <w:t xml:space="preserve">moves them to the paths in this table and sets the modes. The script reads the properties file from</w:t>
+        <w:t xml:space="preserve">moves them to the paths in this table and sets the file modes. The script reads the properties file from</w:t>
       </w:r>
       <w:r>
         <w:t xml:space="preserve"> </w:t>
@@ -1138,11 +2332,11 @@
       <w:pPr>
         <w:pStyle w:val="Heading2"/>
       </w:pPr>
-      <w:bookmarkStart w:id="25" w:name="tnms-client-login"/>
+      <w:bookmarkStart w:id="26" w:name="tnms-client-login"/>
       <w:r>
         <w:t xml:space="preserve">TNMS client login</w:t>
       </w:r>
-      <w:bookmarkEnd w:id="25"/>
+      <w:bookmarkEnd w:id="26"/>
     </w:p>
     <w:p>
       <w:pPr>
@@ -1403,11 +2597,11 @@
       <w:pPr>
         <w:pStyle w:val="Heading2"/>
       </w:pPr>
-      <w:bookmarkStart w:id="26" w:name="values-used-on-this-host"/>
+      <w:bookmarkStart w:id="27" w:name="values-used-on-this-host"/>
       <w:r>
         <w:t xml:space="preserve">Values used on this host</w:t>
       </w:r>
-      <w:bookmarkEnd w:id="26"/>
+      <w:bookmarkEnd w:id="27"/>
     </w:p>
     <w:p>
       <w:pPr>
@@ -2415,11 +3609,11 @@
       <w:pPr>
         <w:pStyle w:val="Heading2"/>
       </w:pPr>
-      <w:bookmarkStart w:id="27" w:name="confirm-the-install-files"/>
+      <w:bookmarkStart w:id="28" w:name="confirm-the-install-files"/>
       <w:r>
         <w:t xml:space="preserve">Confirm the install files</w:t>
       </w:r>
-      <w:bookmarkEnd w:id="27"/>
+      <w:bookmarkEnd w:id="28"/>
     </w:p>
     <w:p>
       <w:pPr>
@@ -2460,7 +3654,7 @@
       <w:pPr>
         <w:pStyle w:val="Heading3"/>
       </w:pPr>
-      <w:bookmarkStart w:id="28" w:name="confirm-tmp-and-opt"/>
+      <w:bookmarkStart w:id="29" w:name="confirm-tmp-and-opt"/>
       <w:r>
         <w:t xml:space="preserve">Confirm</w:t>
       </w:r>
@@ -2488,7 +3682,7 @@
         </w:rPr>
         <w:t xml:space="preserve">/opt</w:t>
       </w:r>
-      <w:bookmarkEnd w:id="28"/>
+      <w:bookmarkEnd w:id="29"/>
     </w:p>
     <w:p>
       <w:pPr>
@@ -2853,11 +4047,11 @@
       <w:pPr>
         <w:pStyle w:val="Heading3"/>
       </w:pPr>
-      <w:bookmarkStart w:id="29" w:name="move-the-files"/>
+      <w:bookmarkStart w:id="30" w:name="move-the-files"/>
       <w:r>
         <w:t xml:space="preserve">Move the files</w:t>
       </w:r>
-      <w:bookmarkEnd w:id="29"/>
+      <w:bookmarkEnd w:id="30"/>
     </w:p>
     <w:p>
       <w:pPr>
@@ -2906,7 +4100,7 @@
         <w:rPr>
           <w:rStyle w:val="NormalTok"/>
         </w:rPr>
-        <w:t xml:space="preserve"> -d -o root -g root /opt/tnms-install /opt/tnms-install/resources</w:t>
+        <w:t xml:space="preserve"> -d -o root -g azureuser -m 750 /opt/tnms-install /opt/tnms-install/resources</w:t>
       </w:r>
       <w:r>
         <w:br w:type="textWrapping"/>
@@ -3083,11 +4277,11 @@
       <w:pPr>
         <w:pStyle w:val="Heading3"/>
       </w:pPr>
-      <w:bookmarkStart w:id="30" w:name="set-the-permissions"/>
+      <w:bookmarkStart w:id="31" w:name="set-the-permissions"/>
       <w:r>
         <w:t xml:space="preserve">Set the permissions</w:t>
       </w:r>
-      <w:bookmarkEnd w:id="30"/>
+      <w:bookmarkEnd w:id="31"/>
     </w:p>
     <w:p>
       <w:pPr>
@@ -3472,11 +4666,11 @@
       <w:pPr>
         <w:pStyle w:val="Heading3"/>
       </w:pPr>
-      <w:bookmarkStart w:id="31" w:name="confirm-the-layout"/>
+      <w:bookmarkStart w:id="32" w:name="confirm-the-layout"/>
       <w:r>
         <w:t xml:space="preserve">Confirm the layout</w:t>
       </w:r>
-      <w:bookmarkEnd w:id="31"/>
+      <w:bookmarkEnd w:id="32"/>
     </w:p>
     <w:p>
       <w:pPr>
@@ -3803,11 +4997,11 @@
       <w:pPr>
         <w:pStyle w:val="Heading2"/>
       </w:pPr>
-      <w:bookmarkStart w:id="32" w:name="hostname-hosts-locale"/>
+      <w:bookmarkStart w:id="33" w:name="hostname-hosts-locale"/>
       <w:r>
         <w:t xml:space="preserve">1. Hostname, hosts, locale</w:t>
       </w:r>
-      <w:bookmarkEnd w:id="32"/>
+      <w:bookmarkEnd w:id="33"/>
     </w:p>
     <w:p>
       <w:pPr>
@@ -4235,11 +5429,11 @@
       <w:pPr>
         <w:pStyle w:val="Heading2"/>
       </w:pPr>
-      <w:bookmarkStart w:id="33" w:name="packages"/>
+      <w:bookmarkStart w:id="34" w:name="packages"/>
       <w:r>
         <w:t xml:space="preserve">2. Packages</w:t>
       </w:r>
-      <w:bookmarkEnd w:id="33"/>
+      <w:bookmarkEnd w:id="34"/>
     </w:p>
     <w:p>
       <w:pPr>
@@ -4525,11 +5719,11 @@
       <w:pPr>
         <w:pStyle w:val="Heading2"/>
       </w:pPr>
-      <w:bookmarkStart w:id="34" w:name="kernel-settings-and-the-firewall"/>
+      <w:bookmarkStart w:id="35" w:name="kernel-settings-and-the-firewall"/>
       <w:r>
         <w:t xml:space="preserve">3. Kernel settings and the firewall</w:t>
       </w:r>
-      <w:bookmarkEnd w:id="34"/>
+      <w:bookmarkEnd w:id="35"/>
     </w:p>
     <w:p>
       <w:pPr>
@@ -4941,11 +6135,11 @@
       <w:pPr>
         <w:pStyle w:val="Heading2"/>
       </w:pPr>
-      <w:bookmarkStart w:id="35" w:name="disk-space-the-installers-actually-check"/>
+      <w:bookmarkStart w:id="36" w:name="disk-space-the-installers-actually-check"/>
       <w:r>
         <w:t xml:space="preserve">4. Disk space the installers actually check</w:t>
       </w:r>
-      <w:bookmarkEnd w:id="35"/>
+      <w:bookmarkEnd w:id="36"/>
     </w:p>
     <w:p>
       <w:pPr>
@@ -6030,11 +7224,11 @@
       <w:pPr>
         <w:pStyle w:val="Heading2"/>
       </w:pPr>
-      <w:bookmarkStart w:id="36" w:name="confirm-the-files-before-unpacking"/>
+      <w:bookmarkStart w:id="37" w:name="confirm-the-files-before-unpacking"/>
       <w:r>
         <w:t xml:space="preserve">Confirm the files before unpacking</w:t>
       </w:r>
-      <w:bookmarkEnd w:id="36"/>
+      <w:bookmarkEnd w:id="37"/>
     </w:p>
     <w:p>
       <w:pPr>
@@ -6303,11 +7497,11 @@
       <w:pPr>
         <w:pStyle w:val="Heading2"/>
       </w:pPr>
-      <w:bookmarkStart w:id="37" w:name="unpack-the-media"/>
+      <w:bookmarkStart w:id="38" w:name="unpack-the-media"/>
       <w:r>
         <w:t xml:space="preserve">5. Unpack the media</w:t>
       </w:r>
-      <w:bookmarkEnd w:id="37"/>
+      <w:bookmarkEnd w:id="38"/>
     </w:p>
     <w:p>
       <w:pPr>
@@ -7252,11 +8446,11 @@
       <w:pPr>
         <w:pStyle w:val="Heading2"/>
       </w:pPr>
-      <w:bookmarkStart w:id="38" w:name="database-passwords"/>
+      <w:bookmarkStart w:id="39" w:name="database-passwords"/>
       <w:r>
         <w:t xml:space="preserve">6. Database passwords</w:t>
       </w:r>
-      <w:bookmarkEnd w:id="38"/>
+      <w:bookmarkEnd w:id="39"/>
     </w:p>
     <w:p>
       <w:pPr>
@@ -7582,11 +8776,11 @@
       <w:pPr>
         <w:pStyle w:val="Heading2"/>
       </w:pPr>
-      <w:bookmarkStart w:id="39" w:name="install-oracle-19c"/>
+      <w:bookmarkStart w:id="40" w:name="install-oracle-19c"/>
       <w:r>
         <w:t xml:space="preserve">7. Install Oracle 19c</w:t>
       </w:r>
-      <w:bookmarkEnd w:id="39"/>
+      <w:bookmarkEnd w:id="40"/>
     </w:p>
     <w:p>
       <w:pPr>
@@ -8662,11 +9856,11 @@
       <w:pPr>
         <w:pStyle w:val="Heading2"/>
       </w:pPr>
-      <w:bookmarkStart w:id="40" w:name="memory-check-before-the-tnms-wizard"/>
+      <w:bookmarkStart w:id="41" w:name="memory-check-before-the-tnms-wizard"/>
       <w:r>
         <w:t xml:space="preserve">8. Memory check before the TNMS wizard</w:t>
       </w:r>
-      <w:bookmarkEnd w:id="40"/>
+      <w:bookmarkEnd w:id="41"/>
     </w:p>
     <w:p>
       <w:pPr>
@@ -8740,11 +9934,11 @@
       <w:pPr>
         <w:pStyle w:val="Heading2"/>
       </w:pPr>
-      <w:bookmarkStart w:id="41" w:name="install-tnms-server-and-mediation"/>
+      <w:bookmarkStart w:id="42" w:name="install-tnms-server-and-mediation"/>
       <w:r>
         <w:t xml:space="preserve">9. Install TNMS Server and Mediation</w:t>
       </w:r>
-      <w:bookmarkEnd w:id="41"/>
+      <w:bookmarkEnd w:id="42"/>
     </w:p>
     <w:p>
       <w:pPr>
@@ -10660,11 +11854,11 @@
       <w:pPr>
         <w:pStyle w:val="Heading2"/>
       </w:pPr>
-      <w:bookmarkStart w:id="42" w:name="put-lsmem-back"/>
+      <w:bookmarkStart w:id="43" w:name="put-lsmem-back"/>
       <w:r>
         <w:t xml:space="preserve">10. Put lsmem back</w:t>
       </w:r>
-      <w:bookmarkEnd w:id="42"/>
+      <w:bookmarkEnd w:id="43"/>
     </w:p>
     <w:p>
       <w:pPr>
@@ -10841,11 +12035,11 @@
       <w:pPr>
         <w:pStyle w:val="Heading2"/>
       </w:pPr>
-      <w:bookmarkStart w:id="43" w:name="sftp-account"/>
+      <w:bookmarkStart w:id="44" w:name="sftp-account"/>
       <w:r>
         <w:t xml:space="preserve">11. SFTP account</w:t>
       </w:r>
-      <w:bookmarkEnd w:id="43"/>
+      <w:bookmarkEnd w:id="44"/>
     </w:p>
     <w:p>
       <w:pPr>
@@ -12096,11 +13290,11 @@
       <w:pPr>
         <w:pStyle w:val="Heading2"/>
       </w:pPr>
-      <w:bookmarkStart w:id="44" w:name="sudo-for-the-tnms-user"/>
+      <w:bookmarkStart w:id="45" w:name="sudo-for-the-tnms-user"/>
       <w:r>
         <w:t xml:space="preserve">12. sudo for the tnms user</w:t>
       </w:r>
-      <w:bookmarkEnd w:id="44"/>
+      <w:bookmarkEnd w:id="45"/>
     </w:p>
     <w:p>
       <w:pPr>
@@ -12358,11 +13552,11 @@
       <w:pPr>
         <w:pStyle w:val="Heading2"/>
       </w:pPr>
-      <w:bookmarkStart w:id="45" w:name="start-the-service"/>
+      <w:bookmarkStart w:id="46" w:name="start-the-service"/>
       <w:r>
         <w:t xml:space="preserve">13. Start the service</w:t>
       </w:r>
-      <w:bookmarkEnd w:id="45"/>
+      <w:bookmarkEnd w:id="46"/>
     </w:p>
     <w:p>
       <w:pPr>
@@ -13124,11 +14318,11 @@
       <w:pPr>
         <w:pStyle w:val="Heading2"/>
       </w:pPr>
-      <w:bookmarkStart w:id="46" w:name="checks"/>
+      <w:bookmarkStart w:id="47" w:name="checks"/>
       <w:r>
         <w:t xml:space="preserve">14. Checks</w:t>
       </w:r>
-      <w:bookmarkEnd w:id="46"/>
+      <w:bookmarkEnd w:id="47"/>
     </w:p>
     <w:p>
       <w:pPr>
@@ -13729,11 +14923,11 @@
       <w:pPr>
         <w:pStyle w:val="Heading2"/>
       </w:pPr>
-      <w:bookmarkStart w:id="47" w:name="what-happened-on-this-host"/>
+      <w:bookmarkStart w:id="48" w:name="what-happened-on-this-host"/>
       <w:r>
         <w:t xml:space="preserve">What happened on this host</w:t>
       </w:r>
-      <w:bookmarkEnd w:id="47"/>
+      <w:bookmarkEnd w:id="48"/>
     </w:p>
     <w:p>
       <w:pPr>
@@ -13804,11 +14998,11 @@
       <w:pPr>
         <w:pStyle w:val="Heading2"/>
       </w:pPr>
-      <w:bookmarkStart w:id="48" w:name="manual-step-9-two-ssh-sessions"/>
+      <w:bookmarkStart w:id="49" w:name="manual-step-9-two-ssh-sessions"/>
       <w:r>
         <w:t xml:space="preserve">Manual step 9: two SSH sessions</w:t>
       </w:r>
-      <w:bookmarkEnd w:id="48"/>
+      <w:bookmarkEnd w:id="49"/>
     </w:p>
     <w:p>
       <w:pPr>
@@ -16745,7 +17939,7 @@
     </w:lvl>
   </w:abstractNum>
   <w:abstractNum w:abstractNumId="990">
-    <w:nsid w:val="e99d63a1"/>
+    <w:nsid w:val="bb4af390"/>
     <w:multiLevelType w:val="multilevel"/>
     <w:lvl w:ilvl="0">
       <w:numFmt w:val="bullet"/>
@@ -16848,7 +18042,7 @@
     </w:lvl>
   </w:abstractNum>
   <w:abstractNum w:abstractNumId="991">
-    <w:nsid w:val="64fb3f26"/>
+    <w:nsid w:val="a6a8cf6a"/>
     <w:multiLevelType w:val="multilevel"/>
     <w:lvl w:ilvl="0">
       <w:numFmt w:val="bullet"/>
@@ -16951,7 +18145,7 @@
     </w:lvl>
   </w:abstractNum>
   <w:abstractNum w:abstractNumId="99411">
-    <w:nsid w:val="99ee2a5f"/>
+    <w:nsid w:val="6b9bba4d"/>
     <w:multiLevelType w:val="multilevel"/>
     <w:lvl w:ilvl="0">
       <w:start w:val="1"/>
@@ -17063,7 +18257,7 @@
     </w:lvl>
   </w:abstractNum>
   <w:abstractNum w:abstractNumId="99412">
-    <w:nsid w:val="e1aa21b7"/>
+    <w:nsid w:val="3357b1fc"/>
     <w:multiLevelType w:val="multilevel"/>
     <w:lvl w:ilvl="0">
       <w:start w:val="2"/>
@@ -17175,7 +18369,7 @@
     </w:lvl>
   </w:abstractNum>
   <w:abstractNum w:abstractNumId="99413">
-    <w:nsid w:val="65f75af5"/>
+    <w:nsid w:val="a7a4eb39"/>
     <w:multiLevelType w:val="multilevel"/>
     <w:lvl w:ilvl="0">
       <w:start w:val="3"/>

</xml_diff>

<commit_message>
Break the new directory commands at argument boundaries.
A wrapped Word line was splitting /opt/tnms-install in the middle of the path.
</commit_message>
<xml_diff>
--- a/docs/customer/TNMS-9.1-RHEL8-install-without-repo.docx
+++ b/docs/customer/TNMS-9.1-RHEL8-install-without-repo.docx
@@ -1633,13 +1633,22 @@
         <w:rPr>
           <w:rStyle w:val="NormalTok"/>
         </w:rPr>
-        <w:t xml:space="preserve"> -d -o root -g root -m 755 /opt/oracle /opt/nokia /opt/tnms-data</w:t>
+        <w:t xml:space="preserve"> -d -o root -g root -m 755 \</w:t>
       </w:r>
       <w:r>
         <w:br w:type="textWrapping"/>
       </w:r>
       <w:r>
         <w:rPr>
+          <w:rStyle w:val="NormalTok"/>
+        </w:rPr>
+        <w:t xml:space="preserve">  /opt/oracle /opt/nokia /opt/tnms-data</w:t>
+      </w:r>
+      <w:r>
+        <w:br w:type="textWrapping"/>
+      </w:r>
+      <w:r>
+        <w:rPr>
           <w:rStyle w:val="FunctionTok"/>
         </w:rPr>
         <w:t xml:space="preserve">install</w:t>
@@ -1648,13 +1657,22 @@
         <w:rPr>
           <w:rStyle w:val="NormalTok"/>
         </w:rPr>
-        <w:t xml:space="preserve"> -d -o root -g root -m 755 /opt/oradata/ora1 /opt/oradata/ora2 /opt/oradata/ora3</w:t>
+        <w:t xml:space="preserve"> -d -o root -g root -m 755 \</w:t>
       </w:r>
       <w:r>
         <w:br w:type="textWrapping"/>
       </w:r>
       <w:r>
         <w:rPr>
+          <w:rStyle w:val="NormalTok"/>
+        </w:rPr>
+        <w:t xml:space="preserve">  /opt/oradata/ora1 /opt/oradata/ora2 /opt/oradata/ora3</w:t>
+      </w:r>
+      <w:r>
+        <w:br w:type="textWrapping"/>
+      </w:r>
+      <w:r>
+        <w:rPr>
           <w:rStyle w:val="FunctionTok"/>
         </w:rPr>
         <w:t xml:space="preserve">install</w:t>
@@ -1663,13 +1681,22 @@
         <w:rPr>
           <w:rStyle w:val="NormalTok"/>
         </w:rPr>
-        <w:t xml:space="preserve"> -d -o root -g azureuser -m 750 /opt/tnms-install /opt/tnms-install/resources</w:t>
+        <w:t xml:space="preserve"> -d -o root -g azureuser -m 750 \</w:t>
       </w:r>
       <w:r>
         <w:br w:type="textWrapping"/>
       </w:r>
       <w:r>
         <w:rPr>
+          <w:rStyle w:val="NormalTok"/>
+        </w:rPr>
+        <w:t xml:space="preserve">  /opt/tnms-install /opt/tnms-install/resources</w:t>
+      </w:r>
+      <w:r>
+        <w:br w:type="textWrapping"/>
+      </w:r>
+      <w:r>
+        <w:rPr>
           <w:rStyle w:val="ExtensionTok"/>
         </w:rPr>
         <w:t xml:space="preserve">restorecon</w:t>
@@ -1678,7 +1705,16 @@
         <w:rPr>
           <w:rStyle w:val="NormalTok"/>
         </w:rPr>
-        <w:t xml:space="preserve"> -RF /opt/oracle /opt/nokia /opt/tnms-data /opt/oradata /opt/tnms-install</w:t>
+        <w:t xml:space="preserve"> -RF \</w:t>
+      </w:r>
+      <w:r>
+        <w:br w:type="textWrapping"/>
+      </w:r>
+      <w:r>
+        <w:rPr>
+          <w:rStyle w:val="NormalTok"/>
+        </w:rPr>
+        <w:t xml:space="preserve">  /opt/oracle /opt/nokia /opt/tnms-data /opt/oradata /opt/tnms-install</w:t>
       </w:r>
     </w:p>
     <w:p>
@@ -17939,7 +17975,7 @@
     </w:lvl>
   </w:abstractNum>
   <w:abstractNum w:abstractNumId="990">
-    <w:nsid w:val="bb4af390"/>
+    <w:nsid w:val="20002323"/>
     <w:multiLevelType w:val="multilevel"/>
     <w:lvl w:ilvl="0">
       <w:numFmt w:val="bullet"/>
@@ -18042,7 +18078,7 @@
     </w:lvl>
   </w:abstractNum>
   <w:abstractNum w:abstractNumId="991">
-    <w:nsid w:val="a6a8cf6a"/>
+    <w:nsid w:val="fb5dfefd"/>
     <w:multiLevelType w:val="multilevel"/>
     <w:lvl w:ilvl="0">
       <w:numFmt w:val="bullet"/>
@@ -18145,7 +18181,7 @@
     </w:lvl>
   </w:abstractNum>
   <w:abstractNum w:abstractNumId="99411">
-    <w:nsid w:val="6b9bba4d"/>
+    <w:nsid w:val="c050e9e1"/>
     <w:multiLevelType w:val="multilevel"/>
     <w:lvl w:ilvl="0">
       <w:start w:val="1"/>
@@ -18257,7 +18293,7 @@
     </w:lvl>
   </w:abstractNum>
   <w:abstractNum w:abstractNumId="99412">
-    <w:nsid w:val="3357b1fc"/>
+    <w:nsid w:val="980cfe1d"/>
     <w:multiLevelType w:val="multilevel"/>
     <w:lvl w:ilvl="0">
       <w:start w:val="2"/>
@@ -18369,7 +18405,7 @@
     </w:lvl>
   </w:abstractNum>
   <w:abstractNum w:abstractNumId="99413">
-    <w:nsid w:val="a7a4eb39"/>
+    <w:nsid w:val="fc5a1acc"/>
     <w:multiLevelType w:val="multilevel"/>
     <w:lvl w:ilvl="0">
       <w:start w:val="3"/>

</xml_diff>

<commit_message>
Scan the host and prepare the TNMS disk after the operator agrees.
</commit_message>
<xml_diff>
--- a/docs/customer/TNMS-9.1-RHEL8-install-without-repo.docx
+++ b/docs/customer/TNMS-9.1-RHEL8-install-without-repo.docx
@@ -2,7 +2,7 @@
 <file path=word/document.xml><?xml version="1.0" encoding="utf-8"?>
 <w:document xmlns:w="http://schemas.openxmlformats.org/wordprocessingml/2006/main" xmlns:m="http://schemas.openxmlformats.org/officeDocument/2006/math" xmlns:r="http://schemas.openxmlformats.org/officeDocument/2006/relationships" xmlns:o="urn:schemas-microsoft-com:office:office" xmlns:v="urn:schemas-microsoft-com:vml" xmlns:w10="urn:schemas-microsoft-com:office:word" xmlns:a="http://schemas.openxmlformats.org/drawingml/2006/main" xmlns:pic="http://schemas.openxmlformats.org/drawingml/2006/picture" xmlns:wp="http://schemas.openxmlformats.org/drawingml/2006/wordprocessingDrawing">
   <w:body>
-    <w:bookmarkStart w:id="43" w:name="X2f14c3fd092e3f17f4c02f3f094bc030b7a1338"/>
+    <w:bookmarkStart w:id="45" w:name="X2f14c3fd092e3f17f4c02f3f094bc030b7a1338"/>
     <w:p>
       <w:pPr>
         <w:pStyle w:val="Heading1"/>
@@ -16,11 +16,13 @@
         <w:pStyle w:val="FirstParagraph"/>
       </w:pPr>
       <w:r>
-        <w:t xml:space="preserve">Run this on a fresh Red Hat Enterprise Linux 8 server, as root, after</w:t>
-      </w:r>
-      <w:r>
-        <w:t xml:space="preserve"> </w:t>
-      </w:r>
+        <w:t xml:space="preserve">Run this on a fresh Red Hat Enterprise Linux 8 server, as root. The Makefile scans the host, asks before it changes a disk, and then installs Oracle 19c and TNMS 9.1.0.593.0 Server and Mediation.</w:t>
+      </w:r>
+    </w:p>
+    <w:p>
+      <w:pPr>
+        <w:pStyle w:val="BodyText"/>
+      </w:pPr>
       <w:hyperlink r:id="rId20">
         <w:r>
           <w:rPr>
@@ -30,19 +32,25 @@
         </w:r>
       </w:hyperlink>
       <w:r>
-        <w:t xml:space="preserve">. That guide mounts the 1 TB disk on</w:t>
-      </w:r>
-      <w:r>
-        <w:t xml:space="preserve"> </w:t>
-      </w:r>
-      <w:r>
-        <w:rPr>
-          <w:rStyle w:val="VerbatimChar"/>
-        </w:rPr>
-        <w:t xml:space="preserve">/opt</w:t>
-      </w:r>
-      <w:r>
-        <w:t xml:space="preserve">. This one installs Oracle 19c and TNMS 9.1.0.593.0 Server and Mediation.</w:t>
+        <w:t xml:space="preserve"> </w:t>
+      </w:r>
+      <w:r>
+        <w:t xml:space="preserve">is the picture of the disk layout.</w:t>
+      </w:r>
+      <w:r>
+        <w:t xml:space="preserve"> </w:t>
+      </w:r>
+      <w:r>
+        <w:rPr>
+          <w:rStyle w:val="VerbatimChar"/>
+        </w:rPr>
+        <w:t xml:space="preserve">make prepare</w:t>
+      </w:r>
+      <w:r>
+        <w:t xml:space="preserve"> </w:t>
+      </w:r>
+      <w:r>
+        <w:t xml:space="preserve">applies sections 2 through 4 of that page.</w:t>
       </w:r>
     </w:p>
     <w:p>
@@ -494,6 +502,84 @@
         <w:rPr>
           <w:rStyle w:val="NormalTok"/>
         </w:rPr>
+        <w:t xml:space="preserve"> Makefile scan</w:t>
+      </w:r>
+      <w:r>
+        <w:br/>
+      </w:r>
+      <w:r>
+        <w:rPr>
+          <w:rStyle w:val="FunctionTok"/>
+        </w:rPr>
+        <w:t xml:space="preserve">make</w:t>
+      </w:r>
+      <w:r>
+        <w:rPr>
+          <w:rStyle w:val="NormalTok"/>
+        </w:rPr>
+        <w:t xml:space="preserve"> </w:t>
+      </w:r>
+      <w:r>
+        <w:rPr>
+          <w:rStyle w:val="AttributeTok"/>
+        </w:rPr>
+        <w:t xml:space="preserve">-C</w:t>
+      </w:r>
+      <w:r>
+        <w:rPr>
+          <w:rStyle w:val="NormalTok"/>
+        </w:rPr>
+        <w:t xml:space="preserve"> /tmp </w:t>
+      </w:r>
+      <w:r>
+        <w:rPr>
+          <w:rStyle w:val="AttributeTok"/>
+        </w:rPr>
+        <w:t xml:space="preserve">-f</w:t>
+      </w:r>
+      <w:r>
+        <w:rPr>
+          <w:rStyle w:val="NormalTok"/>
+        </w:rPr>
+        <w:t xml:space="preserve"> Makefile prepare</w:t>
+      </w:r>
+      <w:r>
+        <w:br/>
+      </w:r>
+      <w:r>
+        <w:rPr>
+          <w:rStyle w:val="FunctionTok"/>
+        </w:rPr>
+        <w:t xml:space="preserve">make</w:t>
+      </w:r>
+      <w:r>
+        <w:rPr>
+          <w:rStyle w:val="NormalTok"/>
+        </w:rPr>
+        <w:t xml:space="preserve"> </w:t>
+      </w:r>
+      <w:r>
+        <w:rPr>
+          <w:rStyle w:val="AttributeTok"/>
+        </w:rPr>
+        <w:t xml:space="preserve">-C</w:t>
+      </w:r>
+      <w:r>
+        <w:rPr>
+          <w:rStyle w:val="NormalTok"/>
+        </w:rPr>
+        <w:t xml:space="preserve"> /tmp </w:t>
+      </w:r>
+      <w:r>
+        <w:rPr>
+          <w:rStyle w:val="AttributeTok"/>
+        </w:rPr>
+        <w:t xml:space="preserve">-f</w:t>
+      </w:r>
+      <w:r>
+        <w:rPr>
+          <w:rStyle w:val="NormalTok"/>
+        </w:rPr>
         <w:t xml:space="preserve"> Makefile</w:t>
       </w:r>
     </w:p>
@@ -505,13 +591,206 @@
         <w:rPr>
           <w:rStyle w:val="VerbatimChar"/>
         </w:rPr>
+        <w:t xml:space="preserve">make scan</w:t>
+      </w:r>
+      <w:r>
+        <w:t xml:space="preserve"> </w:t>
+      </w:r>
+      <w:r>
+        <w:t xml:space="preserve">only reads. It prints the release, the disks, the hostname, and which of the six install files are in</w:t>
+      </w:r>
+      <w:r>
+        <w:t xml:space="preserve"> </w:t>
+      </w:r>
+      <w:r>
+        <w:rPr>
+          <w:rStyle w:val="VerbatimChar"/>
+        </w:rPr>
+        <w:t xml:space="preserve">/tmp</w:t>
+      </w:r>
+      <w:r>
+        <w:t xml:space="preserve">. On a terminal it asks for the data disk, whether to grow</w:t>
+      </w:r>
+      <w:r>
+        <w:t xml:space="preserve"> </w:t>
+      </w:r>
+      <w:r>
+        <w:rPr>
+          <w:rStyle w:val="VerbatimChar"/>
+        </w:rPr>
+        <w:t xml:space="preserve">/</w:t>
+      </w:r>
+      <w:r>
+        <w:t xml:space="preserve"> </w:t>
+      </w:r>
+      <w:r>
+        <w:t xml:space="preserve">and</w:t>
+      </w:r>
+      <w:r>
+        <w:t xml:space="preserve"> </w:t>
+      </w:r>
+      <w:r>
+        <w:rPr>
+          <w:rStyle w:val="VerbatimChar"/>
+        </w:rPr>
+        <w:t xml:space="preserve">/tmp</w:t>
+      </w:r>
+      <w:r>
+        <w:t xml:space="preserve">, the short hostname, and the admin group. It asks for an IPv4 address only when detection fails or more than one global address exists. The last question is whether to write</w:t>
+      </w:r>
+      <w:r>
+        <w:t xml:space="preserve"> </w:t>
+      </w:r>
+      <w:r>
+        <w:rPr>
+          <w:rStyle w:val="VerbatimChar"/>
+        </w:rPr>
+        <w:t xml:space="preserve">/root/tnms-install.answers</w:t>
+      </w:r>
+      <w:r>
+        <w:t xml:space="preserve"> </w:t>
+      </w:r>
+      <w:r>
+        <w:t xml:space="preserve">at mode 600.</w:t>
+      </w:r>
+      <w:r>
+        <w:t xml:space="preserve"> </w:t>
+      </w:r>
+      <w:r>
+        <w:rPr>
+          <w:rStyle w:val="VerbatimChar"/>
+        </w:rPr>
+        <w:t xml:space="preserve">CONFIRM=yes</w:t>
+      </w:r>
+      <w:r>
+        <w:t xml:space="preserve"> </w:t>
+      </w:r>
+      <w:r>
+        <w:t xml:space="preserve">is written only after that yes. Declining writes nothing. Without a terminal, scan prints the same report and the lines to put in that file, then exits 2.</w:t>
+      </w:r>
+    </w:p>
+    <w:p>
+      <w:pPr>
+        <w:pStyle w:val="BodyText"/>
+      </w:pPr>
+      <w:r>
+        <w:rPr>
+          <w:rStyle w:val="VerbatimChar"/>
+        </w:rPr>
+        <w:t xml:space="preserve">make prepare</w:t>
+      </w:r>
+      <w:r>
+        <w:t xml:space="preserve"> </w:t>
+      </w:r>
+      <w:r>
+        <w:t xml:space="preserve">reads that file and applies the disk layout: grow</w:t>
+      </w:r>
+      <w:r>
+        <w:t xml:space="preserve"> </w:t>
+      </w:r>
+      <w:r>
+        <w:rPr>
+          <w:rStyle w:val="VerbatimChar"/>
+        </w:rPr>
+        <w:t xml:space="preserve">/</w:t>
+      </w:r>
+      <w:r>
+        <w:t xml:space="preserve"> </w:t>
+      </w:r>
+      <w:r>
+        <w:t xml:space="preserve">and</w:t>
+      </w:r>
+      <w:r>
+        <w:t xml:space="preserve"> </w:t>
+      </w:r>
+      <w:r>
+        <w:rPr>
+          <w:rStyle w:val="VerbatimChar"/>
+        </w:rPr>
+        <w:t xml:space="preserve">/tmp</w:t>
+      </w:r>
+      <w:r>
+        <w:t xml:space="preserve">, partition the named data disk, mount it on</w:t>
+      </w:r>
+      <w:r>
+        <w:t xml:space="preserve"> </w:t>
+      </w:r>
+      <w:r>
+        <w:rPr>
+          <w:rStyle w:val="VerbatimChar"/>
+        </w:rPr>
+        <w:t xml:space="preserve">/opt</w:t>
+      </w:r>
+      <w:r>
+        <w:t xml:space="preserve">, bind</w:t>
+      </w:r>
+      <w:r>
+        <w:t xml:space="preserve"> </w:t>
+      </w:r>
+      <w:r>
+        <w:rPr>
+          <w:rStyle w:val="VerbatimChar"/>
+        </w:rPr>
+        <w:t xml:space="preserve">/nokia</w:t>
+      </w:r>
+      <w:r>
+        <w:t xml:space="preserve"> </w:t>
+      </w:r>
+      <w:r>
+        <w:t xml:space="preserve">and</w:t>
+      </w:r>
+      <w:r>
+        <w:t xml:space="preserve"> </w:t>
+      </w:r>
+      <w:r>
+        <w:rPr>
+          <w:rStyle w:val="VerbatimChar"/>
+        </w:rPr>
+        <w:t xml:space="preserve">/oradata</w:t>
+      </w:r>
+      <w:r>
+        <w:t xml:space="preserve">, create the 18 GB swap file, write</w:t>
+      </w:r>
+      <w:r>
+        <w:t xml:space="preserve"> </w:t>
+      </w:r>
+      <w:r>
+        <w:rPr>
+          <w:rStyle w:val="VerbatimChar"/>
+        </w:rPr>
+        <w:t xml:space="preserve">/etc/fstab</w:t>
+      </w:r>
+      <w:r>
+        <w:t xml:space="preserve">, and restore SELinux labels. It refuses to run without</w:t>
+      </w:r>
+      <w:r>
+        <w:t xml:space="preserve"> </w:t>
+      </w:r>
+      <w:r>
+        <w:rPr>
+          <w:rStyle w:val="VerbatimChar"/>
+        </w:rPr>
+        <w:t xml:space="preserve">CONFIRM=yes</w:t>
+      </w:r>
+      <w:r>
+        <w:t xml:space="preserve">. When the layout already matches, it stamps and skips. It does not ask again and it does not repartition.</w:t>
+      </w:r>
+    </w:p>
+    <w:p>
+      <w:pPr>
+        <w:pStyle w:val="BodyText"/>
+      </w:pPr>
+      <w:r>
+        <w:rPr>
+          <w:rStyle w:val="VerbatimChar"/>
+        </w:rPr>
         <w:t xml:space="preserve">make</w:t>
       </w:r>
       <w:r>
         <w:t xml:space="preserve"> </w:t>
       </w:r>
       <w:r>
-        <w:t xml:space="preserve">reads the file before</w:t>
+        <w:t xml:space="preserve">then installs Oracle and TNMS. It reads this file before</w:t>
       </w:r>
       <w:r>
         <w:t xml:space="preserve"> </w:t>
@@ -582,7 +861,7 @@
         <w:t xml:space="preserve"> </w:t>
       </w:r>
       <w:r>
-        <w:t xml:space="preserve">only reads the host. It prints</w:t>
+        <w:t xml:space="preserve">only reads the host. It prints the scan facts, says whether prepare is satisfied, and prints</w:t>
       </w:r>
       <w:r>
         <w:t xml:space="preserve"> </w:t>
@@ -612,7 +891,7 @@
         <w:t xml:space="preserve"> </w:t>
       </w:r>
       <w:r>
-        <w:t xml:space="preserve">for each condition and does not install, restart, or write a stamp. Stamps live in</w:t>
+        <w:t xml:space="preserve">for each condition. It does not install, restart, or write a stamp. Stamps live in</w:t>
       </w:r>
       <w:r>
         <w:t xml:space="preserve"> </w:t>
@@ -688,7 +967,7 @@
         <w:pStyle w:val="Compact"/>
       </w:pPr>
       <w:r>
-        <w:t xml:space="preserve">The disk layout in</w:t>
+        <w:t xml:space="preserve">The VS Code symlink in</w:t>
       </w:r>
       <w:r>
         <w:t xml:space="preserve"> </w:t>
@@ -702,49 +981,67 @@
         </w:r>
       </w:hyperlink>
       <w:r>
-        <w:t xml:space="preserve">. The first recipe stops unless</w:t>
-      </w:r>
-      <w:r>
-        <w:t xml:space="preserve"> </w:t>
-      </w:r>
-      <w:r>
-        <w:rPr>
-          <w:rStyle w:val="VerbatimChar"/>
-        </w:rPr>
-        <w:t xml:space="preserve">findmnt</w:t>
-      </w:r>
-      <w:r>
-        <w:t xml:space="preserve"> </w:t>
-      </w:r>
-      <w:r>
-        <w:t xml:space="preserve">shows</w:t>
-      </w:r>
-      <w:r>
-        <w:t xml:space="preserve"> </w:t>
-      </w:r>
-      <w:r>
-        <w:rPr>
-          <w:rStyle w:val="VerbatimChar"/>
-        </w:rPr>
-        <w:t xml:space="preserve">/opt</w:t>
-      </w:r>
-      <w:r>
-        <w:t xml:space="preserve"> </w:t>
-      </w:r>
-      <w:r>
-        <w:t xml:space="preserve">on</w:t>
-      </w:r>
-      <w:r>
-        <w:t xml:space="preserve"> </w:t>
-      </w:r>
-      <w:r>
-        <w:rPr>
-          <w:rStyle w:val="VerbatimChar"/>
-        </w:rPr>
-        <w:t xml:space="preserve">/dev/mapper/datavg-optlv</w:t>
-      </w:r>
-      <w:r>
-        <w:t xml:space="preserve">.</w:t>
+        <w:t xml:space="preserve"> </w:t>
+      </w:r>
+      <w:r>
+        <w:t xml:space="preserve">section 6. Scan mentions it when</w:t>
+      </w:r>
+      <w:r>
+        <w:t xml:space="preserve"> </w:t>
+      </w:r>
+      <w:r>
+        <w:rPr>
+          <w:rStyle w:val="VerbatimChar"/>
+        </w:rPr>
+        <w:t xml:space="preserve">/home</w:t>
+      </w:r>
+      <w:r>
+        <w:t xml:space="preserve"> </w:t>
+      </w:r>
+      <w:r>
+        <w:t xml:space="preserve">is about 1 GB.</w:t>
+      </w:r>
+    </w:p>
+    <w:p>
+      <w:pPr>
+        <w:numPr>
+          <w:ilvl w:val="0"/>
+          <w:numId w:val="1002"/>
+        </w:numPr>
+        <w:pStyle w:val="Compact"/>
+      </w:pPr>
+      <w:r>
+        <w:t xml:space="preserve">A reboot, if you want to confirm the mounts survive.</w:t>
+      </w:r>
+      <w:r>
+        <w:t xml:space="preserve"> </w:t>
+      </w:r>
+      <w:r>
+        <w:rPr>
+          <w:rStyle w:val="VerbatimChar"/>
+        </w:rPr>
+        <w:t xml:space="preserve">prepare</w:t>
+      </w:r>
+      <w:r>
+        <w:t xml:space="preserve"> </w:t>
+      </w:r>
+      <w:r>
+        <w:t xml:space="preserve">writes</w:t>
+      </w:r>
+      <w:r>
+        <w:t xml:space="preserve"> </w:t>
+      </w:r>
+      <w:r>
+        <w:rPr>
+          <w:rStyle w:val="VerbatimChar"/>
+        </w:rPr>
+        <w:t xml:space="preserve">/etc/fstab</w:t>
+      </w:r>
+      <w:r>
+        <w:t xml:space="preserve"> </w:t>
+      </w:r>
+      <w:r>
+        <w:t xml:space="preserve">and does not reboot.</w:t>
       </w:r>
     </w:p>
     <w:p>
@@ -1073,6 +1370,83 @@
               <w:rPr>
                 <w:rStyle w:val="VerbatimChar"/>
               </w:rPr>
+              <w:t xml:space="preserve">TNMS_DATA_DISK</w:t>
+            </w:r>
+          </w:p>
+        </w:tc>
+        <w:tc>
+          <w:tcPr/>
+          <w:p>
+            <w:pPr>
+              <w:pStyle w:val="Compact"/>
+              <w:jc w:val="left"/>
+            </w:pPr>
+            <w:r>
+              <w:t xml:space="preserve">chosen by</w:t>
+            </w:r>
+            <w:r>
+              <w:t xml:space="preserve"> </w:t>
+            </w:r>
+            <w:r>
+              <w:rPr>
+                <w:rStyle w:val="VerbatimChar"/>
+              </w:rPr>
+              <w:t xml:space="preserve">make scan</w:t>
+            </w:r>
+          </w:p>
+        </w:tc>
+        <w:tc>
+          <w:tcPr/>
+          <w:p>
+            <w:pPr>
+              <w:pStyle w:val="Compact"/>
+              <w:jc w:val="left"/>
+            </w:pPr>
+            <w:r>
+              <w:t xml:space="preserve">Whole disk that</w:t>
+            </w:r>
+            <w:r>
+              <w:t xml:space="preserve"> </w:t>
+            </w:r>
+            <w:r>
+              <w:rPr>
+                <w:rStyle w:val="VerbatimChar"/>
+              </w:rPr>
+              <w:t xml:space="preserve">make prepare</w:t>
+            </w:r>
+            <w:r>
+              <w:t xml:space="preserve"> </w:t>
+            </w:r>
+            <w:r>
+              <w:t xml:space="preserve">partitions. Recorded in</w:t>
+            </w:r>
+            <w:r>
+              <w:t xml:space="preserve"> </w:t>
+            </w:r>
+            <w:r>
+              <w:rPr>
+                <w:rStyle w:val="VerbatimChar"/>
+              </w:rPr>
+              <w:t xml:space="preserve">/root/tnms-install.answers</w:t>
+            </w:r>
+            <w:r>
+              <w:t xml:space="preserve">.</w:t>
+            </w:r>
+          </w:p>
+        </w:tc>
+      </w:tr>
+      <w:tr>
+        <w:tc>
+          <w:tcPr/>
+          <w:p>
+            <w:pPr>
+              <w:pStyle w:val="Compact"/>
+              <w:jc w:val="left"/>
+            </w:pPr>
+            <w:r>
+              <w:rPr>
+                <w:rStyle w:val="VerbatimChar"/>
+              </w:rPr>
               <w:t xml:space="preserve">TNMS_SID</w:t>
             </w:r>
           </w:p>
@@ -1381,6 +1755,137 @@
       </w:r>
       <w:r>
         <w:t xml:space="preserve">. The FQDN is first, then the short name.</w:t>
+      </w:r>
+    </w:p>
+    <w:p>
+      <w:pPr>
+        <w:pStyle w:val="BodyText"/>
+      </w:pPr>
+      <w:r>
+        <w:rPr>
+          <w:rStyle w:val="VerbatimChar"/>
+        </w:rPr>
+        <w:t xml:space="preserve">make scan</w:t>
+      </w:r>
+      <w:r>
+        <w:t xml:space="preserve"> </w:t>
+      </w:r>
+      <w:r>
+        <w:t xml:space="preserve">also records</w:t>
+      </w:r>
+      <w:r>
+        <w:t xml:space="preserve"> </w:t>
+      </w:r>
+      <w:r>
+        <w:rPr>
+          <w:rStyle w:val="VerbatimChar"/>
+        </w:rPr>
+        <w:t xml:space="preserve">TNMS_GROW=yes</w:t>
+      </w:r>
+      <w:r>
+        <w:t xml:space="preserve"> </w:t>
+      </w:r>
+      <w:r>
+        <w:t xml:space="preserve">when the operator agrees to grow</w:t>
+      </w:r>
+      <w:r>
+        <w:t xml:space="preserve"> </w:t>
+      </w:r>
+      <w:r>
+        <w:rPr>
+          <w:rStyle w:val="VerbatimChar"/>
+        </w:rPr>
+        <w:t xml:space="preserve">rootlv</w:t>
+      </w:r>
+      <w:r>
+        <w:t xml:space="preserve"> </w:t>
+      </w:r>
+      <w:r>
+        <w:t xml:space="preserve">and</w:t>
+      </w:r>
+      <w:r>
+        <w:t xml:space="preserve"> </w:t>
+      </w:r>
+      <w:r>
+        <w:rPr>
+          <w:rStyle w:val="VerbatimChar"/>
+        </w:rPr>
+        <w:t xml:space="preserve">tmplv</w:t>
+      </w:r>
+      <w:r>
+        <w:t xml:space="preserve">, and</w:t>
+      </w:r>
+      <w:r>
+        <w:t xml:space="preserve"> </w:t>
+      </w:r>
+      <w:r>
+        <w:rPr>
+          <w:rStyle w:val="VerbatimChar"/>
+        </w:rPr>
+        <w:t xml:space="preserve">CONFIRM=yes</w:t>
+      </w:r>
+      <w:r>
+        <w:t xml:space="preserve"> </w:t>
+      </w:r>
+      <w:r>
+        <w:t xml:space="preserve">only after the operator agrees to write the file.</w:t>
+      </w:r>
+      <w:r>
+        <w:t xml:space="preserve"> </w:t>
+      </w:r>
+      <w:r>
+        <w:rPr>
+          <w:rStyle w:val="VerbatimChar"/>
+        </w:rPr>
+        <w:t xml:space="preserve">make prepare</w:t>
+      </w:r>
+      <w:r>
+        <w:t xml:space="preserve"> </w:t>
+      </w:r>
+      <w:r>
+        <w:t xml:space="preserve">reads those two from</w:t>
+      </w:r>
+      <w:r>
+        <w:t xml:space="preserve"> </w:t>
+      </w:r>
+      <w:r>
+        <w:rPr>
+          <w:rStyle w:val="VerbatimChar"/>
+        </w:rPr>
+        <w:t xml:space="preserve">/root/tnms-install.answers</w:t>
+      </w:r>
+      <w:r>
+        <w:t xml:space="preserve">. A command line or</w:t>
+      </w:r>
+      <w:r>
+        <w:t xml:space="preserve"> </w:t>
+      </w:r>
+      <w:r>
+        <w:rPr>
+          <w:rStyle w:val="VerbatimChar"/>
+        </w:rPr>
+        <w:t xml:space="preserve">/root/tnms-install.local.mk</w:t>
+      </w:r>
+      <w:r>
+        <w:t xml:space="preserve"> </w:t>
+      </w:r>
+      <w:r>
+        <w:t xml:space="preserve">overrides the hostname, address, and admin group for the later install targets. The data disk</w:t>
+      </w:r>
+      <w:r>
+        <w:t xml:space="preserve"> </w:t>
+      </w:r>
+      <w:r>
+        <w:rPr>
+          <w:rStyle w:val="VerbatimChar"/>
+        </w:rPr>
+        <w:t xml:space="preserve">prepare</w:t>
+      </w:r>
+      <w:r>
+        <w:t xml:space="preserve"> </w:t>
+      </w:r>
+      <w:r>
+        <w:t xml:space="preserve">partitions is the one in the answers file.</w:t>
       </w:r>
     </w:p>
     <w:p>
@@ -2403,7 +2908,7 @@
       </w:tr>
     </w:tbl>
     <w:bookmarkEnd w:id="25"/>
-    <w:bookmarkStart w:id="39" w:name="targets"/>
+    <w:bookmarkStart w:id="41" w:name="targets"/>
     <w:p>
       <w:pPr>
         <w:pStyle w:val="Heading2"/>
@@ -2426,7 +2931,22 @@
         <w:t xml:space="preserve"> </w:t>
       </w:r>
       <w:r>
-        <w:t xml:space="preserve">runs the targets below in order. Each one checks the result before it writes its stamp. Run one target with</w:t>
+        <w:t xml:space="preserve">runs</w:t>
+      </w:r>
+      <w:r>
+        <w:t xml:space="preserve"> </w:t>
+      </w:r>
+      <w:r>
+        <w:rPr>
+          <w:rStyle w:val="VerbatimChar"/>
+        </w:rPr>
+        <w:t xml:space="preserve">prepare</w:t>
+      </w:r>
+      <w:r>
+        <w:t xml:space="preserve"> </w:t>
+      </w:r>
+      <w:r>
+        <w:t xml:space="preserve">and then the targets below. Each one checks the result before it writes its stamp. Run one target with</w:t>
       </w:r>
       <w:r>
         <w:t xml:space="preserve"> </w:t>
@@ -2456,12 +2976,520 @@
         <w:t xml:space="preserve">.</w:t>
       </w:r>
     </w:p>
-    <w:bookmarkStart w:id="26" w:name="stage"/>
+    <w:bookmarkStart w:id="26" w:name="scan"/>
     <w:p>
       <w:pPr>
         <w:pStyle w:val="Heading3"/>
       </w:pPr>
       <w:r>
+        <w:t xml:space="preserve">scan</w:t>
+      </w:r>
+    </w:p>
+    <w:p>
+      <w:pPr>
+        <w:pStyle w:val="FirstParagraph"/>
+      </w:pPr>
+      <w:r>
+        <w:t xml:space="preserve">Reads the host and writes no stamp. Fixed product requirements are stated, not asked:</w:t>
+      </w:r>
+      <w:r>
+        <w:t xml:space="preserve"> </w:t>
+      </w:r>
+      <w:r>
+        <w:rPr>
+          <w:rStyle w:val="VerbatimChar"/>
+        </w:rPr>
+        <w:t xml:space="preserve">/</w:t>
+      </w:r>
+      <w:r>
+        <w:t xml:space="preserve"> </w:t>
+      </w:r>
+      <w:r>
+        <w:t xml:space="preserve">at 8 GB,</w:t>
+      </w:r>
+      <w:r>
+        <w:t xml:space="preserve"> </w:t>
+      </w:r>
+      <w:r>
+        <w:rPr>
+          <w:rStyle w:val="VerbatimChar"/>
+        </w:rPr>
+        <w:t xml:space="preserve">/tmp</w:t>
+      </w:r>
+      <w:r>
+        <w:t xml:space="preserve"> </w:t>
+      </w:r>
+      <w:r>
+        <w:t xml:space="preserve">at 16 GB, 18 GB swap, SID</w:t>
+      </w:r>
+      <w:r>
+        <w:t xml:space="preserve"> </w:t>
+      </w:r>
+      <w:r>
+        <w:rPr>
+          <w:rStyle w:val="VerbatimChar"/>
+        </w:rPr>
+        <w:t xml:space="preserve">TNMS</w:t>
+      </w:r>
+      <w:r>
+        <w:t xml:space="preserve">, and the paths already in this guide. Passwords stay the variables above. Scan names them and does not prompt, so they do not land in shell history.</w:t>
+      </w:r>
+    </w:p>
+    <w:p>
+      <w:pPr>
+        <w:pStyle w:val="BodyText"/>
+      </w:pPr>
+      <w:r>
+        <w:t xml:space="preserve">The data-disk default is the single whole disk that is not the OS disk, is at least 100 GB, and has no filesystem and no mount. Zero candidates or more than one means there is no default. If</w:t>
+      </w:r>
+      <w:r>
+        <w:t xml:space="preserve"> </w:t>
+      </w:r>
+      <w:r>
+        <w:rPr>
+          <w:rStyle w:val="VerbatimChar"/>
+        </w:rPr>
+        <w:t xml:space="preserve">rootvg</w:t>
+      </w:r>
+      <w:r>
+        <w:t xml:space="preserve"> </w:t>
+      </w:r>
+      <w:r>
+        <w:t xml:space="preserve">does not have room to grow, scan says how much is free and how much is required, and does not offer the grow.</w:t>
+      </w:r>
+    </w:p>
+    <w:bookmarkEnd w:id="26"/>
+    <w:bookmarkStart w:id="27" w:name="prepare"/>
+    <w:p>
+      <w:pPr>
+        <w:pStyle w:val="Heading3"/>
+      </w:pPr>
+      <w:r>
+        <w:t xml:space="preserve">prepare</w:t>
+      </w:r>
+    </w:p>
+    <w:p>
+      <w:pPr>
+        <w:pStyle w:val="FirstParagraph"/>
+      </w:pPr>
+      <w:r>
+        <w:t xml:space="preserve">Applies the agreed layout and writes</w:t>
+      </w:r>
+      <w:r>
+        <w:t xml:space="preserve"> </w:t>
+      </w:r>
+      <w:r>
+        <w:rPr>
+          <w:rStyle w:val="VerbatimChar"/>
+        </w:rPr>
+        <w:t xml:space="preserve">/var/lib/tnms-install/prepare</w:t>
+      </w:r>
+      <w:r>
+        <w:t xml:space="preserve">. It will not:</w:t>
+      </w:r>
+    </w:p>
+    <w:p>
+      <w:pPr>
+        <w:numPr>
+          <w:ilvl w:val="0"/>
+          <w:numId w:val="1003"/>
+        </w:numPr>
+        <w:pStyle w:val="Compact"/>
+      </w:pPr>
+      <w:r>
+        <w:t xml:space="preserve">Partition or label a disk that has a filesystem, a mount, or a child mount, including when the answers name it.</w:t>
+      </w:r>
+    </w:p>
+    <w:p>
+      <w:pPr>
+        <w:numPr>
+          <w:ilvl w:val="0"/>
+          <w:numId w:val="1003"/>
+        </w:numPr>
+        <w:pStyle w:val="Compact"/>
+      </w:pPr>
+      <w:r>
+        <w:t xml:space="preserve">Use the OS disk as the data disk.</w:t>
+      </w:r>
+    </w:p>
+    <w:p>
+      <w:pPr>
+        <w:numPr>
+          <w:ilvl w:val="0"/>
+          <w:numId w:val="1003"/>
+        </w:numPr>
+        <w:pStyle w:val="Compact"/>
+      </w:pPr>
+      <w:r>
+        <w:t xml:space="preserve">Continue when</w:t>
+      </w:r>
+      <w:r>
+        <w:t xml:space="preserve"> </w:t>
+      </w:r>
+      <w:r>
+        <w:rPr>
+          <w:rStyle w:val="VerbatimChar"/>
+        </w:rPr>
+        <w:t xml:space="preserve">/home</w:t>
+      </w:r>
+      <w:r>
+        <w:t xml:space="preserve"> </w:t>
+      </w:r>
+      <w:r>
+        <w:t xml:space="preserve">is on a terabyte-scale volume. That means the data disk was added to</w:t>
+      </w:r>
+      <w:r>
+        <w:t xml:space="preserve"> </w:t>
+      </w:r>
+      <w:r>
+        <w:rPr>
+          <w:rStyle w:val="VerbatimChar"/>
+        </w:rPr>
+        <w:t xml:space="preserve">homelv</w:t>
+      </w:r>
+      <w:r>
+        <w:t xml:space="preserve">.</w:t>
+      </w:r>
+    </w:p>
+    <w:p>
+      <w:pPr>
+        <w:numPr>
+          <w:ilvl w:val="0"/>
+          <w:numId w:val="1003"/>
+        </w:numPr>
+        <w:pStyle w:val="Compact"/>
+      </w:pPr>
+      <w:r>
+        <w:t xml:space="preserve">Mount over</w:t>
+      </w:r>
+      <w:r>
+        <w:t xml:space="preserve"> </w:t>
+      </w:r>
+      <w:r>
+        <w:rPr>
+          <w:rStyle w:val="VerbatimChar"/>
+        </w:rPr>
+        <w:t xml:space="preserve">/opt</w:t>
+      </w:r>
+      <w:r>
+        <w:t xml:space="preserve"> </w:t>
+      </w:r>
+      <w:r>
+        <w:t xml:space="preserve">when</w:t>
+      </w:r>
+      <w:r>
+        <w:t xml:space="preserve"> </w:t>
+      </w:r>
+      <w:r>
+        <w:rPr>
+          <w:rStyle w:val="VerbatimChar"/>
+        </w:rPr>
+        <w:t xml:space="preserve">/opt</w:t>
+      </w:r>
+      <w:r>
+        <w:t xml:space="preserve"> </w:t>
+      </w:r>
+      <w:r>
+        <w:t xml:space="preserve">already contains names and is not already</w:t>
+      </w:r>
+      <w:r>
+        <w:t xml:space="preserve"> </w:t>
+      </w:r>
+      <w:r>
+        <w:rPr>
+          <w:rStyle w:val="VerbatimChar"/>
+        </w:rPr>
+        <w:t xml:space="preserve">datavg-optlv</w:t>
+      </w:r>
+      <w:r>
+        <w:t xml:space="preserve">.</w:t>
+      </w:r>
+    </w:p>
+    <w:p>
+      <w:pPr>
+        <w:numPr>
+          <w:ilvl w:val="0"/>
+          <w:numId w:val="1003"/>
+        </w:numPr>
+        <w:pStyle w:val="Compact"/>
+      </w:pPr>
+      <w:r>
+        <w:t xml:space="preserve">Append a second copy of an</w:t>
+      </w:r>
+      <w:r>
+        <w:t xml:space="preserve"> </w:t>
+      </w:r>
+      <w:r>
+        <w:rPr>
+          <w:rStyle w:val="VerbatimChar"/>
+        </w:rPr>
+        <w:t xml:space="preserve">/etc/fstab</w:t>
+      </w:r>
+      <w:r>
+        <w:t xml:space="preserve"> </w:t>
+      </w:r>
+      <w:r>
+        <w:t xml:space="preserve">line.</w:t>
+      </w:r>
+    </w:p>
+    <w:p>
+      <w:pPr>
+        <w:numPr>
+          <w:ilvl w:val="0"/>
+          <w:numId w:val="1003"/>
+        </w:numPr>
+        <w:pStyle w:val="Compact"/>
+      </w:pPr>
+      <w:r>
+        <w:t xml:space="preserve">Run</w:t>
+      </w:r>
+      <w:r>
+        <w:t xml:space="preserve"> </w:t>
+      </w:r>
+      <w:r>
+        <w:rPr>
+          <w:rStyle w:val="VerbatimChar"/>
+        </w:rPr>
+        <w:t xml:space="preserve">restorecon</w:t>
+      </w:r>
+      <w:r>
+        <w:t xml:space="preserve"> </w:t>
+      </w:r>
+      <w:r>
+        <w:t xml:space="preserve">on the</w:t>
+      </w:r>
+      <w:r>
+        <w:t xml:space="preserve"> </w:t>
+      </w:r>
+      <w:r>
+        <w:rPr>
+          <w:rStyle w:val="VerbatimChar"/>
+        </w:rPr>
+        <w:t xml:space="preserve">/nokia</w:t>
+      </w:r>
+      <w:r>
+        <w:t xml:space="preserve"> </w:t>
+      </w:r>
+      <w:r>
+        <w:t xml:space="preserve">or</w:t>
+      </w:r>
+      <w:r>
+        <w:t xml:space="preserve"> </w:t>
+      </w:r>
+      <w:r>
+        <w:rPr>
+          <w:rStyle w:val="VerbatimChar"/>
+        </w:rPr>
+        <w:t xml:space="preserve">/oradata</w:t>
+      </w:r>
+      <w:r>
+        <w:t xml:space="preserve"> </w:t>
+      </w:r>
+      <w:r>
+        <w:t xml:space="preserve">bind mounts. After</w:t>
+      </w:r>
+      <w:r>
+        <w:t xml:space="preserve"> </w:t>
+      </w:r>
+      <w:r>
+        <w:rPr>
+          <w:rStyle w:val="VerbatimChar"/>
+        </w:rPr>
+        <w:t xml:space="preserve">restorecon -RF /opt</w:t>
+      </w:r>
+      <w:r>
+        <w:t xml:space="preserve">, it sets</w:t>
+      </w:r>
+      <w:r>
+        <w:t xml:space="preserve"> </w:t>
+      </w:r>
+      <w:r>
+        <w:rPr>
+          <w:rStyle w:val="VerbatimChar"/>
+        </w:rPr>
+        <w:t xml:space="preserve">swapfile_t</w:t>
+      </w:r>
+      <w:r>
+        <w:t xml:space="preserve"> </w:t>
+      </w:r>
+      <w:r>
+        <w:t xml:space="preserve">on</w:t>
+      </w:r>
+      <w:r>
+        <w:t xml:space="preserve"> </w:t>
+      </w:r>
+      <w:r>
+        <w:rPr>
+          <w:rStyle w:val="VerbatimChar"/>
+        </w:rPr>
+        <w:t xml:space="preserve">/opt/swapfile</w:t>
+      </w:r>
+      <w:r>
+        <w:t xml:space="preserve">.</w:t>
+      </w:r>
+    </w:p>
+    <w:p>
+      <w:pPr>
+        <w:numPr>
+          <w:ilvl w:val="0"/>
+          <w:numId w:val="1003"/>
+        </w:numPr>
+        <w:pStyle w:val="Compact"/>
+      </w:pPr>
+      <w:r>
+        <w:t xml:space="preserve">Repartition when</w:t>
+      </w:r>
+      <w:r>
+        <w:t xml:space="preserve"> </w:t>
+      </w:r>
+      <w:r>
+        <w:rPr>
+          <w:rStyle w:val="VerbatimChar"/>
+        </w:rPr>
+        <w:t xml:space="preserve">/opt</w:t>
+      </w:r>
+      <w:r>
+        <w:t xml:space="preserve"> </w:t>
+      </w:r>
+      <w:r>
+        <w:t xml:space="preserve">is already</w:t>
+      </w:r>
+      <w:r>
+        <w:t xml:space="preserve"> </w:t>
+      </w:r>
+      <w:r>
+        <w:rPr>
+          <w:rStyle w:val="VerbatimChar"/>
+        </w:rPr>
+        <w:t xml:space="preserve">datavg-optlv</w:t>
+      </w:r>
+      <w:r>
+        <w:t xml:space="preserve">. It only fills in missing binds, swap, or fstab lines.</w:t>
+      </w:r>
+    </w:p>
+    <w:p>
+      <w:pPr>
+        <w:numPr>
+          <w:ilvl w:val="0"/>
+          <w:numId w:val="1003"/>
+        </w:numPr>
+        <w:pStyle w:val="Compact"/>
+      </w:pPr>
+      <w:r>
+        <w:t xml:space="preserve">Grow a volume that is already at the target size.</w:t>
+      </w:r>
+    </w:p>
+    <w:p>
+      <w:pPr>
+        <w:numPr>
+          <w:ilvl w:val="0"/>
+          <w:numId w:val="1003"/>
+        </w:numPr>
+        <w:pStyle w:val="Compact"/>
+      </w:pPr>
+      <w:r>
+        <w:t xml:space="preserve">Run the VS Code symlink, open TCP 8444, or change passwords.</w:t>
+      </w:r>
+    </w:p>
+    <w:p>
+      <w:pPr>
+        <w:pStyle w:val="FirstParagraph"/>
+      </w:pPr>
+      <w:r>
+        <w:t xml:space="preserve">Partitioning uses</w:t>
+      </w:r>
+      <w:r>
+        <w:t xml:space="preserve"> </w:t>
+      </w:r>
+      <w:r>
+        <w:rPr>
+          <w:rStyle w:val="VerbatimChar"/>
+        </w:rPr>
+        <w:t xml:space="preserve">parted -a optimal</w:t>
+      </w:r>
+      <w:r>
+        <w:t xml:space="preserve"> </w:t>
+      </w:r>
+      <w:r>
+        <w:t xml:space="preserve">and</w:t>
+      </w:r>
+      <w:r>
+        <w:t xml:space="preserve"> </w:t>
+      </w:r>
+      <w:r>
+        <w:rPr>
+          <w:rStyle w:val="VerbatimChar"/>
+        </w:rPr>
+        <w:t xml:space="preserve">mkpart</w:t>
+      </w:r>
+      <w:r>
+        <w:t xml:space="preserve"> </w:t>
+      </w:r>
+      <w:r>
+        <w:t xml:space="preserve">from</w:t>
+      </w:r>
+      <w:r>
+        <w:t xml:space="preserve"> </w:t>
+      </w:r>
+      <w:r>
+        <w:rPr>
+          <w:rStyle w:val="VerbatimChar"/>
+        </w:rPr>
+        <w:t xml:space="preserve">0%</w:t>
+      </w:r>
+      <w:r>
+        <w:t xml:space="preserve"> </w:t>
+      </w:r>
+      <w:r>
+        <w:t xml:space="preserve">to</w:t>
+      </w:r>
+      <w:r>
+        <w:t xml:space="preserve"> </w:t>
+      </w:r>
+      <w:r>
+        <w:rPr>
+          <w:rStyle w:val="VerbatimChar"/>
+        </w:rPr>
+        <w:t xml:space="preserve">100%</w:t>
+      </w:r>
+      <w:r>
+        <w:t xml:space="preserve">, then</w:t>
+      </w:r>
+      <w:r>
+        <w:t xml:space="preserve"> </w:t>
+      </w:r>
+      <w:r>
+        <w:rPr>
+          <w:rStyle w:val="VerbatimChar"/>
+        </w:rPr>
+        <w:t xml:space="preserve">parted align-check optimal 1</w:t>
+      </w:r>
+      <w:r>
+        <w:t xml:space="preserve"> </w:t>
+      </w:r>
+      <w:r>
+        <w:t xml:space="preserve">before</w:t>
+      </w:r>
+      <w:r>
+        <w:t xml:space="preserve"> </w:t>
+      </w:r>
+      <w:r>
+        <w:rPr>
+          <w:rStyle w:val="VerbatimChar"/>
+        </w:rPr>
+        <w:t xml:space="preserve">pvcreate</w:t>
+      </w:r>
+      <w:r>
+        <w:t xml:space="preserve">. A failed alignment check stops before any LVM write.</w:t>
+      </w:r>
+    </w:p>
+    <w:bookmarkEnd w:id="27"/>
+    <w:bookmarkStart w:id="28" w:name="stage"/>
+    <w:p>
+      <w:pPr>
+        <w:pStyle w:val="Heading3"/>
+      </w:pPr>
+      <w:r>
         <w:t xml:space="preserve">stage</w:t>
       </w:r>
     </w:p>
@@ -2861,8 +3889,8 @@
         <w:t xml:space="preserve">.</w:t>
       </w:r>
     </w:p>
-    <w:bookmarkEnd w:id="26"/>
-    <w:bookmarkStart w:id="27" w:name="host"/>
+    <w:bookmarkEnd w:id="28"/>
+    <w:bookmarkStart w:id="29" w:name="host"/>
     <w:p>
       <w:pPr>
         <w:pStyle w:val="Heading3"/>
@@ -3022,8 +4050,8 @@
         <w:t xml:space="preserve">stops and does not append a second line.</w:t>
       </w:r>
     </w:p>
-    <w:bookmarkEnd w:id="27"/>
-    <w:bookmarkStart w:id="28" w:name="packages"/>
+    <w:bookmarkEnd w:id="29"/>
+    <w:bookmarkStart w:id="30" w:name="packages"/>
     <w:p>
       <w:pPr>
         <w:pStyle w:val="Heading3"/>
@@ -3303,8 +4331,8 @@
         <w:t xml:space="preserve">already finds all of them.</w:t>
       </w:r>
     </w:p>
-    <w:bookmarkEnd w:id="28"/>
-    <w:bookmarkStart w:id="29" w:name="kernel"/>
+    <w:bookmarkEnd w:id="30"/>
+    <w:bookmarkStart w:id="31" w:name="kernel"/>
     <w:p>
       <w:pPr>
         <w:pStyle w:val="Heading3"/>
@@ -3419,8 +4447,8 @@
         <w:t xml:space="preserve">Skips when the sysctl file, the live values, firewalld, and chronyd already match.</w:t>
       </w:r>
     </w:p>
-    <w:bookmarkEnd w:id="29"/>
-    <w:bookmarkStart w:id="30" w:name="disk"/>
+    <w:bookmarkEnd w:id="31"/>
+    <w:bookmarkStart w:id="32" w:name="disk"/>
     <w:p>
       <w:pPr>
         <w:pStyle w:val="Heading3"/>
@@ -3631,8 +4659,8 @@
         <w:t xml:space="preserve">and stops when it is short. After the product directory exists, that free-space gate is skipped because the copy has already used the space.</w:t>
       </w:r>
     </w:p>
-    <w:bookmarkEnd w:id="30"/>
-    <w:bookmarkStart w:id="31" w:name="unpack"/>
+    <w:bookmarkEnd w:id="32"/>
+    <w:bookmarkStart w:id="33" w:name="unpack"/>
     <w:p>
       <w:pPr>
         <w:pStyle w:val="Heading3"/>
@@ -3830,8 +4858,8 @@
         <w:t xml:space="preserve">is not run.</w:t>
       </w:r>
     </w:p>
-    <w:bookmarkEnd w:id="31"/>
-    <w:bookmarkStart w:id="32" w:name="credentials"/>
+    <w:bookmarkEnd w:id="33"/>
+    <w:bookmarkStart w:id="34" w:name="credentials"/>
     <w:p>
       <w:pPr>
         <w:pStyle w:val="Heading3"/>
@@ -3919,8 +4947,8 @@
         <w:t xml:space="preserve">Skips the write when the three values already match. A different value stops the target.</w:t>
       </w:r>
     </w:p>
-    <w:bookmarkEnd w:id="32"/>
-    <w:bookmarkStart w:id="33" w:name="oracle"/>
+    <w:bookmarkEnd w:id="34"/>
+    <w:bookmarkStart w:id="35" w:name="oracle"/>
     <w:p>
       <w:pPr>
         <w:pStyle w:val="Heading3"/>
@@ -4201,8 +5229,8 @@
         <w:t xml:space="preserve">.</w:t>
       </w:r>
     </w:p>
-    <w:bookmarkEnd w:id="33"/>
-    <w:bookmarkStart w:id="34" w:name="wizard"/>
+    <w:bookmarkEnd w:id="35"/>
+    <w:bookmarkStart w:id="36" w:name="wizard"/>
     <w:p>
       <w:pPr>
         <w:pStyle w:val="Heading3"/>
@@ -4590,8 +5618,8 @@
         <w:t xml:space="preserve">--dry-run</w:t>
       </w:r>
     </w:p>
-    <w:bookmarkEnd w:id="34"/>
-    <w:bookmarkStart w:id="35" w:name="lsmem"/>
+    <w:bookmarkEnd w:id="36"/>
+    <w:bookmarkStart w:id="37" w:name="lsmem"/>
     <w:p>
       <w:pPr>
         <w:pStyle w:val="Heading3"/>
@@ -4673,8 +5701,8 @@
         <w:t xml:space="preserve">is absent. The summary then shows the real RAM, 16G on this host.</w:t>
       </w:r>
     </w:p>
-    <w:bookmarkEnd w:id="35"/>
-    <w:bookmarkStart w:id="36" w:name="sftp"/>
+    <w:bookmarkEnd w:id="37"/>
+    <w:bookmarkStart w:id="38" w:name="sftp"/>
     <w:p>
       <w:pPr>
         <w:pStyle w:val="Heading3"/>
@@ -5000,8 +6028,8 @@
         <w:t xml:space="preserve">(System Preferences, External Communications, and NE Properties). FTP stays off.</w:t>
       </w:r>
     </w:p>
-    <w:bookmarkEnd w:id="36"/>
-    <w:bookmarkStart w:id="37" w:name="sudo"/>
+    <w:bookmarkEnd w:id="38"/>
+    <w:bookmarkStart w:id="39" w:name="sudo"/>
     <w:p>
       <w:pPr>
         <w:pStyle w:val="Heading3"/>
@@ -5110,8 +6138,8 @@
         <w:t xml:space="preserve">Skips when that check already passes.</w:t>
       </w:r>
     </w:p>
-    <w:bookmarkEnd w:id="37"/>
-    <w:bookmarkStart w:id="38" w:name="service"/>
+    <w:bookmarkEnd w:id="39"/>
+    <w:bookmarkStart w:id="40" w:name="service"/>
     <w:p>
       <w:pPr>
         <w:pStyle w:val="Heading3"/>
@@ -5328,9 +6356,9 @@
         <w:t xml:space="preserve">label is missing.</w:t>
       </w:r>
     </w:p>
-    <w:bookmarkEnd w:id="38"/>
-    <w:bookmarkEnd w:id="39"/>
-    <w:bookmarkStart w:id="40" w:name="checks"/>
+    <w:bookmarkEnd w:id="40"/>
+    <w:bookmarkEnd w:id="41"/>
+    <w:bookmarkStart w:id="42" w:name="checks"/>
     <w:p>
       <w:pPr>
         <w:pStyle w:val="Heading2"/>
@@ -5907,8 +6935,8 @@
         <w:t xml:space="preserve">The first install runs for 90 days on a trial license. License keys after that, and the Windows client, are separate procedures.</w:t>
       </w:r>
     </w:p>
-    <w:bookmarkEnd w:id="40"/>
-    <w:bookmarkStart w:id="41" w:name="what-happened-on-this-host"/>
+    <w:bookmarkEnd w:id="42"/>
+    <w:bookmarkStart w:id="43" w:name="what-happened-on-this-host"/>
     <w:p>
       <w:pPr>
         <w:pStyle w:val="Heading2"/>
@@ -5982,8 +7010,8 @@
         <w:t xml:space="preserve">stayed up.</w:t>
       </w:r>
     </w:p>
-    <w:bookmarkEnd w:id="41"/>
-    <w:bookmarkStart w:id="42" w:name="manual-step-9-two-ssh-sessions"/>
+    <w:bookmarkEnd w:id="43"/>
+    <w:bookmarkStart w:id="44" w:name="manual-step-9-two-ssh-sessions"/>
     <w:p>
       <w:pPr>
         <w:pStyle w:val="Heading2"/>
@@ -6946,338 +7974,6 @@
       </w:pPr>
       <w:r>
         <w:t xml:space="preserve">This command does not open the installer. It prints the command line of the virtual screen, with no column heading. Read the line as follows:</w:t>
-      </w:r>
-    </w:p>
-    <w:p>
-      <w:pPr>
-        <w:numPr>
-          <w:ilvl w:val="0"/>
-          <w:numId w:val="1003"/>
-        </w:numPr>
-        <w:pStyle w:val="Compact"/>
-      </w:pPr>
-      <w:r>
-        <w:rPr>
-          <w:rStyle w:val="VerbatimChar"/>
-        </w:rPr>
-        <w:t xml:space="preserve">Xvfb</w:t>
-      </w:r>
-      <w:r>
-        <w:t xml:space="preserve"> </w:t>
-      </w:r>
-      <w:r>
-        <w:t xml:space="preserve">is the virtual screen. It is a screen held in memory. No monitor is attached to it.</w:t>
-      </w:r>
-    </w:p>
-    <w:p>
-      <w:pPr>
-        <w:numPr>
-          <w:ilvl w:val="0"/>
-          <w:numId w:val="1003"/>
-        </w:numPr>
-        <w:pStyle w:val="Compact"/>
-      </w:pPr>
-      <w:r>
-        <w:rPr>
-          <w:rStyle w:val="VerbatimChar"/>
-        </w:rPr>
-        <w:t xml:space="preserve">:99</w:t>
-      </w:r>
-      <w:r>
-        <w:t xml:space="preserve"> </w:t>
-      </w:r>
-      <w:r>
-        <w:t xml:space="preserve">is the name of that screen.</w:t>
-      </w:r>
-      <w:r>
-        <w:t xml:space="preserve"> </w:t>
-      </w:r>
-      <w:r>
-        <w:rPr>
-          <w:rStyle w:val="VerbatimChar"/>
-        </w:rPr>
-        <w:t xml:space="preserve">export DISPLAY=:99</w:t>
-      </w:r>
-      <w:r>
-        <w:t xml:space="preserve"> </w:t>
-      </w:r>
-      <w:r>
-        <w:t xml:space="preserve">is the line that sent the installer there. The installer window is drawn on</w:t>
-      </w:r>
-      <w:r>
-        <w:t xml:space="preserve"> </w:t>
-      </w:r>
-      <w:r>
-        <w:rPr>
-          <w:rStyle w:val="VerbatimChar"/>
-        </w:rPr>
-        <w:t xml:space="preserve">:99</w:t>
-      </w:r>
-      <w:r>
-        <w:t xml:space="preserve">.</w:t>
-      </w:r>
-    </w:p>
-    <w:p>
-      <w:pPr>
-        <w:numPr>
-          <w:ilvl w:val="0"/>
-          <w:numId w:val="1003"/>
-        </w:numPr>
-        <w:pStyle w:val="Compact"/>
-      </w:pPr>
-      <w:r>
-        <w:rPr>
-          <w:rStyle w:val="VerbatimChar"/>
-        </w:rPr>
-        <w:t xml:space="preserve">-screen 0 1400x900x24</w:t>
-      </w:r>
-      <w:r>
-        <w:t xml:space="preserve"> </w:t>
-      </w:r>
-      <w:r>
-        <w:t xml:space="preserve">is one screen, 1400 by 900 pixels, 24-bit color. The wizard fits inside that rectangle.</w:t>
-      </w:r>
-    </w:p>
-    <w:p>
-      <w:pPr>
-        <w:numPr>
-          <w:ilvl w:val="0"/>
-          <w:numId w:val="1003"/>
-        </w:numPr>
-        <w:pStyle w:val="Compact"/>
-      </w:pPr>
-      <w:r>
-        <w:rPr>
-          <w:rStyle w:val="VerbatimChar"/>
-        </w:rPr>
-        <w:t xml:space="preserve">-ac</w:t>
-      </w:r>
-      <w:r>
-        <w:t xml:space="preserve"> </w:t>
-      </w:r>
-      <w:r>
-        <w:t xml:space="preserve">lets another program on this server read the screen. That is what makes the screenshot command below work.</w:t>
-      </w:r>
-    </w:p>
-    <w:p>
-      <w:pPr>
-        <w:numPr>
-          <w:ilvl w:val="0"/>
-          <w:numId w:val="1003"/>
-        </w:numPr>
-        <w:pStyle w:val="Compact"/>
-      </w:pPr>
-      <w:r>
-        <w:t xml:space="preserve">A line that matches means the screen is up. The shell redirection</w:t>
-      </w:r>
-      <w:r>
-        <w:t xml:space="preserve"> </w:t>
-      </w:r>
-      <w:r>
-        <w:rPr>
-          <w:rStyle w:val="VerbatimChar"/>
-        </w:rPr>
-        <w:t xml:space="preserve">&gt;/tmp/tnms-gui/xvfb.log</w:t>
-      </w:r>
-      <w:r>
-        <w:t xml:space="preserve"> </w:t>
-      </w:r>
-      <w:r>
-        <w:t xml:space="preserve">and the</w:t>
-      </w:r>
-      <w:r>
-        <w:t xml:space="preserve"> </w:t>
-      </w:r>
-      <w:r>
-        <w:rPr>
-          <w:rStyle w:val="VerbatimChar"/>
-        </w:rPr>
-        <w:t xml:space="preserve">&amp;</w:t>
-      </w:r>
-      <w:r>
-        <w:t xml:space="preserve"> </w:t>
-      </w:r>
-      <w:r>
-        <w:t xml:space="preserve">are absent here. Those belong to the shell that started Xvfb, and they are not part of the process command line.</w:t>
-      </w:r>
-    </w:p>
-    <w:p>
-      <w:pPr>
-        <w:pStyle w:val="FirstParagraph"/>
-      </w:pPr>
-      <w:r>
-        <w:t xml:space="preserve">Both SSH sessions show only text. The wizard is a picture on display</w:t>
-      </w:r>
-      <w:r>
-        <w:t xml:space="preserve"> </w:t>
-      </w:r>
-      <w:r>
-        <w:rPr>
-          <w:rStyle w:val="VerbatimChar"/>
-        </w:rPr>
-        <w:t xml:space="preserve">:99</w:t>
-      </w:r>
-      <w:r>
-        <w:t xml:space="preserve">. You see a page by saving that picture in the second SSH session, downloading the file to the workstation, and opening the file there. The numbered list below is the questions. The picture tells you which number you are on.</w:t>
-      </w:r>
-    </w:p>
-    <w:p>
-      <w:pPr>
-        <w:pStyle w:val="BodyText"/>
-      </w:pPr>
-      <w:r>
-        <w:t xml:space="preserve">If</w:t>
-      </w:r>
-      <w:r>
-        <w:t xml:space="preserve"> </w:t>
-      </w:r>
-      <w:r>
-        <w:rPr>
-          <w:rStyle w:val="VerbatimChar"/>
-        </w:rPr>
-        <w:t xml:space="preserve">ps -C Xvfb -o args=</w:t>
-      </w:r>
-      <w:r>
-        <w:t xml:space="preserve"> </w:t>
-      </w:r>
-      <w:r>
-        <w:t xml:space="preserve">prints nothing, the virtual screen is not running. Start Xvfb again before</w:t>
-      </w:r>
-      <w:r>
-        <w:t xml:space="preserve"> </w:t>
-      </w:r>
-      <w:r>
-        <w:rPr>
-          <w:rStyle w:val="VerbatimChar"/>
-        </w:rPr>
-        <w:t xml:space="preserve">./TNMS.bin</w:t>
-      </w:r>
-      <w:r>
-        <w:t xml:space="preserve">.</w:t>
-      </w:r>
-    </w:p>
-    <w:p>
-      <w:pPr>
-        <w:pStyle w:val="BodyText"/>
-      </w:pPr>
-      <w:r>
-        <w:t xml:space="preserve">Install the picture program once. In the second SSH session:</w:t>
-      </w:r>
-    </w:p>
-    <w:p>
-      <w:pPr>
-        <w:pStyle w:val="SourceCode"/>
-      </w:pPr>
-      <w:r>
-        <w:rPr>
-          <w:rStyle w:val="ExtensionTok"/>
-        </w:rPr>
-        <w:t xml:space="preserve">dnf</w:t>
-      </w:r>
-      <w:r>
-        <w:rPr>
-          <w:rStyle w:val="NormalTok"/>
-        </w:rPr>
-        <w:t xml:space="preserve"> </w:t>
-      </w:r>
-      <w:r>
-        <w:rPr>
-          <w:rStyle w:val="AttributeTok"/>
-        </w:rPr>
-        <w:t xml:space="preserve">-y</w:t>
-      </w:r>
-      <w:r>
-        <w:rPr>
-          <w:rStyle w:val="NormalTok"/>
-        </w:rPr>
-        <w:t xml:space="preserve"> install ImageMagick</w:t>
-      </w:r>
-    </w:p>
-    <w:p>
-      <w:pPr>
-        <w:pStyle w:val="FirstParagraph"/>
-      </w:pPr>
-      <w:r>
-        <w:rPr>
-          <w:bCs/>
-          <w:b/>
-        </w:rPr>
-        <w:t xml:space="preserve">Expected output:</w:t>
-      </w:r>
-    </w:p>
-    <w:p>
-      <w:pPr>
-        <w:pStyle w:val="BodyText"/>
-      </w:pPr>
-      <w:r>
-        <w:t xml:space="preserve">The command ends with:</w:t>
-      </w:r>
-    </w:p>
-    <w:p>
-      <w:pPr>
-        <w:pStyle w:val="SourceCode"/>
-      </w:pPr>
-      <w:r>
-        <w:rPr>
-          <w:rStyle w:val="VerbatimChar"/>
-        </w:rPr>
-        <w:t xml:space="preserve">Complete!</w:t>
-      </w:r>
-    </w:p>
-    <w:p>
-      <w:pPr>
-        <w:pStyle w:val="FirstParagraph"/>
-      </w:pPr>
-      <w:r>
-        <w:rPr>
-          <w:rStyle w:val="VerbatimChar"/>
-        </w:rPr>
-        <w:t xml:space="preserve">dnf</w:t>
-      </w:r>
-      <w:r>
-        <w:t xml:space="preserve"> </w:t>
-      </w:r>
-      <w:r>
-        <w:t xml:space="preserve">installs</w:t>
-      </w:r>
-      <w:r>
-        <w:t xml:space="preserve"> </w:t>
-      </w:r>
-      <w:r>
-        <w:rPr>
-          <w:rStyle w:val="VerbatimChar"/>
-        </w:rPr>
-        <w:t xml:space="preserve">import</w:t>
-      </w:r>
-      <w:r>
-        <w:t xml:space="preserve">. It does not take a picture. Do not run</w:t>
-      </w:r>
-      <w:r>
-        <w:t xml:space="preserve"> </w:t>
-      </w:r>
-      <w:r>
-        <w:rPr>
-          <w:rStyle w:val="VerbatimChar"/>
-        </w:rPr>
-        <w:t xml:space="preserve">dnf</w:t>
-      </w:r>
-      <w:r>
-        <w:t xml:space="preserve"> </w:t>
-      </w:r>
-      <w:r>
-        <w:t xml:space="preserve">again.</w:t>
-      </w:r>
-    </w:p>
-    <w:p>
-      <w:pPr>
-        <w:pStyle w:val="BodyText"/>
-      </w:pPr>
-      <w:r>
-        <w:rPr>
-          <w:bCs/>
-          <w:b/>
-        </w:rPr>
-        <w:t xml:space="preserve">For every wizard page, use these three windows in this order.</w:t>
       </w:r>
     </w:p>
     <w:p>
@@ -7289,7 +7985,211 @@
         <w:pStyle w:val="Compact"/>
       </w:pPr>
       <w:r>
-        <w:t xml:space="preserve">Second SSH session. Save the page and let the workstation read the file:</w:t>
+        <w:rPr>
+          <w:rStyle w:val="VerbatimChar"/>
+        </w:rPr>
+        <w:t xml:space="preserve">Xvfb</w:t>
+      </w:r>
+      <w:r>
+        <w:t xml:space="preserve"> </w:t>
+      </w:r>
+      <w:r>
+        <w:t xml:space="preserve">is the virtual screen. It is a screen held in memory. No monitor is attached to it.</w:t>
+      </w:r>
+    </w:p>
+    <w:p>
+      <w:pPr>
+        <w:numPr>
+          <w:ilvl w:val="0"/>
+          <w:numId w:val="1004"/>
+        </w:numPr>
+        <w:pStyle w:val="Compact"/>
+      </w:pPr>
+      <w:r>
+        <w:rPr>
+          <w:rStyle w:val="VerbatimChar"/>
+        </w:rPr>
+        <w:t xml:space="preserve">:99</w:t>
+      </w:r>
+      <w:r>
+        <w:t xml:space="preserve"> </w:t>
+      </w:r>
+      <w:r>
+        <w:t xml:space="preserve">is the name of that screen.</w:t>
+      </w:r>
+      <w:r>
+        <w:t xml:space="preserve"> </w:t>
+      </w:r>
+      <w:r>
+        <w:rPr>
+          <w:rStyle w:val="VerbatimChar"/>
+        </w:rPr>
+        <w:t xml:space="preserve">export DISPLAY=:99</w:t>
+      </w:r>
+      <w:r>
+        <w:t xml:space="preserve"> </w:t>
+      </w:r>
+      <w:r>
+        <w:t xml:space="preserve">is the line that sent the installer there. The installer window is drawn on</w:t>
+      </w:r>
+      <w:r>
+        <w:t xml:space="preserve"> </w:t>
+      </w:r>
+      <w:r>
+        <w:rPr>
+          <w:rStyle w:val="VerbatimChar"/>
+        </w:rPr>
+        <w:t xml:space="preserve">:99</w:t>
+      </w:r>
+      <w:r>
+        <w:t xml:space="preserve">.</w:t>
+      </w:r>
+    </w:p>
+    <w:p>
+      <w:pPr>
+        <w:numPr>
+          <w:ilvl w:val="0"/>
+          <w:numId w:val="1004"/>
+        </w:numPr>
+        <w:pStyle w:val="Compact"/>
+      </w:pPr>
+      <w:r>
+        <w:rPr>
+          <w:rStyle w:val="VerbatimChar"/>
+        </w:rPr>
+        <w:t xml:space="preserve">-screen 0 1400x900x24</w:t>
+      </w:r>
+      <w:r>
+        <w:t xml:space="preserve"> </w:t>
+      </w:r>
+      <w:r>
+        <w:t xml:space="preserve">is one screen, 1400 by 900 pixels, 24-bit color. The wizard fits inside that rectangle.</w:t>
+      </w:r>
+    </w:p>
+    <w:p>
+      <w:pPr>
+        <w:numPr>
+          <w:ilvl w:val="0"/>
+          <w:numId w:val="1004"/>
+        </w:numPr>
+        <w:pStyle w:val="Compact"/>
+      </w:pPr>
+      <w:r>
+        <w:rPr>
+          <w:rStyle w:val="VerbatimChar"/>
+        </w:rPr>
+        <w:t xml:space="preserve">-ac</w:t>
+      </w:r>
+      <w:r>
+        <w:t xml:space="preserve"> </w:t>
+      </w:r>
+      <w:r>
+        <w:t xml:space="preserve">lets another program on this server read the screen. That is what makes the screenshot command below work.</w:t>
+      </w:r>
+    </w:p>
+    <w:p>
+      <w:pPr>
+        <w:numPr>
+          <w:ilvl w:val="0"/>
+          <w:numId w:val="1004"/>
+        </w:numPr>
+        <w:pStyle w:val="Compact"/>
+      </w:pPr>
+      <w:r>
+        <w:t xml:space="preserve">A line that matches means the screen is up. The shell redirection</w:t>
+      </w:r>
+      <w:r>
+        <w:t xml:space="preserve"> </w:t>
+      </w:r>
+      <w:r>
+        <w:rPr>
+          <w:rStyle w:val="VerbatimChar"/>
+        </w:rPr>
+        <w:t xml:space="preserve">&gt;/tmp/tnms-gui/xvfb.log</w:t>
+      </w:r>
+      <w:r>
+        <w:t xml:space="preserve"> </w:t>
+      </w:r>
+      <w:r>
+        <w:t xml:space="preserve">and the</w:t>
+      </w:r>
+      <w:r>
+        <w:t xml:space="preserve"> </w:t>
+      </w:r>
+      <w:r>
+        <w:rPr>
+          <w:rStyle w:val="VerbatimChar"/>
+        </w:rPr>
+        <w:t xml:space="preserve">&amp;</w:t>
+      </w:r>
+      <w:r>
+        <w:t xml:space="preserve"> </w:t>
+      </w:r>
+      <w:r>
+        <w:t xml:space="preserve">are absent here. Those belong to the shell that started Xvfb, and they are not part of the process command line.</w:t>
+      </w:r>
+    </w:p>
+    <w:p>
+      <w:pPr>
+        <w:pStyle w:val="FirstParagraph"/>
+      </w:pPr>
+      <w:r>
+        <w:t xml:space="preserve">Both SSH sessions show only text. The wizard is a picture on display</w:t>
+      </w:r>
+      <w:r>
+        <w:t xml:space="preserve"> </w:t>
+      </w:r>
+      <w:r>
+        <w:rPr>
+          <w:rStyle w:val="VerbatimChar"/>
+        </w:rPr>
+        <w:t xml:space="preserve">:99</w:t>
+      </w:r>
+      <w:r>
+        <w:t xml:space="preserve">. You see a page by saving that picture in the second SSH session, downloading the file to the workstation, and opening the file there. The numbered list below is the questions. The picture tells you which number you are on.</w:t>
+      </w:r>
+    </w:p>
+    <w:p>
+      <w:pPr>
+        <w:pStyle w:val="BodyText"/>
+      </w:pPr>
+      <w:r>
+        <w:t xml:space="preserve">If</w:t>
+      </w:r>
+      <w:r>
+        <w:t xml:space="preserve"> </w:t>
+      </w:r>
+      <w:r>
+        <w:rPr>
+          <w:rStyle w:val="VerbatimChar"/>
+        </w:rPr>
+        <w:t xml:space="preserve">ps -C Xvfb -o args=</w:t>
+      </w:r>
+      <w:r>
+        <w:t xml:space="preserve"> </w:t>
+      </w:r>
+      <w:r>
+        <w:t xml:space="preserve">prints nothing, the virtual screen is not running. Start Xvfb again before</w:t>
+      </w:r>
+      <w:r>
+        <w:t xml:space="preserve"> </w:t>
+      </w:r>
+      <w:r>
+        <w:rPr>
+          <w:rStyle w:val="VerbatimChar"/>
+        </w:rPr>
+        <w:t xml:space="preserve">./TNMS.bin</w:t>
+      </w:r>
+      <w:r>
+        <w:t xml:space="preserve">.</w:t>
+      </w:r>
+    </w:p>
+    <w:p>
+      <w:pPr>
+        <w:pStyle w:val="BodyText"/>
+      </w:pPr>
+      <w:r>
+        <w:t xml:space="preserve">Install the picture program once. In the second SSH session:</w:t>
       </w:r>
     </w:p>
     <w:p>
@@ -7300,7 +8200,7 @@
         <w:rPr>
           <w:rStyle w:val="ExtensionTok"/>
         </w:rPr>
-        <w:t xml:space="preserve">import</w:t>
+        <w:t xml:space="preserve">dnf</w:t>
       </w:r>
       <w:r>
         <w:rPr>
@@ -7312,66 +8212,33 @@
         <w:rPr>
           <w:rStyle w:val="AttributeTok"/>
         </w:rPr>
-        <w:t xml:space="preserve">-window</w:t>
+        <w:t xml:space="preserve">-y</w:t>
       </w:r>
       <w:r>
         <w:rPr>
           <w:rStyle w:val="NormalTok"/>
         </w:rPr>
-        <w:t xml:space="preserve"> root </w:t>
-      </w:r>
-      <w:r>
-        <w:rPr>
-          <w:rStyle w:val="AttributeTok"/>
-        </w:rPr>
-        <w:t xml:space="preserve">-display</w:t>
-      </w:r>
-      <w:r>
-        <w:rPr>
-          <w:rStyle w:val="NormalTok"/>
-        </w:rPr>
-        <w:t xml:space="preserve"> :99 /tmp/tnms-gui/screen.png</w:t>
-      </w:r>
-      <w:r>
-        <w:br/>
-      </w:r>
-      <w:r>
-        <w:rPr>
-          <w:rStyle w:val="FunctionTok"/>
-        </w:rPr>
-        <w:t xml:space="preserve">chmod</w:t>
-      </w:r>
-      <w:r>
-        <w:rPr>
-          <w:rStyle w:val="NormalTok"/>
-        </w:rPr>
-        <w:t xml:space="preserve"> 644 /tmp/tnms-gui/screen.png</w:t>
+        <w:t xml:space="preserve"> install ImageMagick</w:t>
       </w:r>
     </w:p>
     <w:p>
       <w:pPr>
         <w:pStyle w:val="FirstParagraph"/>
-      </w:pPr>
-      <w:r>
-        <w:t xml:space="preserve">Both commands print nothing.</w:t>
-      </w:r>
-    </w:p>
-    <w:p>
-      <w:pPr>
-        <w:pStyle w:val="BodyText"/>
       </w:pPr>
       <w:r>
         <w:rPr>
           <w:bCs/>
           <w:b/>
         </w:rPr>
-        <w:t xml:space="preserve">Confirm by running,</w:t>
-      </w:r>
-      <w:r>
-        <w:t xml:space="preserve"> </w:t>
-      </w:r>
-      <w:r>
-        <w:t xml:space="preserve">in the second SSH session:</w:t>
+        <w:t xml:space="preserve">Expected output:</w:t>
+      </w:r>
+    </w:p>
+    <w:p>
+      <w:pPr>
+        <w:pStyle w:val="BodyText"/>
+      </w:pPr>
+      <w:r>
+        <w:t xml:space="preserve">The command ends with:</w:t>
       </w:r>
     </w:p>
     <w:p>
@@ -7380,86 +8247,65 @@
       </w:pPr>
       <w:r>
         <w:rPr>
-          <w:rStyle w:val="FunctionTok"/>
-        </w:rPr>
-        <w:t xml:space="preserve">ls</w:t>
-      </w:r>
-      <w:r>
-        <w:rPr>
-          <w:rStyle w:val="NormalTok"/>
-        </w:rPr>
-        <w:t xml:space="preserve"> </w:t>
-      </w:r>
-      <w:r>
-        <w:rPr>
-          <w:rStyle w:val="AttributeTok"/>
-        </w:rPr>
-        <w:t xml:space="preserve">-l</w:t>
-      </w:r>
-      <w:r>
-        <w:rPr>
-          <w:rStyle w:val="NormalTok"/>
-        </w:rPr>
-        <w:t xml:space="preserve"> /tmp/tnms-gui/screen.png</w:t>
+          <w:rStyle w:val="VerbatimChar"/>
+        </w:rPr>
+        <w:t xml:space="preserve">Complete!</w:t>
       </w:r>
     </w:p>
     <w:p>
       <w:pPr>
         <w:pStyle w:val="FirstParagraph"/>
+      </w:pPr>
+      <w:r>
+        <w:rPr>
+          <w:rStyle w:val="VerbatimChar"/>
+        </w:rPr>
+        <w:t xml:space="preserve">dnf</w:t>
+      </w:r>
+      <w:r>
+        <w:t xml:space="preserve"> </w:t>
+      </w:r>
+      <w:r>
+        <w:t xml:space="preserve">installs</w:t>
+      </w:r>
+      <w:r>
+        <w:t xml:space="preserve"> </w:t>
+      </w:r>
+      <w:r>
+        <w:rPr>
+          <w:rStyle w:val="VerbatimChar"/>
+        </w:rPr>
+        <w:t xml:space="preserve">import</w:t>
+      </w:r>
+      <w:r>
+        <w:t xml:space="preserve">. It does not take a picture. Do not run</w:t>
+      </w:r>
+      <w:r>
+        <w:t xml:space="preserve"> </w:t>
+      </w:r>
+      <w:r>
+        <w:rPr>
+          <w:rStyle w:val="VerbatimChar"/>
+        </w:rPr>
+        <w:t xml:space="preserve">dnf</w:t>
+      </w:r>
+      <w:r>
+        <w:t xml:space="preserve"> </w:t>
+      </w:r>
+      <w:r>
+        <w:t xml:space="preserve">again.</w:t>
+      </w:r>
+    </w:p>
+    <w:p>
+      <w:pPr>
+        <w:pStyle w:val="BodyText"/>
       </w:pPr>
       <w:r>
         <w:rPr>
           <w:bCs/>
           <w:b/>
         </w:rPr>
-        <w:t xml:space="preserve">Expected output:</w:t>
-      </w:r>
-    </w:p>
-    <w:p>
-      <w:pPr>
-        <w:pStyle w:val="BodyText"/>
-      </w:pPr>
-      <w:r>
-        <w:t xml:space="preserve">The line includes</w:t>
-      </w:r>
-      <w:r>
-        <w:t xml:space="preserve"> </w:t>
-      </w:r>
-      <w:r>
-        <w:rPr>
-          <w:rStyle w:val="VerbatimChar"/>
-        </w:rPr>
-        <w:t xml:space="preserve">-rw-r--r--</w:t>
-      </w:r>
-      <w:r>
-        <w:t xml:space="preserve"> </w:t>
-      </w:r>
-      <w:r>
-        <w:t xml:space="preserve">and</w:t>
-      </w:r>
-      <w:r>
-        <w:t xml:space="preserve"> </w:t>
-      </w:r>
-      <w:r>
-        <w:rPr>
-          <w:rStyle w:val="VerbatimChar"/>
-        </w:rPr>
-        <w:t xml:space="preserve">/tmp/tnms-gui/screen.png</w:t>
-      </w:r>
-      <w:r>
-        <w:t xml:space="preserve">. The size is not</w:t>
-      </w:r>
-      <w:r>
-        <w:t xml:space="preserve"> </w:t>
-      </w:r>
-      <w:r>
-        <w:rPr>
-          <w:rStyle w:val="VerbatimChar"/>
-        </w:rPr>
-        <w:t xml:space="preserve">0</w:t>
-      </w:r>
-      <w:r>
-        <w:t xml:space="preserve">.</w:t>
+        <w:t xml:space="preserve">For every wizard page, use these three windows in this order.</w:t>
       </w:r>
     </w:p>
     <w:p>
@@ -7471,7 +8317,7 @@
         <w:pStyle w:val="Compact"/>
       </w:pPr>
       <w:r>
-        <w:t xml:space="preserve">Workstation terminal. This is the third window. It is on your computer, and it is not logged into the server. If the prompt is a prompt on the server, this is the wrong window. Download the picture. Use the site admin name and the site address. On this host:</w:t>
+        <w:t xml:space="preserve">Second SSH session. Save the page and let the workstation read the file:</w:t>
       </w:r>
     </w:p>
     <w:p>
@@ -7480,26 +8326,120 @@
       </w:pPr>
       <w:r>
         <w:rPr>
+          <w:rStyle w:val="ExtensionTok"/>
+        </w:rPr>
+        <w:t xml:space="preserve">import</w:t>
+      </w:r>
+      <w:r>
+        <w:rPr>
+          <w:rStyle w:val="NormalTok"/>
+        </w:rPr>
+        <w:t xml:space="preserve"> </w:t>
+      </w:r>
+      <w:r>
+        <w:rPr>
+          <w:rStyle w:val="AttributeTok"/>
+        </w:rPr>
+        <w:t xml:space="preserve">-window</w:t>
+      </w:r>
+      <w:r>
+        <w:rPr>
+          <w:rStyle w:val="NormalTok"/>
+        </w:rPr>
+        <w:t xml:space="preserve"> root </w:t>
+      </w:r>
+      <w:r>
+        <w:rPr>
+          <w:rStyle w:val="AttributeTok"/>
+        </w:rPr>
+        <w:t xml:space="preserve">-display</w:t>
+      </w:r>
+      <w:r>
+        <w:rPr>
+          <w:rStyle w:val="NormalTok"/>
+        </w:rPr>
+        <w:t xml:space="preserve"> :99 /tmp/tnms-gui/screen.png</w:t>
+      </w:r>
+      <w:r>
+        <w:br/>
+      </w:r>
+      <w:r>
+        <w:rPr>
           <w:rStyle w:val="FunctionTok"/>
         </w:rPr>
-        <w:t xml:space="preserve">scp</w:t>
+        <w:t xml:space="preserve">chmod</w:t>
       </w:r>
       <w:r>
         <w:rPr>
           <w:rStyle w:val="NormalTok"/>
         </w:rPr>
-        <w:t xml:space="preserve"> azureuser@172.16.0.4:/tmp/tnms-gui/screen.png .</w:t>
+        <w:t xml:space="preserve"> 644 /tmp/tnms-gui/screen.png</w:t>
       </w:r>
     </w:p>
     <w:p>
       <w:pPr>
         <w:pStyle w:val="FirstParagraph"/>
+      </w:pPr>
+      <w:r>
+        <w:t xml:space="preserve">Both commands print nothing.</w:t>
+      </w:r>
+    </w:p>
+    <w:p>
+      <w:pPr>
+        <w:pStyle w:val="BodyText"/>
       </w:pPr>
       <w:r>
         <w:rPr>
           <w:bCs/>
           <w:b/>
         </w:rPr>
+        <w:t xml:space="preserve">Confirm by running,</w:t>
+      </w:r>
+      <w:r>
+        <w:t xml:space="preserve"> </w:t>
+      </w:r>
+      <w:r>
+        <w:t xml:space="preserve">in the second SSH session:</w:t>
+      </w:r>
+    </w:p>
+    <w:p>
+      <w:pPr>
+        <w:pStyle w:val="SourceCode"/>
+      </w:pPr>
+      <w:r>
+        <w:rPr>
+          <w:rStyle w:val="FunctionTok"/>
+        </w:rPr>
+        <w:t xml:space="preserve">ls</w:t>
+      </w:r>
+      <w:r>
+        <w:rPr>
+          <w:rStyle w:val="NormalTok"/>
+        </w:rPr>
+        <w:t xml:space="preserve"> </w:t>
+      </w:r>
+      <w:r>
+        <w:rPr>
+          <w:rStyle w:val="AttributeTok"/>
+        </w:rPr>
+        <w:t xml:space="preserve">-l</w:t>
+      </w:r>
+      <w:r>
+        <w:rPr>
+          <w:rStyle w:val="NormalTok"/>
+        </w:rPr>
+        <w:t xml:space="preserve"> /tmp/tnms-gui/screen.png</w:t>
+      </w:r>
+    </w:p>
+    <w:p>
+      <w:pPr>
+        <w:pStyle w:val="FirstParagraph"/>
+      </w:pPr>
+      <w:r>
+        <w:rPr>
+          <w:bCs/>
+          <w:b/>
+        </w:rPr>
         <w:t xml:space="preserve">Expected output:</w:t>
       </w:r>
     </w:p>
@@ -7508,46 +8448,46 @@
         <w:pStyle w:val="BodyText"/>
       </w:pPr>
       <w:r>
-        <w:t xml:space="preserve">The transfer reaches</w:t>
-      </w:r>
-      <w:r>
-        <w:t xml:space="preserve"> </w:t>
-      </w:r>
-      <w:r>
-        <w:rPr>
-          <w:rStyle w:val="VerbatimChar"/>
-        </w:rPr>
-        <w:t xml:space="preserve">100%</w:t>
-      </w:r>
-      <w:r>
-        <w:t xml:space="preserve">. The workstation directory where you ran</w:t>
-      </w:r>
-      <w:r>
-        <w:t xml:space="preserve"> </w:t>
-      </w:r>
-      <w:r>
-        <w:rPr>
-          <w:rStyle w:val="VerbatimChar"/>
-        </w:rPr>
-        <w:t xml:space="preserve">scp</w:t>
-      </w:r>
-      <w:r>
-        <w:t xml:space="preserve"> </w:t>
-      </w:r>
-      <w:r>
-        <w:t xml:space="preserve">now contains</w:t>
-      </w:r>
-      <w:r>
-        <w:t xml:space="preserve"> </w:t>
-      </w:r>
-      <w:r>
-        <w:rPr>
-          <w:rStyle w:val="VerbatimChar"/>
-        </w:rPr>
-        <w:t xml:space="preserve">screen.png</w:t>
-      </w:r>
-      <w:r>
-        <w:t xml:space="preserve">. Each download replaces that file. Close the old picture before you open the new one, or the viewer can keep showing the previous page.</w:t>
+        <w:t xml:space="preserve">The line includes</w:t>
+      </w:r>
+      <w:r>
+        <w:t xml:space="preserve"> </w:t>
+      </w:r>
+      <w:r>
+        <w:rPr>
+          <w:rStyle w:val="VerbatimChar"/>
+        </w:rPr>
+        <w:t xml:space="preserve">-rw-r--r--</w:t>
+      </w:r>
+      <w:r>
+        <w:t xml:space="preserve"> </w:t>
+      </w:r>
+      <w:r>
+        <w:t xml:space="preserve">and</w:t>
+      </w:r>
+      <w:r>
+        <w:t xml:space="preserve"> </w:t>
+      </w:r>
+      <w:r>
+        <w:rPr>
+          <w:rStyle w:val="VerbatimChar"/>
+        </w:rPr>
+        <w:t xml:space="preserve">/tmp/tnms-gui/screen.png</w:t>
+      </w:r>
+      <w:r>
+        <w:t xml:space="preserve">. The size is not</w:t>
+      </w:r>
+      <w:r>
+        <w:t xml:space="preserve"> </w:t>
+      </w:r>
+      <w:r>
+        <w:rPr>
+          <w:rStyle w:val="VerbatimChar"/>
+        </w:rPr>
+        <w:t xml:space="preserve">0</w:t>
+      </w:r>
+      <w:r>
+        <w:t xml:space="preserve">.</w:t>
       </w:r>
     </w:p>
     <w:p>
@@ -7559,7 +8499,71 @@
         <w:pStyle w:val="Compact"/>
       </w:pPr>
       <w:r>
-        <w:t xml:space="preserve">On the workstation, open</w:t>
+        <w:t xml:space="preserve">Workstation terminal. This is the third window. It is on your computer, and it is not logged into the server. If the prompt is a prompt on the server, this is the wrong window. Download the picture. Use the site admin name and the site address. On this host:</w:t>
+      </w:r>
+    </w:p>
+    <w:p>
+      <w:pPr>
+        <w:pStyle w:val="SourceCode"/>
+      </w:pPr>
+      <w:r>
+        <w:rPr>
+          <w:rStyle w:val="FunctionTok"/>
+        </w:rPr>
+        <w:t xml:space="preserve">scp</w:t>
+      </w:r>
+      <w:r>
+        <w:rPr>
+          <w:rStyle w:val="NormalTok"/>
+        </w:rPr>
+        <w:t xml:space="preserve"> azureuser@172.16.0.4:/tmp/tnms-gui/screen.png .</w:t>
+      </w:r>
+    </w:p>
+    <w:p>
+      <w:pPr>
+        <w:pStyle w:val="FirstParagraph"/>
+      </w:pPr>
+      <w:r>
+        <w:rPr>
+          <w:bCs/>
+          <w:b/>
+        </w:rPr>
+        <w:t xml:space="preserve">Expected output:</w:t>
+      </w:r>
+    </w:p>
+    <w:p>
+      <w:pPr>
+        <w:pStyle w:val="BodyText"/>
+      </w:pPr>
+      <w:r>
+        <w:t xml:space="preserve">The transfer reaches</w:t>
+      </w:r>
+      <w:r>
+        <w:t xml:space="preserve"> </w:t>
+      </w:r>
+      <w:r>
+        <w:rPr>
+          <w:rStyle w:val="VerbatimChar"/>
+        </w:rPr>
+        <w:t xml:space="preserve">100%</w:t>
+      </w:r>
+      <w:r>
+        <w:t xml:space="preserve">. The workstation directory where you ran</w:t>
+      </w:r>
+      <w:r>
+        <w:t xml:space="preserve"> </w:t>
+      </w:r>
+      <w:r>
+        <w:rPr>
+          <w:rStyle w:val="VerbatimChar"/>
+        </w:rPr>
+        <w:t xml:space="preserve">scp</w:t>
+      </w:r>
+      <w:r>
+        <w:t xml:space="preserve"> </w:t>
+      </w:r>
+      <w:r>
+        <w:t xml:space="preserve">now contains</w:t>
       </w:r>
       <w:r>
         <w:t xml:space="preserve"> </w:t>
@@ -7571,96 +8575,7 @@
         <w:t xml:space="preserve">screen.png</w:t>
       </w:r>
       <w:r>
-        <w:t xml:space="preserve"> </w:t>
-      </w:r>
-      <w:r>
-        <w:t xml:space="preserve">in an image viewer. The picture is one wizard page. The title is</w:t>
-      </w:r>
-      <w:r>
-        <w:t xml:space="preserve"> </w:t>
-      </w:r>
-      <w:r>
-        <w:rPr>
-          <w:rStyle w:val="VerbatimChar"/>
-        </w:rPr>
-        <w:t xml:space="preserve">TNMS 9.1.0.593.0 Installer</w:t>
-      </w:r>
-      <w:r>
-        <w:t xml:space="preserve">. Read the words on the page. Find that same page in the numbered list below. The text under that number is the required answer.</w:t>
-      </w:r>
-    </w:p>
-    <w:p>
-      <w:pPr>
-        <w:pStyle w:val="FirstParagraph"/>
-      </w:pPr>
-      <w:r>
-        <w:t xml:space="preserve">Clicking the downloaded picture does nothing. The picture is only how you see the page. On this host the click or the typed value was sent with</w:t>
-      </w:r>
-      <w:r>
-        <w:t xml:space="preserve"> </w:t>
-      </w:r>
-      <w:r>
-        <w:rPr>
-          <w:rStyle w:val="VerbatimChar"/>
-        </w:rPr>
-        <w:t xml:space="preserve">xdotool</w:t>
-      </w:r>
-      <w:r>
-        <w:t xml:space="preserve"> </w:t>
-      </w:r>
-      <w:r>
-        <w:t xml:space="preserve">from the second SSH session, with</w:t>
-      </w:r>
-      <w:r>
-        <w:t xml:space="preserve"> </w:t>
-      </w:r>
-      <w:r>
-        <w:rPr>
-          <w:rStyle w:val="VerbatimChar"/>
-        </w:rPr>
-        <w:t xml:space="preserve">DISPLAY=:99</w:t>
-      </w:r>
-      <w:r>
-        <w:t xml:space="preserve">. The first SSH session stays inside</w:t>
-      </w:r>
-      <w:r>
-        <w:t xml:space="preserve"> </w:t>
-      </w:r>
-      <w:r>
-        <w:rPr>
-          <w:rStyle w:val="VerbatimChar"/>
-        </w:rPr>
-        <w:t xml:space="preserve">./TNMS.bin</w:t>
-      </w:r>
-      <w:r>
-        <w:t xml:space="preserve"> </w:t>
-      </w:r>
-      <w:r>
-        <w:t xml:space="preserve">and is not where answers are typed.</w:t>
-      </w:r>
-    </w:p>
-    <w:p>
-      <w:pPr>
-        <w:pStyle w:val="BodyText"/>
-      </w:pPr>
-      <w:r>
-        <w:t xml:space="preserve">After the answer, start again at action 1. Download the new picture and open it. The new picture must show the next page before you use the next number. If it shows the same page, the answer did not land. Send the answer again, then take another picture.</w:t>
-      </w:r>
-    </w:p>
-    <w:p>
-      <w:pPr>
-        <w:pStyle w:val="BodyText"/>
-      </w:pPr>
-      <w:r>
-        <w:t xml:space="preserve">Stop when the first SSH session returns to a shell prompt.</w:t>
-      </w:r>
-    </w:p>
-    <w:p>
-      <w:pPr>
-        <w:pStyle w:val="BodyText"/>
-      </w:pPr>
-      <w:r>
-        <w:t xml:space="preserve">The pages, in order:</w:t>
+        <w:t xml:space="preserve">. Each download replaces that file. Close the old picture before you open the new one, or the viewer can keep showing the previous page.</w:t>
       </w:r>
     </w:p>
     <w:p>
@@ -7672,66 +8587,179 @@
         <w:pStyle w:val="Compact"/>
       </w:pPr>
       <w:r>
-        <w:t xml:space="preserve">License. Accept the terms.</w:t>
+        <w:t xml:space="preserve">On the workstation, open</w:t>
+      </w:r>
+      <w:r>
+        <w:t xml:space="preserve"> </w:t>
+      </w:r>
+      <w:r>
+        <w:rPr>
+          <w:rStyle w:val="VerbatimChar"/>
+        </w:rPr>
+        <w:t xml:space="preserve">screen.png</w:t>
+      </w:r>
+      <w:r>
+        <w:t xml:space="preserve"> </w:t>
+      </w:r>
+      <w:r>
+        <w:t xml:space="preserve">in an image viewer. The picture is one wizard page. The title is</w:t>
+      </w:r>
+      <w:r>
+        <w:t xml:space="preserve"> </w:t>
+      </w:r>
+      <w:r>
+        <w:rPr>
+          <w:rStyle w:val="VerbatimChar"/>
+        </w:rPr>
+        <w:t xml:space="preserve">TNMS 9.1.0.593.0 Installer</w:t>
+      </w:r>
+      <w:r>
+        <w:t xml:space="preserve">. Read the words on the page. Find that same page in the numbered list below. The text under that number is the required answer.</w:t>
+      </w:r>
+    </w:p>
+    <w:p>
+      <w:pPr>
+        <w:pStyle w:val="FirstParagraph"/>
+      </w:pPr>
+      <w:r>
+        <w:t xml:space="preserve">Clicking the downloaded picture does nothing. The picture is only how you see the page. On this host the click or the typed value was sent with</w:t>
+      </w:r>
+      <w:r>
+        <w:t xml:space="preserve"> </w:t>
+      </w:r>
+      <w:r>
+        <w:rPr>
+          <w:rStyle w:val="VerbatimChar"/>
+        </w:rPr>
+        <w:t xml:space="preserve">xdotool</w:t>
+      </w:r>
+      <w:r>
+        <w:t xml:space="preserve"> </w:t>
+      </w:r>
+      <w:r>
+        <w:t xml:space="preserve">from the second SSH session, with</w:t>
+      </w:r>
+      <w:r>
+        <w:t xml:space="preserve"> </w:t>
+      </w:r>
+      <w:r>
+        <w:rPr>
+          <w:rStyle w:val="VerbatimChar"/>
+        </w:rPr>
+        <w:t xml:space="preserve">DISPLAY=:99</w:t>
+      </w:r>
+      <w:r>
+        <w:t xml:space="preserve">. The first SSH session stays inside</w:t>
+      </w:r>
+      <w:r>
+        <w:t xml:space="preserve"> </w:t>
+      </w:r>
+      <w:r>
+        <w:rPr>
+          <w:rStyle w:val="VerbatimChar"/>
+        </w:rPr>
+        <w:t xml:space="preserve">./TNMS.bin</w:t>
+      </w:r>
+      <w:r>
+        <w:t xml:space="preserve"> </w:t>
+      </w:r>
+      <w:r>
+        <w:t xml:space="preserve">and is not where answers are typed.</w:t>
+      </w:r>
+    </w:p>
+    <w:p>
+      <w:pPr>
+        <w:pStyle w:val="BodyText"/>
+      </w:pPr>
+      <w:r>
+        <w:t xml:space="preserve">After the answer, start again at action 1. Download the new picture and open it. The new picture must show the next page before you use the next number. If it shows the same page, the answer did not land. Send the answer again, then take another picture.</w:t>
+      </w:r>
+    </w:p>
+    <w:p>
+      <w:pPr>
+        <w:pStyle w:val="BodyText"/>
+      </w:pPr>
+      <w:r>
+        <w:t xml:space="preserve">Stop when the first SSH session returns to a shell prompt.</w:t>
+      </w:r>
+    </w:p>
+    <w:p>
+      <w:pPr>
+        <w:pStyle w:val="BodyText"/>
+      </w:pPr>
+      <w:r>
+        <w:t xml:space="preserve">The pages, in order:</w:t>
       </w:r>
     </w:p>
     <w:p>
       <w:pPr>
         <w:numPr>
           <w:ilvl w:val="0"/>
-          <w:numId w:val="1007"/>
+          <w:numId w:val="1008"/>
         </w:numPr>
         <w:pStyle w:val="Compact"/>
       </w:pPr>
       <w:r>
-        <w:t xml:space="preserve">PDT warning (</w:t>
-      </w:r>
-      <w:r>
-        <w:rPr>
-          <w:rStyle w:val="VerbatimChar"/>
-        </w:rPr>
-        <w:t xml:space="preserve">Check for available PDTs</w:t>
-      </w:r>
-      <w:r>
-        <w:t xml:space="preserve">, folder</w:t>
-      </w:r>
-      <w:r>
-        <w:t xml:space="preserve"> </w:t>
-      </w:r>
-      <w:r>
-        <w:rPr>
-          <w:rStyle w:val="VerbatimChar"/>
-        </w:rPr>
-        <w:t xml:space="preserve">TNMS_Installer/PUs</w:t>
-      </w:r>
-      <w:r>
-        <w:t xml:space="preserve">). Dismiss it when</w:t>
-      </w:r>
-      <w:r>
-        <w:t xml:space="preserve"> </w:t>
-      </w:r>
-      <w:r>
-        <w:rPr>
-          <w:rStyle w:val="VerbatimChar"/>
-        </w:rPr>
-        <w:t xml:space="preserve">PUs/</w:t>
-      </w:r>
-      <w:r>
-        <w:t xml:space="preserve"> </w:t>
-      </w:r>
-      <w:r>
-        <w:t xml:space="preserve">is empty.</w:t>
+        <w:t xml:space="preserve">License. Accept the terms.</w:t>
       </w:r>
     </w:p>
     <w:p>
       <w:pPr>
         <w:numPr>
           <w:ilvl w:val="0"/>
-          <w:numId w:val="1007"/>
+          <w:numId w:val="1008"/>
         </w:numPr>
         <w:pStyle w:val="Compact"/>
       </w:pPr>
       <w:r>
+        <w:t xml:space="preserve">PDT warning (</w:t>
+      </w:r>
+      <w:r>
+        <w:rPr>
+          <w:rStyle w:val="VerbatimChar"/>
+        </w:rPr>
+        <w:t xml:space="preserve">Check for available PDTs</w:t>
+      </w:r>
+      <w:r>
+        <w:t xml:space="preserve">, folder</w:t>
+      </w:r>
+      <w:r>
+        <w:t xml:space="preserve"> </w:t>
+      </w:r>
+      <w:r>
+        <w:rPr>
+          <w:rStyle w:val="VerbatimChar"/>
+        </w:rPr>
+        <w:t xml:space="preserve">TNMS_Installer/PUs</w:t>
+      </w:r>
+      <w:r>
+        <w:t xml:space="preserve">). Dismiss it when</w:t>
+      </w:r>
+      <w:r>
+        <w:t xml:space="preserve"> </w:t>
+      </w:r>
+      <w:r>
+        <w:rPr>
+          <w:rStyle w:val="VerbatimChar"/>
+        </w:rPr>
+        <w:t xml:space="preserve">PUs/</w:t>
+      </w:r>
+      <w:r>
+        <w:t xml:space="preserve"> </w:t>
+      </w:r>
+      <w:r>
+        <w:t xml:space="preserve">is empty.</w:t>
+      </w:r>
+    </w:p>
+    <w:p>
+      <w:pPr>
+        <w:numPr>
+          <w:ilvl w:val="0"/>
+          <w:numId w:val="1008"/>
+        </w:numPr>
+        <w:pStyle w:val="Compact"/>
+      </w:pPr>
+      <w:r>
         <w:t xml:space="preserve">Installation package.</w:t>
       </w:r>
       <w:r>
@@ -7752,7 +8780,7 @@
       <w:pPr>
         <w:numPr>
           <w:ilvl w:val="0"/>
-          <w:numId w:val="1007"/>
+          <w:numId w:val="1008"/>
         </w:numPr>
         <w:pStyle w:val="Compact"/>
       </w:pPr>
@@ -7764,7 +8792,7 @@
       <w:pPr>
         <w:numPr>
           <w:ilvl w:val="0"/>
-          <w:numId w:val="1007"/>
+          <w:numId w:val="1008"/>
         </w:numPr>
         <w:pStyle w:val="Compact"/>
       </w:pPr>
@@ -7789,7 +8817,7 @@
       <w:pPr>
         <w:numPr>
           <w:ilvl w:val="0"/>
-          <w:numId w:val="1007"/>
+          <w:numId w:val="1008"/>
         </w:numPr>
         <w:pStyle w:val="Compact"/>
       </w:pPr>
@@ -7917,7 +8945,7 @@
       <w:pPr>
         <w:numPr>
           <w:ilvl w:val="0"/>
-          <w:numId w:val="1007"/>
+          <w:numId w:val="1008"/>
         </w:numPr>
         <w:pStyle w:val="Compact"/>
       </w:pPr>
@@ -7942,7 +8970,7 @@
       <w:pPr>
         <w:numPr>
           <w:ilvl w:val="0"/>
-          <w:numId w:val="1007"/>
+          <w:numId w:val="1008"/>
         </w:numPr>
         <w:pStyle w:val="Compact"/>
       </w:pPr>
@@ -8068,7 +9096,7 @@
       <w:pPr>
         <w:numPr>
           <w:ilvl w:val="0"/>
-          <w:numId w:val="1007"/>
+          <w:numId w:val="1008"/>
         </w:numPr>
         <w:pStyle w:val="Compact"/>
       </w:pPr>
@@ -8080,7 +9108,7 @@
       <w:pPr>
         <w:numPr>
           <w:ilvl w:val="0"/>
-          <w:numId w:val="1007"/>
+          <w:numId w:val="1008"/>
         </w:numPr>
         <w:pStyle w:val="Compact"/>
       </w:pPr>
@@ -8092,7 +9120,7 @@
       <w:pPr>
         <w:numPr>
           <w:ilvl w:val="0"/>
-          <w:numId w:val="1007"/>
+          <w:numId w:val="1008"/>
         </w:numPr>
         <w:pStyle w:val="Compact"/>
       </w:pPr>
@@ -8104,7 +9132,7 @@
       <w:pPr>
         <w:numPr>
           <w:ilvl w:val="0"/>
-          <w:numId w:val="1007"/>
+          <w:numId w:val="1008"/>
         </w:numPr>
         <w:pStyle w:val="Compact"/>
       </w:pPr>
@@ -8116,7 +9144,7 @@
       <w:pPr>
         <w:numPr>
           <w:ilvl w:val="0"/>
-          <w:numId w:val="1007"/>
+          <w:numId w:val="1008"/>
         </w:numPr>
         <w:pStyle w:val="Compact"/>
       </w:pPr>
@@ -8128,7 +9156,7 @@
       <w:pPr>
         <w:numPr>
           <w:ilvl w:val="0"/>
-          <w:numId w:val="1007"/>
+          <w:numId w:val="1008"/>
         </w:numPr>
         <w:pStyle w:val="Compact"/>
       </w:pPr>
@@ -9000,8 +10028,8 @@
         <w:t xml:space="preserve">.</w:t>
       </w:r>
     </w:p>
-    <w:bookmarkEnd w:id="42"/>
-    <w:bookmarkEnd w:id="43"/>
+    <w:bookmarkEnd w:id="44"/>
+    <w:bookmarkEnd w:id="45"/>
     <w:sectPr>
       <w:headerReference r:id="rId9" w:type="default"/>
       <w:footerReference r:id="rId10" w:type="default"/>
@@ -9537,6 +10565,9 @@
     <w:abstractNumId w:val="991"/>
   </w:num>
   <w:num w:numId="1004">
+    <w:abstractNumId w:val="991"/>
+  </w:num>
+  <w:num w:numId="1005">
     <w:abstractNumId w:val="99411"/>
     <w:lvlOverride w:ilvl="0">
       <w:startOverride w:val="1"/>
@@ -9566,7 +10597,7 @@
       <w:startOverride w:val="1"/>
     </w:lvlOverride>
   </w:num>
-  <w:num w:numId="1005">
+  <w:num w:numId="1006">
     <w:abstractNumId w:val="99412"/>
     <w:lvlOverride w:ilvl="0">
       <w:startOverride w:val="2"/>
@@ -9596,7 +10627,7 @@
       <w:startOverride w:val="2"/>
     </w:lvlOverride>
   </w:num>
-  <w:num w:numId="1006">
+  <w:num w:numId="1007">
     <w:abstractNumId w:val="99413"/>
     <w:lvlOverride w:ilvl="0">
       <w:startOverride w:val="3"/>
@@ -9626,7 +10657,7 @@
       <w:startOverride w:val="3"/>
     </w:lvlOverride>
   </w:num>
-  <w:num w:numId="1007">
+  <w:num w:numId="1008">
     <w:abstractNumId w:val="99411"/>
     <w:lvlOverride w:ilvl="0">
       <w:startOverride w:val="1"/>

</xml_diff>

<commit_message>
List every disk and label one only when it is the single raw disk beside the system disk.
</commit_message>
<xml_diff>
--- a/docs/customer/TNMS-9.1-RHEL8-install-without-repo.docx
+++ b/docs/customer/TNMS-9.1-RHEL8-install-without-repo.docx
@@ -597,7 +597,7 @@
         <w:t xml:space="preserve"> </w:t>
       </w:r>
       <w:r>
-        <w:t xml:space="preserve">only reads. It prints the release, the disks, the hostname, and which of the six install files are in</w:t>
+        <w:t xml:space="preserve">only reads. It prints the release, a numbered disk list, the hostname, and which of the six install files are in</w:t>
       </w:r>
       <w:r>
         <w:t xml:space="preserve"> </w:t>
@@ -609,7 +609,22 @@
         <w:t xml:space="preserve">/tmp</w:t>
       </w:r>
       <w:r>
-        <w:t xml:space="preserve">. On a terminal it asks for the data disk, whether to grow</w:t>
+        <w:t xml:space="preserve">. On a terminal it asks for the data disk by number or</w:t>
+      </w:r>
+      <w:r>
+        <w:t xml:space="preserve"> </w:t>
+      </w:r>
+      <w:r>
+        <w:rPr>
+          <w:rStyle w:val="VerbatimChar"/>
+        </w:rPr>
+        <w:t xml:space="preserve">/dev</w:t>
+      </w:r>
+      <w:r>
+        <w:t xml:space="preserve"> </w:t>
+      </w:r>
+      <w:r>
+        <w:t xml:space="preserve">name, whether to grow</w:t>
       </w:r>
       <w:r>
         <w:t xml:space="preserve"> </w:t>
@@ -773,7 +788,37 @@
         <w:t xml:space="preserve">CONFIRM=yes</w:t>
       </w:r>
       <w:r>
-        <w:t xml:space="preserve">. When the layout already matches, it stamps and skips. It does not ask again and it does not repartition.</w:t>
+        <w:t xml:space="preserve">. When the layout already matches, it stamps and skips. A later</w:t>
+      </w:r>
+      <w:r>
+        <w:t xml:space="preserve"> </w:t>
+      </w:r>
+      <w:r>
+        <w:rPr>
+          <w:rStyle w:val="VerbatimChar"/>
+        </w:rPr>
+        <w:t xml:space="preserve">prepare</w:t>
+      </w:r>
+      <w:r>
+        <w:t xml:space="preserve"> </w:t>
+      </w:r>
+      <w:r>
+        <w:t xml:space="preserve">leaves an existing</w:t>
+      </w:r>
+      <w:r>
+        <w:t xml:space="preserve"> </w:t>
+      </w:r>
+      <w:r>
+        <w:rPr>
+          <w:rStyle w:val="VerbatimChar"/>
+        </w:rPr>
+        <w:t xml:space="preserve">datavg-optlv</w:t>
+      </w:r>
+      <w:r>
+        <w:t xml:space="preserve"> </w:t>
+      </w:r>
+      <w:r>
+        <w:t xml:space="preserve">partition in place.</w:t>
       </w:r>
     </w:p>
     <w:p>
@@ -790,7 +835,7 @@
         <w:t xml:space="preserve"> </w:t>
       </w:r>
       <w:r>
-        <w:t xml:space="preserve">then installs Oracle and TNMS. It reads this file before</w:t>
+        <w:t xml:space="preserve">then installs Oracle and TNMS. It reads the Makefile before</w:t>
       </w:r>
       <w:r>
         <w:t xml:space="preserve"> </w:t>
@@ -1403,7 +1448,7 @@
               <w:jc w:val="left"/>
             </w:pPr>
             <w:r>
-              <w:t xml:space="preserve">Whole disk that</w:t>
+              <w:t xml:space="preserve">Eligible whole disk that</w:t>
             </w:r>
             <w:r>
               <w:t xml:space="preserve"> </w:t>
@@ -3040,52 +3085,37 @@
         <w:pStyle w:val="BodyText"/>
       </w:pPr>
       <w:r>
-        <w:t xml:space="preserve">The data-disk default is the single whole disk that is not the OS disk, is at least 100 GB, and has no filesystem and no mount. Zero candidates or more than one means there is no default. If</w:t>
-      </w:r>
-      <w:r>
-        <w:t xml:space="preserve"> </w:t>
-      </w:r>
-      <w:r>
-        <w:rPr>
-          <w:rStyle w:val="VerbatimChar"/>
-        </w:rPr>
-        <w:t xml:space="preserve">rootvg</w:t>
-      </w:r>
-      <w:r>
-        <w:t xml:space="preserve"> </w:t>
-      </w:r>
-      <w:r>
-        <w:t xml:space="preserve">does not have room to grow, scan says how much is free and how much is required, and does not offer the grow.</w:t>
-      </w:r>
-    </w:p>
-    <w:bookmarkEnd w:id="26"/>
-    <w:bookmarkStart w:id="27" w:name="prepare"/>
-    <w:p>
-      <w:pPr>
-        <w:pStyle w:val="Heading3"/>
-      </w:pPr>
-      <w:r>
-        <w:t xml:space="preserve">prepare</w:t>
-      </w:r>
-    </w:p>
-    <w:p>
-      <w:pPr>
-        <w:pStyle w:val="FirstParagraph"/>
-      </w:pPr>
-      <w:r>
-        <w:t xml:space="preserve">Applies the agreed layout and writes</w:t>
-      </w:r>
-      <w:r>
-        <w:t xml:space="preserve"> </w:t>
-      </w:r>
-      <w:r>
-        <w:rPr>
-          <w:rStyle w:val="VerbatimChar"/>
-        </w:rPr>
-        <w:t xml:space="preserve">/var/lib/tnms-install/prepare</w:t>
-      </w:r>
-      <w:r>
-        <w:t xml:space="preserve">. It will not:</w:t>
+        <w:t xml:space="preserve">Scan prints every whole disk. Loop devices and</w:t>
+      </w:r>
+      <w:r>
+        <w:t xml:space="preserve"> </w:t>
+      </w:r>
+      <w:r>
+        <w:rPr>
+          <w:rStyle w:val="VerbatimChar"/>
+        </w:rPr>
+        <w:t xml:space="preserve">rom</w:t>
+      </w:r>
+      <w:r>
+        <w:t xml:space="preserve"> </w:t>
+      </w:r>
+      <w:r>
+        <w:t xml:space="preserve">devices such as</w:t>
+      </w:r>
+      <w:r>
+        <w:t xml:space="preserve"> </w:t>
+      </w:r>
+      <w:r>
+        <w:rPr>
+          <w:rStyle w:val="VerbatimChar"/>
+        </w:rPr>
+        <w:t xml:space="preserve">sr0</w:t>
+      </w:r>
+      <w:r>
+        <w:t xml:space="preserve"> </w:t>
+      </w:r>
+      <w:r>
+        <w:t xml:space="preserve">are left off that list. A disk is eligible only when all of the following are true:</w:t>
       </w:r>
     </w:p>
     <w:p>
@@ -3097,7 +3127,115 @@
         <w:pStyle w:val="Compact"/>
       </w:pPr>
       <w:r>
-        <w:t xml:space="preserve">Partition or label a disk that has a filesystem, a mount, or a child mount, including when the answers name it.</w:t>
+        <w:t xml:space="preserve">It is not a system disk. The system set is every disk reached from</w:t>
+      </w:r>
+      <w:r>
+        <w:t xml:space="preserve"> </w:t>
+      </w:r>
+      <w:r>
+        <w:rPr>
+          <w:rStyle w:val="VerbatimChar"/>
+        </w:rPr>
+        <w:t xml:space="preserve">/</w:t>
+      </w:r>
+      <w:r>
+        <w:t xml:space="preserve">,</w:t>
+      </w:r>
+      <w:r>
+        <w:t xml:space="preserve"> </w:t>
+      </w:r>
+      <w:r>
+        <w:rPr>
+          <w:rStyle w:val="VerbatimChar"/>
+        </w:rPr>
+        <w:t xml:space="preserve">/boot</w:t>
+      </w:r>
+      <w:r>
+        <w:t xml:space="preserve">,</w:t>
+      </w:r>
+      <w:r>
+        <w:t xml:space="preserve"> </w:t>
+      </w:r>
+      <w:r>
+        <w:rPr>
+          <w:rStyle w:val="VerbatimChar"/>
+        </w:rPr>
+        <w:t xml:space="preserve">/boot/efi</w:t>
+      </w:r>
+      <w:r>
+        <w:t xml:space="preserve">,</w:t>
+      </w:r>
+      <w:r>
+        <w:t xml:space="preserve"> </w:t>
+      </w:r>
+      <w:r>
+        <w:rPr>
+          <w:rStyle w:val="VerbatimChar"/>
+        </w:rPr>
+        <w:t xml:space="preserve">/home</w:t>
+      </w:r>
+      <w:r>
+        <w:t xml:space="preserve">,</w:t>
+      </w:r>
+      <w:r>
+        <w:t xml:space="preserve"> </w:t>
+      </w:r>
+      <w:r>
+        <w:rPr>
+          <w:rStyle w:val="VerbatimChar"/>
+        </w:rPr>
+        <w:t xml:space="preserve">/usr</w:t>
+      </w:r>
+      <w:r>
+        <w:t xml:space="preserve">,</w:t>
+      </w:r>
+      <w:r>
+        <w:t xml:space="preserve"> </w:t>
+      </w:r>
+      <w:r>
+        <w:rPr>
+          <w:rStyle w:val="VerbatimChar"/>
+        </w:rPr>
+        <w:t xml:space="preserve">/var</w:t>
+      </w:r>
+      <w:r>
+        <w:t xml:space="preserve">,</w:t>
+      </w:r>
+      <w:r>
+        <w:t xml:space="preserve"> </w:t>
+      </w:r>
+      <w:r>
+        <w:rPr>
+          <w:rStyle w:val="VerbatimChar"/>
+        </w:rPr>
+        <w:t xml:space="preserve">/tmp</w:t>
+      </w:r>
+      <w:r>
+        <w:t xml:space="preserve">,</w:t>
+      </w:r>
+      <w:r>
+        <w:t xml:space="preserve"> </w:t>
+      </w:r>
+      <w:r>
+        <w:rPr>
+          <w:rStyle w:val="VerbatimChar"/>
+        </w:rPr>
+        <w:t xml:space="preserve">/var/log</w:t>
+      </w:r>
+      <w:r>
+        <w:t xml:space="preserve">, or</w:t>
+      </w:r>
+      <w:r>
+        <w:t xml:space="preserve"> </w:t>
+      </w:r>
+      <w:r>
+        <w:rPr>
+          <w:rStyle w:val="VerbatimChar"/>
+        </w:rPr>
+        <w:t xml:space="preserve">/var/tmp</w:t>
+      </w:r>
+      <w:r>
+        <w:t xml:space="preserve">. That includes LVM and a filesystem that sits on the whole disk with no partition.</w:t>
       </w:r>
     </w:p>
     <w:p>
@@ -3109,7 +3247,7 @@
         <w:pStyle w:val="Compact"/>
       </w:pPr>
       <w:r>
-        <w:t xml:space="preserve">Use the OS disk as the data disk.</w:t>
+        <w:t xml:space="preserve">It has no partition table and no partitions. An unpartitioned disk is the eligible shape. A GPT or DOS label is not eligible, even when it has no partitions.</w:t>
       </w:r>
     </w:p>
     <w:p>
@@ -3121,31 +3259,52 @@
         <w:pStyle w:val="Compact"/>
       </w:pPr>
       <w:r>
-        <w:t xml:space="preserve">Continue when</w:t>
-      </w:r>
-      <w:r>
-        <w:t xml:space="preserve"> </w:t>
-      </w:r>
-      <w:r>
-        <w:rPr>
-          <w:rStyle w:val="VerbatimChar"/>
-        </w:rPr>
-        <w:t xml:space="preserve">/home</w:t>
-      </w:r>
-      <w:r>
-        <w:t xml:space="preserve"> </w:t>
-      </w:r>
-      <w:r>
-        <w:t xml:space="preserve">is on a terabyte-scale volume. That means the data disk was added to</w:t>
-      </w:r>
-      <w:r>
-        <w:t xml:space="preserve"> </w:t>
-      </w:r>
-      <w:r>
-        <w:rPr>
-          <w:rStyle w:val="VerbatimChar"/>
-        </w:rPr>
-        <w:t xml:space="preserve">homelv</w:t>
+        <w:rPr>
+          <w:rStyle w:val="VerbatimChar"/>
+        </w:rPr>
+        <w:t xml:space="preserve">lsblk</w:t>
+      </w:r>
+      <w:r>
+        <w:t xml:space="preserve"> </w:t>
+      </w:r>
+      <w:r>
+        <w:t xml:space="preserve">and a signature probe show no filesystem, LVM, RAID, or LUKS signature. The probe is</w:t>
+      </w:r>
+      <w:r>
+        <w:t xml:space="preserve"> </w:t>
+      </w:r>
+      <w:r>
+        <w:rPr>
+          <w:rStyle w:val="VerbatimChar"/>
+        </w:rPr>
+        <w:t xml:space="preserve">wipefs -n</w:t>
+      </w:r>
+      <w:r>
+        <w:t xml:space="preserve">. When</w:t>
+      </w:r>
+      <w:r>
+        <w:t xml:space="preserve"> </w:t>
+      </w:r>
+      <w:r>
+        <w:rPr>
+          <w:rStyle w:val="VerbatimChar"/>
+        </w:rPr>
+        <w:t xml:space="preserve">wipefs</w:t>
+      </w:r>
+      <w:r>
+        <w:t xml:space="preserve"> </w:t>
+      </w:r>
+      <w:r>
+        <w:t xml:space="preserve">is absent, the probe is</w:t>
+      </w:r>
+      <w:r>
+        <w:t xml:space="preserve"> </w:t>
+      </w:r>
+      <w:r>
+        <w:rPr>
+          <w:rStyle w:val="VerbatimChar"/>
+        </w:rPr>
+        <w:t xml:space="preserve">blkid</w:t>
       </w:r>
       <w:r>
         <w:t xml:space="preserve">.</w:t>
@@ -3160,49 +3319,37 @@
         <w:pStyle w:val="Compact"/>
       </w:pPr>
       <w:r>
-        <w:t xml:space="preserve">Mount over</w:t>
-      </w:r>
-      <w:r>
-        <w:t xml:space="preserve"> </w:t>
-      </w:r>
-      <w:r>
-        <w:rPr>
-          <w:rStyle w:val="VerbatimChar"/>
-        </w:rPr>
-        <w:t xml:space="preserve">/opt</w:t>
-      </w:r>
-      <w:r>
-        <w:t xml:space="preserve"> </w:t>
-      </w:r>
-      <w:r>
-        <w:t xml:space="preserve">when</w:t>
-      </w:r>
-      <w:r>
-        <w:t xml:space="preserve"> </w:t>
-      </w:r>
-      <w:r>
-        <w:rPr>
-          <w:rStyle w:val="VerbatimChar"/>
-        </w:rPr>
-        <w:t xml:space="preserve">/opt</w:t>
-      </w:r>
-      <w:r>
-        <w:t xml:space="preserve"> </w:t>
-      </w:r>
-      <w:r>
-        <w:t xml:space="preserve">already contains names and is not already</w:t>
-      </w:r>
-      <w:r>
-        <w:t xml:space="preserve"> </w:t>
-      </w:r>
-      <w:r>
-        <w:rPr>
-          <w:rStyle w:val="VerbatimChar"/>
-        </w:rPr>
-        <w:t xml:space="preserve">datavg-optlv</w:t>
-      </w:r>
-      <w:r>
-        <w:t xml:space="preserve">.</w:t>
+        <w:t xml:space="preserve">Nothing is mounted on it, no child is mounted,</w:t>
+      </w:r>
+      <w:r>
+        <w:t xml:space="preserve"> </w:t>
+      </w:r>
+      <w:r>
+        <w:rPr>
+          <w:rStyle w:val="VerbatimChar"/>
+        </w:rPr>
+        <w:t xml:space="preserve">/sys/block/&lt;name&gt;/holders</w:t>
+      </w:r>
+      <w:r>
+        <w:t xml:space="preserve"> </w:t>
+      </w:r>
+      <w:r>
+        <w:t xml:space="preserve">is empty, and</w:t>
+      </w:r>
+      <w:r>
+        <w:t xml:space="preserve"> </w:t>
+      </w:r>
+      <w:r>
+        <w:rPr>
+          <w:rStyle w:val="VerbatimChar"/>
+        </w:rPr>
+        <w:t xml:space="preserve">/etc/fstab</w:t>
+      </w:r>
+      <w:r>
+        <w:t xml:space="preserve"> </w:t>
+      </w:r>
+      <w:r>
+        <w:t xml:space="preserve">does not name it.</w:t>
       </w:r>
     </w:p>
     <w:p>
@@ -3214,115 +3361,216 @@
         <w:pStyle w:val="Compact"/>
       </w:pPr>
       <w:r>
-        <w:t xml:space="preserve">Append a second copy of an</w:t>
-      </w:r>
-      <w:r>
-        <w:t xml:space="preserve"> </w:t>
-      </w:r>
-      <w:r>
-        <w:rPr>
-          <w:rStyle w:val="VerbatimChar"/>
-        </w:rPr>
-        <w:t xml:space="preserve">/etc/fstab</w:t>
-      </w:r>
-      <w:r>
-        <w:t xml:space="preserve"> </w:t>
-      </w:r>
-      <w:r>
-        <w:t xml:space="preserve">line.</w:t>
+        <w:t xml:space="preserve">Its size is at least 100 GB.</w:t>
+      </w:r>
+    </w:p>
+    <w:p>
+      <w:pPr>
+        <w:pStyle w:val="FirstParagraph"/>
+      </w:pPr>
+      <w:r>
+        <w:t xml:space="preserve">If the disk that holds</w:t>
+      </w:r>
+      <w:r>
+        <w:t xml:space="preserve"> </w:t>
+      </w:r>
+      <w:r>
+        <w:rPr>
+          <w:rStyle w:val="VerbatimChar"/>
+        </w:rPr>
+        <w:t xml:space="preserve">/</w:t>
+      </w:r>
+      <w:r>
+        <w:t xml:space="preserve"> </w:t>
+      </w:r>
+      <w:r>
+        <w:t xml:space="preserve">cannot be identified, no disk is eligible and there is no default. Prepare stops before</w:t>
+      </w:r>
+      <w:r>
+        <w:t xml:space="preserve"> </w:t>
+      </w:r>
+      <w:r>
+        <w:rPr>
+          <w:rStyle w:val="VerbatimChar"/>
+        </w:rPr>
+        <w:t xml:space="preserve">parted</w:t>
+      </w:r>
+      <w:r>
+        <w:t xml:space="preserve"> </w:t>
+      </w:r>
+      <w:r>
+        <w:t xml:space="preserve">in that case.</w:t>
+      </w:r>
+    </w:p>
+    <w:p>
+      <w:pPr>
+        <w:pStyle w:val="BodyText"/>
+      </w:pPr>
+      <w:r>
+        <w:t xml:space="preserve">The default exists only for one shape: one system disk, and exactly one other whole disk, and that other disk is eligible. The prompt is</w:t>
+      </w:r>
+      <w:r>
+        <w:t xml:space="preserve"> </w:t>
+      </w:r>
+      <w:r>
+        <w:rPr>
+          <w:rStyle w:val="VerbatimChar"/>
+        </w:rPr>
+        <w:t xml:space="preserve">Data disk [2]:</w:t>
+      </w:r>
+      <w:r>
+        <w:t xml:space="preserve"> </w:t>
+      </w:r>
+      <w:r>
+        <w:t xml:space="preserve">and Enter accepts that number. Any other shape has no default, and the prompt is</w:t>
+      </w:r>
+      <w:r>
+        <w:t xml:space="preserve"> </w:t>
+      </w:r>
+      <w:r>
+        <w:rPr>
+          <w:rStyle w:val="VerbatimChar"/>
+        </w:rPr>
+        <w:t xml:space="preserve">Data disk:</w:t>
+      </w:r>
+      <w:r>
+        <w:t xml:space="preserve">. That includes two eligible disks, one eligible disk plus any other non-system disk, and a machine whose only extra disks are partitioned or signed. The operator types a number or a</w:t>
+      </w:r>
+      <w:r>
+        <w:t xml:space="preserve"> </w:t>
+      </w:r>
+      <w:r>
+        <w:rPr>
+          <w:rStyle w:val="VerbatimChar"/>
+        </w:rPr>
+        <w:t xml:space="preserve">/dev</w:t>
+      </w:r>
+      <w:r>
+        <w:t xml:space="preserve"> </w:t>
+      </w:r>
+      <w:r>
+        <w:t xml:space="preserve">name. An ineligible choice is rejected with that disk’s reason, and the question repeats.</w:t>
+      </w:r>
+    </w:p>
+    <w:p>
+      <w:pPr>
+        <w:pStyle w:val="SourceCode"/>
+      </w:pPr>
+      <w:r>
+        <w:rPr>
+          <w:rStyle w:val="VerbatimChar"/>
+        </w:rPr>
+        <w:t xml:space="preserve">disks:</w:t>
+      </w:r>
+      <w:r>
+        <w:br/>
+      </w:r>
+      <w:r>
+        <w:rPr>
+          <w:rStyle w:val="VerbatimChar"/>
+        </w:rPr>
+        <w:t xml:space="preserve">  1  nvme0n1    64G   system, holds /</w:t>
+      </w:r>
+      <w:r>
+        <w:br/>
+      </w:r>
+      <w:r>
+        <w:rPr>
+          <w:rStyle w:val="VerbatimChar"/>
+        </w:rPr>
+        <w:t xml:space="preserve">  2  nvme0n2   1.0T   eligible, raw, no partition table, no signature</w:t>
+      </w:r>
+      <w:r>
+        <w:br/>
+      </w:r>
+      <w:r>
+        <w:rPr>
+          <w:rStyle w:val="VerbatimChar"/>
+        </w:rPr>
+        <w:t xml:space="preserve">  3  sdb        16G   not eligible, is smaller than 100 GB</w:t>
+      </w:r>
+      <w:r>
+        <w:br/>
+      </w:r>
+      <w:r>
+        <w:rPr>
+          <w:rStyle w:val="VerbatimChar"/>
+        </w:rPr>
+        <w:t xml:space="preserve">Data disk:</w:t>
+      </w:r>
+    </w:p>
+    <w:p>
+      <w:pPr>
+        <w:pStyle w:val="FirstParagraph"/>
+      </w:pPr>
+      <w:r>
+        <w:t xml:space="preserve">If</w:t>
+      </w:r>
+      <w:r>
+        <w:t xml:space="preserve"> </w:t>
+      </w:r>
+      <w:r>
+        <w:rPr>
+          <w:rStyle w:val="VerbatimChar"/>
+        </w:rPr>
+        <w:t xml:space="preserve">rootvg</w:t>
+      </w:r>
+      <w:r>
+        <w:t xml:space="preserve"> </w:t>
+      </w:r>
+      <w:r>
+        <w:t xml:space="preserve">does not have room to grow, scan says how much is free and how much is required, and does not offer the grow.</w:t>
+      </w:r>
+    </w:p>
+    <w:bookmarkEnd w:id="26"/>
+    <w:bookmarkStart w:id="27" w:name="prepare"/>
+    <w:p>
+      <w:pPr>
+        <w:pStyle w:val="Heading3"/>
+      </w:pPr>
+      <w:r>
+        <w:t xml:space="preserve">prepare</w:t>
+      </w:r>
+    </w:p>
+    <w:p>
+      <w:pPr>
+        <w:pStyle w:val="FirstParagraph"/>
+      </w:pPr>
+      <w:r>
+        <w:t xml:space="preserve">Applies the agreed layout and writes</w:t>
+      </w:r>
+      <w:r>
+        <w:t xml:space="preserve"> </w:t>
+      </w:r>
+      <w:r>
+        <w:rPr>
+          <w:rStyle w:val="VerbatimChar"/>
+        </w:rPr>
+        <w:t xml:space="preserve">/var/lib/tnms-install/prepare</w:t>
+      </w:r>
+      <w:r>
+        <w:t xml:space="preserve">. It will not:</w:t>
       </w:r>
     </w:p>
     <w:p>
       <w:pPr>
         <w:numPr>
           <w:ilvl w:val="0"/>
-          <w:numId w:val="1003"/>
+          <w:numId w:val="1004"/>
         </w:numPr>
         <w:pStyle w:val="Compact"/>
       </w:pPr>
       <w:r>
-        <w:t xml:space="preserve">Run</w:t>
-      </w:r>
-      <w:r>
-        <w:t xml:space="preserve"> </w:t>
-      </w:r>
-      <w:r>
-        <w:rPr>
-          <w:rStyle w:val="VerbatimChar"/>
-        </w:rPr>
-        <w:t xml:space="preserve">restorecon</w:t>
-      </w:r>
-      <w:r>
-        <w:t xml:space="preserve"> </w:t>
-      </w:r>
-      <w:r>
-        <w:t xml:space="preserve">on the</w:t>
-      </w:r>
-      <w:r>
-        <w:t xml:space="preserve"> </w:t>
-      </w:r>
-      <w:r>
-        <w:rPr>
-          <w:rStyle w:val="VerbatimChar"/>
-        </w:rPr>
-        <w:t xml:space="preserve">/nokia</w:t>
-      </w:r>
-      <w:r>
-        <w:t xml:space="preserve"> </w:t>
-      </w:r>
-      <w:r>
-        <w:t xml:space="preserve">or</w:t>
-      </w:r>
-      <w:r>
-        <w:t xml:space="preserve"> </w:t>
-      </w:r>
-      <w:r>
-        <w:rPr>
-          <w:rStyle w:val="VerbatimChar"/>
-        </w:rPr>
-        <w:t xml:space="preserve">/oradata</w:t>
-      </w:r>
-      <w:r>
-        <w:t xml:space="preserve"> </w:t>
-      </w:r>
-      <w:r>
-        <w:t xml:space="preserve">bind mounts. After</w:t>
-      </w:r>
-      <w:r>
-        <w:t xml:space="preserve"> </w:t>
-      </w:r>
-      <w:r>
-        <w:rPr>
-          <w:rStyle w:val="VerbatimChar"/>
-        </w:rPr>
-        <w:t xml:space="preserve">restorecon -RF /opt</w:t>
-      </w:r>
-      <w:r>
-        <w:t xml:space="preserve">, it sets</w:t>
-      </w:r>
-      <w:r>
-        <w:t xml:space="preserve"> </w:t>
-      </w:r>
-      <w:r>
-        <w:rPr>
-          <w:rStyle w:val="VerbatimChar"/>
-        </w:rPr>
-        <w:t xml:space="preserve">swapfile_t</w:t>
-      </w:r>
-      <w:r>
-        <w:t xml:space="preserve"> </w:t>
-      </w:r>
-      <w:r>
-        <w:t xml:space="preserve">on</w:t>
-      </w:r>
-      <w:r>
-        <w:t xml:space="preserve"> </w:t>
-      </w:r>
-      <w:r>
-        <w:rPr>
-          <w:rStyle w:val="VerbatimChar"/>
-        </w:rPr>
-        <w:t xml:space="preserve">/opt/swapfile</w:t>
+        <w:t xml:space="preserve">Label a disk that is not eligible, including when the answers file names it. The same checks run again immediately before</w:t>
+      </w:r>
+      <w:r>
+        <w:t xml:space="preserve"> </w:t>
+      </w:r>
+      <w:r>
+        <w:rPr>
+          <w:rStyle w:val="VerbatimChar"/>
+        </w:rPr>
+        <w:t xml:space="preserve">parted</w:t>
       </w:r>
       <w:r>
         <w:t xml:space="preserve">.</w:t>
@@ -3332,58 +3580,286 @@
       <w:pPr>
         <w:numPr>
           <w:ilvl w:val="0"/>
-          <w:numId w:val="1003"/>
+          <w:numId w:val="1004"/>
         </w:numPr>
         <w:pStyle w:val="Compact"/>
       </w:pPr>
       <w:r>
-        <w:t xml:space="preserve">Repartition when</w:t>
-      </w:r>
-      <w:r>
-        <w:t xml:space="preserve"> </w:t>
-      </w:r>
-      <w:r>
-        <w:rPr>
-          <w:rStyle w:val="VerbatimChar"/>
-        </w:rPr>
-        <w:t xml:space="preserve">/opt</w:t>
-      </w:r>
-      <w:r>
-        <w:t xml:space="preserve"> </w:t>
-      </w:r>
-      <w:r>
-        <w:t xml:space="preserve">is already</w:t>
-      </w:r>
-      <w:r>
-        <w:t xml:space="preserve"> </w:t>
-      </w:r>
-      <w:r>
-        <w:rPr>
-          <w:rStyle w:val="VerbatimChar"/>
-        </w:rPr>
-        <w:t xml:space="preserve">datavg-optlv</w:t>
-      </w:r>
-      <w:r>
-        <w:t xml:space="preserve">. It only fills in missing binds, swap, or fstab lines.</w:t>
+        <w:t xml:space="preserve">Use a system disk as the data disk.</w:t>
       </w:r>
     </w:p>
     <w:p>
       <w:pPr>
         <w:numPr>
           <w:ilvl w:val="0"/>
-          <w:numId w:val="1003"/>
+          <w:numId w:val="1004"/>
         </w:numPr>
         <w:pStyle w:val="Compact"/>
       </w:pPr>
       <w:r>
-        <w:t xml:space="preserve">Grow a volume that is already at the target size.</w:t>
+        <w:t xml:space="preserve">Continue when</w:t>
+      </w:r>
+      <w:r>
+        <w:t xml:space="preserve"> </w:t>
+      </w:r>
+      <w:r>
+        <w:rPr>
+          <w:rStyle w:val="VerbatimChar"/>
+        </w:rPr>
+        <w:t xml:space="preserve">/home</w:t>
+      </w:r>
+      <w:r>
+        <w:t xml:space="preserve"> </w:t>
+      </w:r>
+      <w:r>
+        <w:t xml:space="preserve">is on a terabyte-scale volume. That means the data disk was added to</w:t>
+      </w:r>
+      <w:r>
+        <w:t xml:space="preserve"> </w:t>
+      </w:r>
+      <w:r>
+        <w:rPr>
+          <w:rStyle w:val="VerbatimChar"/>
+        </w:rPr>
+        <w:t xml:space="preserve">homelv</w:t>
+      </w:r>
+      <w:r>
+        <w:t xml:space="preserve">.</w:t>
       </w:r>
     </w:p>
     <w:p>
       <w:pPr>
         <w:numPr>
           <w:ilvl w:val="0"/>
-          <w:numId w:val="1003"/>
+          <w:numId w:val="1004"/>
+        </w:numPr>
+        <w:pStyle w:val="Compact"/>
+      </w:pPr>
+      <w:r>
+        <w:t xml:space="preserve">Mount over</w:t>
+      </w:r>
+      <w:r>
+        <w:t xml:space="preserve"> </w:t>
+      </w:r>
+      <w:r>
+        <w:rPr>
+          <w:rStyle w:val="VerbatimChar"/>
+        </w:rPr>
+        <w:t xml:space="preserve">/opt</w:t>
+      </w:r>
+      <w:r>
+        <w:t xml:space="preserve"> </w:t>
+      </w:r>
+      <w:r>
+        <w:t xml:space="preserve">when</w:t>
+      </w:r>
+      <w:r>
+        <w:t xml:space="preserve"> </w:t>
+      </w:r>
+      <w:r>
+        <w:rPr>
+          <w:rStyle w:val="VerbatimChar"/>
+        </w:rPr>
+        <w:t xml:space="preserve">/opt</w:t>
+      </w:r>
+      <w:r>
+        <w:t xml:space="preserve"> </w:t>
+      </w:r>
+      <w:r>
+        <w:t xml:space="preserve">already contains names and is not already</w:t>
+      </w:r>
+      <w:r>
+        <w:t xml:space="preserve"> </w:t>
+      </w:r>
+      <w:r>
+        <w:rPr>
+          <w:rStyle w:val="VerbatimChar"/>
+        </w:rPr>
+        <w:t xml:space="preserve">datavg-optlv</w:t>
+      </w:r>
+      <w:r>
+        <w:t xml:space="preserve">.</w:t>
+      </w:r>
+    </w:p>
+    <w:p>
+      <w:pPr>
+        <w:numPr>
+          <w:ilvl w:val="0"/>
+          <w:numId w:val="1004"/>
+        </w:numPr>
+        <w:pStyle w:val="Compact"/>
+      </w:pPr>
+      <w:r>
+        <w:t xml:space="preserve">Append a second copy of an</w:t>
+      </w:r>
+      <w:r>
+        <w:t xml:space="preserve"> </w:t>
+      </w:r>
+      <w:r>
+        <w:rPr>
+          <w:rStyle w:val="VerbatimChar"/>
+        </w:rPr>
+        <w:t xml:space="preserve">/etc/fstab</w:t>
+      </w:r>
+      <w:r>
+        <w:t xml:space="preserve"> </w:t>
+      </w:r>
+      <w:r>
+        <w:t xml:space="preserve">line.</w:t>
+      </w:r>
+    </w:p>
+    <w:p>
+      <w:pPr>
+        <w:numPr>
+          <w:ilvl w:val="0"/>
+          <w:numId w:val="1004"/>
+        </w:numPr>
+        <w:pStyle w:val="Compact"/>
+      </w:pPr>
+      <w:r>
+        <w:t xml:space="preserve">Run</w:t>
+      </w:r>
+      <w:r>
+        <w:t xml:space="preserve"> </w:t>
+      </w:r>
+      <w:r>
+        <w:rPr>
+          <w:rStyle w:val="VerbatimChar"/>
+        </w:rPr>
+        <w:t xml:space="preserve">restorecon</w:t>
+      </w:r>
+      <w:r>
+        <w:t xml:space="preserve"> </w:t>
+      </w:r>
+      <w:r>
+        <w:t xml:space="preserve">on the</w:t>
+      </w:r>
+      <w:r>
+        <w:t xml:space="preserve"> </w:t>
+      </w:r>
+      <w:r>
+        <w:rPr>
+          <w:rStyle w:val="VerbatimChar"/>
+        </w:rPr>
+        <w:t xml:space="preserve">/nokia</w:t>
+      </w:r>
+      <w:r>
+        <w:t xml:space="preserve"> </w:t>
+      </w:r>
+      <w:r>
+        <w:t xml:space="preserve">or</w:t>
+      </w:r>
+      <w:r>
+        <w:t xml:space="preserve"> </w:t>
+      </w:r>
+      <w:r>
+        <w:rPr>
+          <w:rStyle w:val="VerbatimChar"/>
+        </w:rPr>
+        <w:t xml:space="preserve">/oradata</w:t>
+      </w:r>
+      <w:r>
+        <w:t xml:space="preserve"> </w:t>
+      </w:r>
+      <w:r>
+        <w:t xml:space="preserve">bind mounts. After</w:t>
+      </w:r>
+      <w:r>
+        <w:t xml:space="preserve"> </w:t>
+      </w:r>
+      <w:r>
+        <w:rPr>
+          <w:rStyle w:val="VerbatimChar"/>
+        </w:rPr>
+        <w:t xml:space="preserve">restorecon -RF /opt</w:t>
+      </w:r>
+      <w:r>
+        <w:t xml:space="preserve">, it sets</w:t>
+      </w:r>
+      <w:r>
+        <w:t xml:space="preserve"> </w:t>
+      </w:r>
+      <w:r>
+        <w:rPr>
+          <w:rStyle w:val="VerbatimChar"/>
+        </w:rPr>
+        <w:t xml:space="preserve">swapfile_t</w:t>
+      </w:r>
+      <w:r>
+        <w:t xml:space="preserve"> </w:t>
+      </w:r>
+      <w:r>
+        <w:t xml:space="preserve">on</w:t>
+      </w:r>
+      <w:r>
+        <w:t xml:space="preserve"> </w:t>
+      </w:r>
+      <w:r>
+        <w:rPr>
+          <w:rStyle w:val="VerbatimChar"/>
+        </w:rPr>
+        <w:t xml:space="preserve">/opt/swapfile</w:t>
+      </w:r>
+      <w:r>
+        <w:t xml:space="preserve">.</w:t>
+      </w:r>
+    </w:p>
+    <w:p>
+      <w:pPr>
+        <w:numPr>
+          <w:ilvl w:val="0"/>
+          <w:numId w:val="1004"/>
+        </w:numPr>
+        <w:pStyle w:val="Compact"/>
+      </w:pPr>
+      <w:r>
+        <w:t xml:space="preserve">Repartition when</w:t>
+      </w:r>
+      <w:r>
+        <w:t xml:space="preserve"> </w:t>
+      </w:r>
+      <w:r>
+        <w:rPr>
+          <w:rStyle w:val="VerbatimChar"/>
+        </w:rPr>
+        <w:t xml:space="preserve">/opt</w:t>
+      </w:r>
+      <w:r>
+        <w:t xml:space="preserve"> </w:t>
+      </w:r>
+      <w:r>
+        <w:t xml:space="preserve">is already</w:t>
+      </w:r>
+      <w:r>
+        <w:t xml:space="preserve"> </w:t>
+      </w:r>
+      <w:r>
+        <w:rPr>
+          <w:rStyle w:val="VerbatimChar"/>
+        </w:rPr>
+        <w:t xml:space="preserve">datavg-optlv</w:t>
+      </w:r>
+      <w:r>
+        <w:t xml:space="preserve">. It only fills in missing binds, swap, or fstab lines.</w:t>
+      </w:r>
+    </w:p>
+    <w:p>
+      <w:pPr>
+        <w:numPr>
+          <w:ilvl w:val="0"/>
+          <w:numId w:val="1004"/>
+        </w:numPr>
+        <w:pStyle w:val="Compact"/>
+      </w:pPr>
+      <w:r>
+        <w:t xml:space="preserve">Grow a volume that is already at the target size.</w:t>
+      </w:r>
+    </w:p>
+    <w:p>
+      <w:pPr>
+        <w:numPr>
+          <w:ilvl w:val="0"/>
+          <w:numId w:val="1004"/>
         </w:numPr>
         <w:pStyle w:val="Compact"/>
       </w:pPr>
@@ -7980,7 +8456,7 @@
       <w:pPr>
         <w:numPr>
           <w:ilvl w:val="0"/>
-          <w:numId w:val="1004"/>
+          <w:numId w:val="1005"/>
         </w:numPr>
         <w:pStyle w:val="Compact"/>
       </w:pPr>
@@ -7995,317 +8471,6 @@
       </w:r>
       <w:r>
         <w:t xml:space="preserve">is the virtual screen. It is a screen held in memory. No monitor is attached to it.</w:t>
-      </w:r>
-    </w:p>
-    <w:p>
-      <w:pPr>
-        <w:numPr>
-          <w:ilvl w:val="0"/>
-          <w:numId w:val="1004"/>
-        </w:numPr>
-        <w:pStyle w:val="Compact"/>
-      </w:pPr>
-      <w:r>
-        <w:rPr>
-          <w:rStyle w:val="VerbatimChar"/>
-        </w:rPr>
-        <w:t xml:space="preserve">:99</w:t>
-      </w:r>
-      <w:r>
-        <w:t xml:space="preserve"> </w:t>
-      </w:r>
-      <w:r>
-        <w:t xml:space="preserve">is the name of that screen.</w:t>
-      </w:r>
-      <w:r>
-        <w:t xml:space="preserve"> </w:t>
-      </w:r>
-      <w:r>
-        <w:rPr>
-          <w:rStyle w:val="VerbatimChar"/>
-        </w:rPr>
-        <w:t xml:space="preserve">export DISPLAY=:99</w:t>
-      </w:r>
-      <w:r>
-        <w:t xml:space="preserve"> </w:t>
-      </w:r>
-      <w:r>
-        <w:t xml:space="preserve">is the line that sent the installer there. The installer window is drawn on</w:t>
-      </w:r>
-      <w:r>
-        <w:t xml:space="preserve"> </w:t>
-      </w:r>
-      <w:r>
-        <w:rPr>
-          <w:rStyle w:val="VerbatimChar"/>
-        </w:rPr>
-        <w:t xml:space="preserve">:99</w:t>
-      </w:r>
-      <w:r>
-        <w:t xml:space="preserve">.</w:t>
-      </w:r>
-    </w:p>
-    <w:p>
-      <w:pPr>
-        <w:numPr>
-          <w:ilvl w:val="0"/>
-          <w:numId w:val="1004"/>
-        </w:numPr>
-        <w:pStyle w:val="Compact"/>
-      </w:pPr>
-      <w:r>
-        <w:rPr>
-          <w:rStyle w:val="VerbatimChar"/>
-        </w:rPr>
-        <w:t xml:space="preserve">-screen 0 1400x900x24</w:t>
-      </w:r>
-      <w:r>
-        <w:t xml:space="preserve"> </w:t>
-      </w:r>
-      <w:r>
-        <w:t xml:space="preserve">is one screen, 1400 by 900 pixels, 24-bit color. The wizard fits inside that rectangle.</w:t>
-      </w:r>
-    </w:p>
-    <w:p>
-      <w:pPr>
-        <w:numPr>
-          <w:ilvl w:val="0"/>
-          <w:numId w:val="1004"/>
-        </w:numPr>
-        <w:pStyle w:val="Compact"/>
-      </w:pPr>
-      <w:r>
-        <w:rPr>
-          <w:rStyle w:val="VerbatimChar"/>
-        </w:rPr>
-        <w:t xml:space="preserve">-ac</w:t>
-      </w:r>
-      <w:r>
-        <w:t xml:space="preserve"> </w:t>
-      </w:r>
-      <w:r>
-        <w:t xml:space="preserve">lets another program on this server read the screen. That is what makes the screenshot command below work.</w:t>
-      </w:r>
-    </w:p>
-    <w:p>
-      <w:pPr>
-        <w:numPr>
-          <w:ilvl w:val="0"/>
-          <w:numId w:val="1004"/>
-        </w:numPr>
-        <w:pStyle w:val="Compact"/>
-      </w:pPr>
-      <w:r>
-        <w:t xml:space="preserve">A line that matches means the screen is up. The shell redirection</w:t>
-      </w:r>
-      <w:r>
-        <w:t xml:space="preserve"> </w:t>
-      </w:r>
-      <w:r>
-        <w:rPr>
-          <w:rStyle w:val="VerbatimChar"/>
-        </w:rPr>
-        <w:t xml:space="preserve">&gt;/tmp/tnms-gui/xvfb.log</w:t>
-      </w:r>
-      <w:r>
-        <w:t xml:space="preserve"> </w:t>
-      </w:r>
-      <w:r>
-        <w:t xml:space="preserve">and the</w:t>
-      </w:r>
-      <w:r>
-        <w:t xml:space="preserve"> </w:t>
-      </w:r>
-      <w:r>
-        <w:rPr>
-          <w:rStyle w:val="VerbatimChar"/>
-        </w:rPr>
-        <w:t xml:space="preserve">&amp;</w:t>
-      </w:r>
-      <w:r>
-        <w:t xml:space="preserve"> </w:t>
-      </w:r>
-      <w:r>
-        <w:t xml:space="preserve">are absent here. Those belong to the shell that started Xvfb, and they are not part of the process command line.</w:t>
-      </w:r>
-    </w:p>
-    <w:p>
-      <w:pPr>
-        <w:pStyle w:val="FirstParagraph"/>
-      </w:pPr>
-      <w:r>
-        <w:t xml:space="preserve">Both SSH sessions show only text. The wizard is a picture on display</w:t>
-      </w:r>
-      <w:r>
-        <w:t xml:space="preserve"> </w:t>
-      </w:r>
-      <w:r>
-        <w:rPr>
-          <w:rStyle w:val="VerbatimChar"/>
-        </w:rPr>
-        <w:t xml:space="preserve">:99</w:t>
-      </w:r>
-      <w:r>
-        <w:t xml:space="preserve">. You see a page by saving that picture in the second SSH session, downloading the file to the workstation, and opening the file there. The numbered list below is the questions. The picture tells you which number you are on.</w:t>
-      </w:r>
-    </w:p>
-    <w:p>
-      <w:pPr>
-        <w:pStyle w:val="BodyText"/>
-      </w:pPr>
-      <w:r>
-        <w:t xml:space="preserve">If</w:t>
-      </w:r>
-      <w:r>
-        <w:t xml:space="preserve"> </w:t>
-      </w:r>
-      <w:r>
-        <w:rPr>
-          <w:rStyle w:val="VerbatimChar"/>
-        </w:rPr>
-        <w:t xml:space="preserve">ps -C Xvfb -o args=</w:t>
-      </w:r>
-      <w:r>
-        <w:t xml:space="preserve"> </w:t>
-      </w:r>
-      <w:r>
-        <w:t xml:space="preserve">prints nothing, the virtual screen is not running. Start Xvfb again before</w:t>
-      </w:r>
-      <w:r>
-        <w:t xml:space="preserve"> </w:t>
-      </w:r>
-      <w:r>
-        <w:rPr>
-          <w:rStyle w:val="VerbatimChar"/>
-        </w:rPr>
-        <w:t xml:space="preserve">./TNMS.bin</w:t>
-      </w:r>
-      <w:r>
-        <w:t xml:space="preserve">.</w:t>
-      </w:r>
-    </w:p>
-    <w:p>
-      <w:pPr>
-        <w:pStyle w:val="BodyText"/>
-      </w:pPr>
-      <w:r>
-        <w:t xml:space="preserve">Install the picture program once. In the second SSH session:</w:t>
-      </w:r>
-    </w:p>
-    <w:p>
-      <w:pPr>
-        <w:pStyle w:val="SourceCode"/>
-      </w:pPr>
-      <w:r>
-        <w:rPr>
-          <w:rStyle w:val="ExtensionTok"/>
-        </w:rPr>
-        <w:t xml:space="preserve">dnf</w:t>
-      </w:r>
-      <w:r>
-        <w:rPr>
-          <w:rStyle w:val="NormalTok"/>
-        </w:rPr>
-        <w:t xml:space="preserve"> </w:t>
-      </w:r>
-      <w:r>
-        <w:rPr>
-          <w:rStyle w:val="AttributeTok"/>
-        </w:rPr>
-        <w:t xml:space="preserve">-y</w:t>
-      </w:r>
-      <w:r>
-        <w:rPr>
-          <w:rStyle w:val="NormalTok"/>
-        </w:rPr>
-        <w:t xml:space="preserve"> install ImageMagick</w:t>
-      </w:r>
-    </w:p>
-    <w:p>
-      <w:pPr>
-        <w:pStyle w:val="FirstParagraph"/>
-      </w:pPr>
-      <w:r>
-        <w:rPr>
-          <w:bCs/>
-          <w:b/>
-        </w:rPr>
-        <w:t xml:space="preserve">Expected output:</w:t>
-      </w:r>
-    </w:p>
-    <w:p>
-      <w:pPr>
-        <w:pStyle w:val="BodyText"/>
-      </w:pPr>
-      <w:r>
-        <w:t xml:space="preserve">The command ends with:</w:t>
-      </w:r>
-    </w:p>
-    <w:p>
-      <w:pPr>
-        <w:pStyle w:val="SourceCode"/>
-      </w:pPr>
-      <w:r>
-        <w:rPr>
-          <w:rStyle w:val="VerbatimChar"/>
-        </w:rPr>
-        <w:t xml:space="preserve">Complete!</w:t>
-      </w:r>
-    </w:p>
-    <w:p>
-      <w:pPr>
-        <w:pStyle w:val="FirstParagraph"/>
-      </w:pPr>
-      <w:r>
-        <w:rPr>
-          <w:rStyle w:val="VerbatimChar"/>
-        </w:rPr>
-        <w:t xml:space="preserve">dnf</w:t>
-      </w:r>
-      <w:r>
-        <w:t xml:space="preserve"> </w:t>
-      </w:r>
-      <w:r>
-        <w:t xml:space="preserve">installs</w:t>
-      </w:r>
-      <w:r>
-        <w:t xml:space="preserve"> </w:t>
-      </w:r>
-      <w:r>
-        <w:rPr>
-          <w:rStyle w:val="VerbatimChar"/>
-        </w:rPr>
-        <w:t xml:space="preserve">import</w:t>
-      </w:r>
-      <w:r>
-        <w:t xml:space="preserve">. It does not take a picture. Do not run</w:t>
-      </w:r>
-      <w:r>
-        <w:t xml:space="preserve"> </w:t>
-      </w:r>
-      <w:r>
-        <w:rPr>
-          <w:rStyle w:val="VerbatimChar"/>
-        </w:rPr>
-        <w:t xml:space="preserve">dnf</w:t>
-      </w:r>
-      <w:r>
-        <w:t xml:space="preserve"> </w:t>
-      </w:r>
-      <w:r>
-        <w:t xml:space="preserve">again.</w:t>
-      </w:r>
-    </w:p>
-    <w:p>
-      <w:pPr>
-        <w:pStyle w:val="BodyText"/>
-      </w:pPr>
-      <w:r>
-        <w:rPr>
-          <w:bCs/>
-          <w:b/>
-        </w:rPr>
-        <w:t xml:space="preserve">For every wizard page, use these three windows in this order.</w:t>
       </w:r>
     </w:p>
     <w:p>
@@ -8317,7 +8482,190 @@
         <w:pStyle w:val="Compact"/>
       </w:pPr>
       <w:r>
-        <w:t xml:space="preserve">Second SSH session. Save the page and let the workstation read the file:</w:t>
+        <w:rPr>
+          <w:rStyle w:val="VerbatimChar"/>
+        </w:rPr>
+        <w:t xml:space="preserve">:99</w:t>
+      </w:r>
+      <w:r>
+        <w:t xml:space="preserve"> </w:t>
+      </w:r>
+      <w:r>
+        <w:t xml:space="preserve">is the name of that screen.</w:t>
+      </w:r>
+      <w:r>
+        <w:t xml:space="preserve"> </w:t>
+      </w:r>
+      <w:r>
+        <w:rPr>
+          <w:rStyle w:val="VerbatimChar"/>
+        </w:rPr>
+        <w:t xml:space="preserve">export DISPLAY=:99</w:t>
+      </w:r>
+      <w:r>
+        <w:t xml:space="preserve"> </w:t>
+      </w:r>
+      <w:r>
+        <w:t xml:space="preserve">is the line that sent the installer there. The installer window is drawn on</w:t>
+      </w:r>
+      <w:r>
+        <w:t xml:space="preserve"> </w:t>
+      </w:r>
+      <w:r>
+        <w:rPr>
+          <w:rStyle w:val="VerbatimChar"/>
+        </w:rPr>
+        <w:t xml:space="preserve">:99</w:t>
+      </w:r>
+      <w:r>
+        <w:t xml:space="preserve">.</w:t>
+      </w:r>
+    </w:p>
+    <w:p>
+      <w:pPr>
+        <w:numPr>
+          <w:ilvl w:val="0"/>
+          <w:numId w:val="1005"/>
+        </w:numPr>
+        <w:pStyle w:val="Compact"/>
+      </w:pPr>
+      <w:r>
+        <w:rPr>
+          <w:rStyle w:val="VerbatimChar"/>
+        </w:rPr>
+        <w:t xml:space="preserve">-screen 0 1400x900x24</w:t>
+      </w:r>
+      <w:r>
+        <w:t xml:space="preserve"> </w:t>
+      </w:r>
+      <w:r>
+        <w:t xml:space="preserve">is one screen, 1400 by 900 pixels, 24-bit color. The wizard fits inside that rectangle.</w:t>
+      </w:r>
+    </w:p>
+    <w:p>
+      <w:pPr>
+        <w:numPr>
+          <w:ilvl w:val="0"/>
+          <w:numId w:val="1005"/>
+        </w:numPr>
+        <w:pStyle w:val="Compact"/>
+      </w:pPr>
+      <w:r>
+        <w:rPr>
+          <w:rStyle w:val="VerbatimChar"/>
+        </w:rPr>
+        <w:t xml:space="preserve">-ac</w:t>
+      </w:r>
+      <w:r>
+        <w:t xml:space="preserve"> </w:t>
+      </w:r>
+      <w:r>
+        <w:t xml:space="preserve">lets another program on this server read the screen. That is what makes the screenshot command below work.</w:t>
+      </w:r>
+    </w:p>
+    <w:p>
+      <w:pPr>
+        <w:numPr>
+          <w:ilvl w:val="0"/>
+          <w:numId w:val="1005"/>
+        </w:numPr>
+        <w:pStyle w:val="Compact"/>
+      </w:pPr>
+      <w:r>
+        <w:t xml:space="preserve">A line that matches means the screen is up. The shell redirection</w:t>
+      </w:r>
+      <w:r>
+        <w:t xml:space="preserve"> </w:t>
+      </w:r>
+      <w:r>
+        <w:rPr>
+          <w:rStyle w:val="VerbatimChar"/>
+        </w:rPr>
+        <w:t xml:space="preserve">&gt;/tmp/tnms-gui/xvfb.log</w:t>
+      </w:r>
+      <w:r>
+        <w:t xml:space="preserve"> </w:t>
+      </w:r>
+      <w:r>
+        <w:t xml:space="preserve">and the</w:t>
+      </w:r>
+      <w:r>
+        <w:t xml:space="preserve"> </w:t>
+      </w:r>
+      <w:r>
+        <w:rPr>
+          <w:rStyle w:val="VerbatimChar"/>
+        </w:rPr>
+        <w:t xml:space="preserve">&amp;</w:t>
+      </w:r>
+      <w:r>
+        <w:t xml:space="preserve"> </w:t>
+      </w:r>
+      <w:r>
+        <w:t xml:space="preserve">are absent here. Those belong to the shell that started Xvfb, and they are not part of the process command line.</w:t>
+      </w:r>
+    </w:p>
+    <w:p>
+      <w:pPr>
+        <w:pStyle w:val="FirstParagraph"/>
+      </w:pPr>
+      <w:r>
+        <w:t xml:space="preserve">Both SSH sessions show only text. The wizard is a picture on display</w:t>
+      </w:r>
+      <w:r>
+        <w:t xml:space="preserve"> </w:t>
+      </w:r>
+      <w:r>
+        <w:rPr>
+          <w:rStyle w:val="VerbatimChar"/>
+        </w:rPr>
+        <w:t xml:space="preserve">:99</w:t>
+      </w:r>
+      <w:r>
+        <w:t xml:space="preserve">. You see a page by saving that picture in the second SSH session, downloading the file to the workstation, and opening the file there. The numbered list below is the questions. The picture tells you which number you are on.</w:t>
+      </w:r>
+    </w:p>
+    <w:p>
+      <w:pPr>
+        <w:pStyle w:val="BodyText"/>
+      </w:pPr>
+      <w:r>
+        <w:t xml:space="preserve">If</w:t>
+      </w:r>
+      <w:r>
+        <w:t xml:space="preserve"> </w:t>
+      </w:r>
+      <w:r>
+        <w:rPr>
+          <w:rStyle w:val="VerbatimChar"/>
+        </w:rPr>
+        <w:t xml:space="preserve">ps -C Xvfb -o args=</w:t>
+      </w:r>
+      <w:r>
+        <w:t xml:space="preserve"> </w:t>
+      </w:r>
+      <w:r>
+        <w:t xml:space="preserve">prints nothing, the virtual screen is not running. Start Xvfb again before</w:t>
+      </w:r>
+      <w:r>
+        <w:t xml:space="preserve"> </w:t>
+      </w:r>
+      <w:r>
+        <w:rPr>
+          <w:rStyle w:val="VerbatimChar"/>
+        </w:rPr>
+        <w:t xml:space="preserve">./TNMS.bin</w:t>
+      </w:r>
+      <w:r>
+        <w:t xml:space="preserve">.</w:t>
+      </w:r>
+    </w:p>
+    <w:p>
+      <w:pPr>
+        <w:pStyle w:val="BodyText"/>
+      </w:pPr>
+      <w:r>
+        <w:t xml:space="preserve">Install the picture program once. In the second SSH session:</w:t>
       </w:r>
     </w:p>
     <w:p>
@@ -8328,7 +8676,7 @@
         <w:rPr>
           <w:rStyle w:val="ExtensionTok"/>
         </w:rPr>
-        <w:t xml:space="preserve">import</w:t>
+        <w:t xml:space="preserve">dnf</w:t>
       </w:r>
       <w:r>
         <w:rPr>
@@ -8340,66 +8688,33 @@
         <w:rPr>
           <w:rStyle w:val="AttributeTok"/>
         </w:rPr>
-        <w:t xml:space="preserve">-window</w:t>
+        <w:t xml:space="preserve">-y</w:t>
       </w:r>
       <w:r>
         <w:rPr>
           <w:rStyle w:val="NormalTok"/>
         </w:rPr>
-        <w:t xml:space="preserve"> root </w:t>
-      </w:r>
-      <w:r>
-        <w:rPr>
-          <w:rStyle w:val="AttributeTok"/>
-        </w:rPr>
-        <w:t xml:space="preserve">-display</w:t>
-      </w:r>
-      <w:r>
-        <w:rPr>
-          <w:rStyle w:val="NormalTok"/>
-        </w:rPr>
-        <w:t xml:space="preserve"> :99 /tmp/tnms-gui/screen.png</w:t>
-      </w:r>
-      <w:r>
-        <w:br/>
-      </w:r>
-      <w:r>
-        <w:rPr>
-          <w:rStyle w:val="FunctionTok"/>
-        </w:rPr>
-        <w:t xml:space="preserve">chmod</w:t>
-      </w:r>
-      <w:r>
-        <w:rPr>
-          <w:rStyle w:val="NormalTok"/>
-        </w:rPr>
-        <w:t xml:space="preserve"> 644 /tmp/tnms-gui/screen.png</w:t>
+        <w:t xml:space="preserve"> install ImageMagick</w:t>
       </w:r>
     </w:p>
     <w:p>
       <w:pPr>
         <w:pStyle w:val="FirstParagraph"/>
-      </w:pPr>
-      <w:r>
-        <w:t xml:space="preserve">Both commands print nothing.</w:t>
-      </w:r>
-    </w:p>
-    <w:p>
-      <w:pPr>
-        <w:pStyle w:val="BodyText"/>
       </w:pPr>
       <w:r>
         <w:rPr>
           <w:bCs/>
           <w:b/>
         </w:rPr>
-        <w:t xml:space="preserve">Confirm by running,</w:t>
-      </w:r>
-      <w:r>
-        <w:t xml:space="preserve"> </w:t>
-      </w:r>
-      <w:r>
-        <w:t xml:space="preserve">in the second SSH session:</w:t>
+        <w:t xml:space="preserve">Expected output:</w:t>
+      </w:r>
+    </w:p>
+    <w:p>
+      <w:pPr>
+        <w:pStyle w:val="BodyText"/>
+      </w:pPr>
+      <w:r>
+        <w:t xml:space="preserve">The command ends with:</w:t>
       </w:r>
     </w:p>
     <w:p>
@@ -8408,86 +8723,65 @@
       </w:pPr>
       <w:r>
         <w:rPr>
-          <w:rStyle w:val="FunctionTok"/>
-        </w:rPr>
-        <w:t xml:space="preserve">ls</w:t>
-      </w:r>
-      <w:r>
-        <w:rPr>
-          <w:rStyle w:val="NormalTok"/>
-        </w:rPr>
-        <w:t xml:space="preserve"> </w:t>
-      </w:r>
-      <w:r>
-        <w:rPr>
-          <w:rStyle w:val="AttributeTok"/>
-        </w:rPr>
-        <w:t xml:space="preserve">-l</w:t>
-      </w:r>
-      <w:r>
-        <w:rPr>
-          <w:rStyle w:val="NormalTok"/>
-        </w:rPr>
-        <w:t xml:space="preserve"> /tmp/tnms-gui/screen.png</w:t>
+          <w:rStyle w:val="VerbatimChar"/>
+        </w:rPr>
+        <w:t xml:space="preserve">Complete!</w:t>
       </w:r>
     </w:p>
     <w:p>
       <w:pPr>
         <w:pStyle w:val="FirstParagraph"/>
+      </w:pPr>
+      <w:r>
+        <w:rPr>
+          <w:rStyle w:val="VerbatimChar"/>
+        </w:rPr>
+        <w:t xml:space="preserve">dnf</w:t>
+      </w:r>
+      <w:r>
+        <w:t xml:space="preserve"> </w:t>
+      </w:r>
+      <w:r>
+        <w:t xml:space="preserve">installs</w:t>
+      </w:r>
+      <w:r>
+        <w:t xml:space="preserve"> </w:t>
+      </w:r>
+      <w:r>
+        <w:rPr>
+          <w:rStyle w:val="VerbatimChar"/>
+        </w:rPr>
+        <w:t xml:space="preserve">import</w:t>
+      </w:r>
+      <w:r>
+        <w:t xml:space="preserve">. It does not take a picture. Do not run</w:t>
+      </w:r>
+      <w:r>
+        <w:t xml:space="preserve"> </w:t>
+      </w:r>
+      <w:r>
+        <w:rPr>
+          <w:rStyle w:val="VerbatimChar"/>
+        </w:rPr>
+        <w:t xml:space="preserve">dnf</w:t>
+      </w:r>
+      <w:r>
+        <w:t xml:space="preserve"> </w:t>
+      </w:r>
+      <w:r>
+        <w:t xml:space="preserve">again.</w:t>
+      </w:r>
+    </w:p>
+    <w:p>
+      <w:pPr>
+        <w:pStyle w:val="BodyText"/>
       </w:pPr>
       <w:r>
         <w:rPr>
           <w:bCs/>
           <w:b/>
         </w:rPr>
-        <w:t xml:space="preserve">Expected output:</w:t>
-      </w:r>
-    </w:p>
-    <w:p>
-      <w:pPr>
-        <w:pStyle w:val="BodyText"/>
-      </w:pPr>
-      <w:r>
-        <w:t xml:space="preserve">The line includes</w:t>
-      </w:r>
-      <w:r>
-        <w:t xml:space="preserve"> </w:t>
-      </w:r>
-      <w:r>
-        <w:rPr>
-          <w:rStyle w:val="VerbatimChar"/>
-        </w:rPr>
-        <w:t xml:space="preserve">-rw-r--r--</w:t>
-      </w:r>
-      <w:r>
-        <w:t xml:space="preserve"> </w:t>
-      </w:r>
-      <w:r>
-        <w:t xml:space="preserve">and</w:t>
-      </w:r>
-      <w:r>
-        <w:t xml:space="preserve"> </w:t>
-      </w:r>
-      <w:r>
-        <w:rPr>
-          <w:rStyle w:val="VerbatimChar"/>
-        </w:rPr>
-        <w:t xml:space="preserve">/tmp/tnms-gui/screen.png</w:t>
-      </w:r>
-      <w:r>
-        <w:t xml:space="preserve">. The size is not</w:t>
-      </w:r>
-      <w:r>
-        <w:t xml:space="preserve"> </w:t>
-      </w:r>
-      <w:r>
-        <w:rPr>
-          <w:rStyle w:val="VerbatimChar"/>
-        </w:rPr>
-        <w:t xml:space="preserve">0</w:t>
-      </w:r>
-      <w:r>
-        <w:t xml:space="preserve">.</w:t>
+        <w:t xml:space="preserve">For every wizard page, use these three windows in this order.</w:t>
       </w:r>
     </w:p>
     <w:p>
@@ -8499,7 +8793,7 @@
         <w:pStyle w:val="Compact"/>
       </w:pPr>
       <w:r>
-        <w:t xml:space="preserve">Workstation terminal. This is the third window. It is on your computer, and it is not logged into the server. If the prompt is a prompt on the server, this is the wrong window. Download the picture. Use the site admin name and the site address. On this host:</w:t>
+        <w:t xml:space="preserve">Second SSH session. Save the page and let the workstation read the file:</w:t>
       </w:r>
     </w:p>
     <w:p>
@@ -8508,26 +8802,120 @@
       </w:pPr>
       <w:r>
         <w:rPr>
+          <w:rStyle w:val="ExtensionTok"/>
+        </w:rPr>
+        <w:t xml:space="preserve">import</w:t>
+      </w:r>
+      <w:r>
+        <w:rPr>
+          <w:rStyle w:val="NormalTok"/>
+        </w:rPr>
+        <w:t xml:space="preserve"> </w:t>
+      </w:r>
+      <w:r>
+        <w:rPr>
+          <w:rStyle w:val="AttributeTok"/>
+        </w:rPr>
+        <w:t xml:space="preserve">-window</w:t>
+      </w:r>
+      <w:r>
+        <w:rPr>
+          <w:rStyle w:val="NormalTok"/>
+        </w:rPr>
+        <w:t xml:space="preserve"> root </w:t>
+      </w:r>
+      <w:r>
+        <w:rPr>
+          <w:rStyle w:val="AttributeTok"/>
+        </w:rPr>
+        <w:t xml:space="preserve">-display</w:t>
+      </w:r>
+      <w:r>
+        <w:rPr>
+          <w:rStyle w:val="NormalTok"/>
+        </w:rPr>
+        <w:t xml:space="preserve"> :99 /tmp/tnms-gui/screen.png</w:t>
+      </w:r>
+      <w:r>
+        <w:br/>
+      </w:r>
+      <w:r>
+        <w:rPr>
           <w:rStyle w:val="FunctionTok"/>
         </w:rPr>
-        <w:t xml:space="preserve">scp</w:t>
+        <w:t xml:space="preserve">chmod</w:t>
       </w:r>
       <w:r>
         <w:rPr>
           <w:rStyle w:val="NormalTok"/>
         </w:rPr>
-        <w:t xml:space="preserve"> azureuser@172.16.0.4:/tmp/tnms-gui/screen.png .</w:t>
+        <w:t xml:space="preserve"> 644 /tmp/tnms-gui/screen.png</w:t>
       </w:r>
     </w:p>
     <w:p>
       <w:pPr>
         <w:pStyle w:val="FirstParagraph"/>
+      </w:pPr>
+      <w:r>
+        <w:t xml:space="preserve">Both commands print nothing.</w:t>
+      </w:r>
+    </w:p>
+    <w:p>
+      <w:pPr>
+        <w:pStyle w:val="BodyText"/>
       </w:pPr>
       <w:r>
         <w:rPr>
           <w:bCs/>
           <w:b/>
         </w:rPr>
+        <w:t xml:space="preserve">Confirm by running,</w:t>
+      </w:r>
+      <w:r>
+        <w:t xml:space="preserve"> </w:t>
+      </w:r>
+      <w:r>
+        <w:t xml:space="preserve">in the second SSH session:</w:t>
+      </w:r>
+    </w:p>
+    <w:p>
+      <w:pPr>
+        <w:pStyle w:val="SourceCode"/>
+      </w:pPr>
+      <w:r>
+        <w:rPr>
+          <w:rStyle w:val="FunctionTok"/>
+        </w:rPr>
+        <w:t xml:space="preserve">ls</w:t>
+      </w:r>
+      <w:r>
+        <w:rPr>
+          <w:rStyle w:val="NormalTok"/>
+        </w:rPr>
+        <w:t xml:space="preserve"> </w:t>
+      </w:r>
+      <w:r>
+        <w:rPr>
+          <w:rStyle w:val="AttributeTok"/>
+        </w:rPr>
+        <w:t xml:space="preserve">-l</w:t>
+      </w:r>
+      <w:r>
+        <w:rPr>
+          <w:rStyle w:val="NormalTok"/>
+        </w:rPr>
+        <w:t xml:space="preserve"> /tmp/tnms-gui/screen.png</w:t>
+      </w:r>
+    </w:p>
+    <w:p>
+      <w:pPr>
+        <w:pStyle w:val="FirstParagraph"/>
+      </w:pPr>
+      <w:r>
+        <w:rPr>
+          <w:bCs/>
+          <w:b/>
+        </w:rPr>
         <w:t xml:space="preserve">Expected output:</w:t>
       </w:r>
     </w:p>
@@ -8536,46 +8924,46 @@
         <w:pStyle w:val="BodyText"/>
       </w:pPr>
       <w:r>
-        <w:t xml:space="preserve">The transfer reaches</w:t>
-      </w:r>
-      <w:r>
-        <w:t xml:space="preserve"> </w:t>
-      </w:r>
-      <w:r>
-        <w:rPr>
-          <w:rStyle w:val="VerbatimChar"/>
-        </w:rPr>
-        <w:t xml:space="preserve">100%</w:t>
-      </w:r>
-      <w:r>
-        <w:t xml:space="preserve">. The workstation directory where you ran</w:t>
-      </w:r>
-      <w:r>
-        <w:t xml:space="preserve"> </w:t>
-      </w:r>
-      <w:r>
-        <w:rPr>
-          <w:rStyle w:val="VerbatimChar"/>
-        </w:rPr>
-        <w:t xml:space="preserve">scp</w:t>
-      </w:r>
-      <w:r>
-        <w:t xml:space="preserve"> </w:t>
-      </w:r>
-      <w:r>
-        <w:t xml:space="preserve">now contains</w:t>
-      </w:r>
-      <w:r>
-        <w:t xml:space="preserve"> </w:t>
-      </w:r>
-      <w:r>
-        <w:rPr>
-          <w:rStyle w:val="VerbatimChar"/>
-        </w:rPr>
-        <w:t xml:space="preserve">screen.png</w:t>
-      </w:r>
-      <w:r>
-        <w:t xml:space="preserve">. Each download replaces that file. Close the old picture before you open the new one, or the viewer can keep showing the previous page.</w:t>
+        <w:t xml:space="preserve">The line includes</w:t>
+      </w:r>
+      <w:r>
+        <w:t xml:space="preserve"> </w:t>
+      </w:r>
+      <w:r>
+        <w:rPr>
+          <w:rStyle w:val="VerbatimChar"/>
+        </w:rPr>
+        <w:t xml:space="preserve">-rw-r--r--</w:t>
+      </w:r>
+      <w:r>
+        <w:t xml:space="preserve"> </w:t>
+      </w:r>
+      <w:r>
+        <w:t xml:space="preserve">and</w:t>
+      </w:r>
+      <w:r>
+        <w:t xml:space="preserve"> </w:t>
+      </w:r>
+      <w:r>
+        <w:rPr>
+          <w:rStyle w:val="VerbatimChar"/>
+        </w:rPr>
+        <w:t xml:space="preserve">/tmp/tnms-gui/screen.png</w:t>
+      </w:r>
+      <w:r>
+        <w:t xml:space="preserve">. The size is not</w:t>
+      </w:r>
+      <w:r>
+        <w:t xml:space="preserve"> </w:t>
+      </w:r>
+      <w:r>
+        <w:rPr>
+          <w:rStyle w:val="VerbatimChar"/>
+        </w:rPr>
+        <w:t xml:space="preserve">0</w:t>
+      </w:r>
+      <w:r>
+        <w:t xml:space="preserve">.</w:t>
       </w:r>
     </w:p>
     <w:p>
@@ -8587,7 +8975,71 @@
         <w:pStyle w:val="Compact"/>
       </w:pPr>
       <w:r>
-        <w:t xml:space="preserve">On the workstation, open</w:t>
+        <w:t xml:space="preserve">Workstation terminal. This is the third window. It is on your computer, and it is not logged into the server. If the prompt is a prompt on the server, this is the wrong window. Download the picture. Use the site admin name and the site address. On this host:</w:t>
+      </w:r>
+    </w:p>
+    <w:p>
+      <w:pPr>
+        <w:pStyle w:val="SourceCode"/>
+      </w:pPr>
+      <w:r>
+        <w:rPr>
+          <w:rStyle w:val="FunctionTok"/>
+        </w:rPr>
+        <w:t xml:space="preserve">scp</w:t>
+      </w:r>
+      <w:r>
+        <w:rPr>
+          <w:rStyle w:val="NormalTok"/>
+        </w:rPr>
+        <w:t xml:space="preserve"> azureuser@172.16.0.4:/tmp/tnms-gui/screen.png .</w:t>
+      </w:r>
+    </w:p>
+    <w:p>
+      <w:pPr>
+        <w:pStyle w:val="FirstParagraph"/>
+      </w:pPr>
+      <w:r>
+        <w:rPr>
+          <w:bCs/>
+          <w:b/>
+        </w:rPr>
+        <w:t xml:space="preserve">Expected output:</w:t>
+      </w:r>
+    </w:p>
+    <w:p>
+      <w:pPr>
+        <w:pStyle w:val="BodyText"/>
+      </w:pPr>
+      <w:r>
+        <w:t xml:space="preserve">The transfer reaches</w:t>
+      </w:r>
+      <w:r>
+        <w:t xml:space="preserve"> </w:t>
+      </w:r>
+      <w:r>
+        <w:rPr>
+          <w:rStyle w:val="VerbatimChar"/>
+        </w:rPr>
+        <w:t xml:space="preserve">100%</w:t>
+      </w:r>
+      <w:r>
+        <w:t xml:space="preserve">. The workstation directory where you ran</w:t>
+      </w:r>
+      <w:r>
+        <w:t xml:space="preserve"> </w:t>
+      </w:r>
+      <w:r>
+        <w:rPr>
+          <w:rStyle w:val="VerbatimChar"/>
+        </w:rPr>
+        <w:t xml:space="preserve">scp</w:t>
+      </w:r>
+      <w:r>
+        <w:t xml:space="preserve"> </w:t>
+      </w:r>
+      <w:r>
+        <w:t xml:space="preserve">now contains</w:t>
       </w:r>
       <w:r>
         <w:t xml:space="preserve"> </w:t>
@@ -8599,96 +9051,7 @@
         <w:t xml:space="preserve">screen.png</w:t>
       </w:r>
       <w:r>
-        <w:t xml:space="preserve"> </w:t>
-      </w:r>
-      <w:r>
-        <w:t xml:space="preserve">in an image viewer. The picture is one wizard page. The title is</w:t>
-      </w:r>
-      <w:r>
-        <w:t xml:space="preserve"> </w:t>
-      </w:r>
-      <w:r>
-        <w:rPr>
-          <w:rStyle w:val="VerbatimChar"/>
-        </w:rPr>
-        <w:t xml:space="preserve">TNMS 9.1.0.593.0 Installer</w:t>
-      </w:r>
-      <w:r>
-        <w:t xml:space="preserve">. Read the words on the page. Find that same page in the numbered list below. The text under that number is the required answer.</w:t>
-      </w:r>
-    </w:p>
-    <w:p>
-      <w:pPr>
-        <w:pStyle w:val="FirstParagraph"/>
-      </w:pPr>
-      <w:r>
-        <w:t xml:space="preserve">Clicking the downloaded picture does nothing. The picture is only how you see the page. On this host the click or the typed value was sent with</w:t>
-      </w:r>
-      <w:r>
-        <w:t xml:space="preserve"> </w:t>
-      </w:r>
-      <w:r>
-        <w:rPr>
-          <w:rStyle w:val="VerbatimChar"/>
-        </w:rPr>
-        <w:t xml:space="preserve">xdotool</w:t>
-      </w:r>
-      <w:r>
-        <w:t xml:space="preserve"> </w:t>
-      </w:r>
-      <w:r>
-        <w:t xml:space="preserve">from the second SSH session, with</w:t>
-      </w:r>
-      <w:r>
-        <w:t xml:space="preserve"> </w:t>
-      </w:r>
-      <w:r>
-        <w:rPr>
-          <w:rStyle w:val="VerbatimChar"/>
-        </w:rPr>
-        <w:t xml:space="preserve">DISPLAY=:99</w:t>
-      </w:r>
-      <w:r>
-        <w:t xml:space="preserve">. The first SSH session stays inside</w:t>
-      </w:r>
-      <w:r>
-        <w:t xml:space="preserve"> </w:t>
-      </w:r>
-      <w:r>
-        <w:rPr>
-          <w:rStyle w:val="VerbatimChar"/>
-        </w:rPr>
-        <w:t xml:space="preserve">./TNMS.bin</w:t>
-      </w:r>
-      <w:r>
-        <w:t xml:space="preserve"> </w:t>
-      </w:r>
-      <w:r>
-        <w:t xml:space="preserve">and is not where answers are typed.</w:t>
-      </w:r>
-    </w:p>
-    <w:p>
-      <w:pPr>
-        <w:pStyle w:val="BodyText"/>
-      </w:pPr>
-      <w:r>
-        <w:t xml:space="preserve">After the answer, start again at action 1. Download the new picture and open it. The new picture must show the next page before you use the next number. If it shows the same page, the answer did not land. Send the answer again, then take another picture.</w:t>
-      </w:r>
-    </w:p>
-    <w:p>
-      <w:pPr>
-        <w:pStyle w:val="BodyText"/>
-      </w:pPr>
-      <w:r>
-        <w:t xml:space="preserve">Stop when the first SSH session returns to a shell prompt.</w:t>
-      </w:r>
-    </w:p>
-    <w:p>
-      <w:pPr>
-        <w:pStyle w:val="BodyText"/>
-      </w:pPr>
-      <w:r>
-        <w:t xml:space="preserve">The pages, in order:</w:t>
+        <w:t xml:space="preserve">. Each download replaces that file. Close the old picture before you open the new one, or the viewer can keep showing the previous page.</w:t>
       </w:r>
     </w:p>
     <w:p>
@@ -8700,66 +9063,179 @@
         <w:pStyle w:val="Compact"/>
       </w:pPr>
       <w:r>
-        <w:t xml:space="preserve">License. Accept the terms.</w:t>
+        <w:t xml:space="preserve">On the workstation, open</w:t>
+      </w:r>
+      <w:r>
+        <w:t xml:space="preserve"> </w:t>
+      </w:r>
+      <w:r>
+        <w:rPr>
+          <w:rStyle w:val="VerbatimChar"/>
+        </w:rPr>
+        <w:t xml:space="preserve">screen.png</w:t>
+      </w:r>
+      <w:r>
+        <w:t xml:space="preserve"> </w:t>
+      </w:r>
+      <w:r>
+        <w:t xml:space="preserve">in an image viewer. The picture is one wizard page. The title is</w:t>
+      </w:r>
+      <w:r>
+        <w:t xml:space="preserve"> </w:t>
+      </w:r>
+      <w:r>
+        <w:rPr>
+          <w:rStyle w:val="VerbatimChar"/>
+        </w:rPr>
+        <w:t xml:space="preserve">TNMS 9.1.0.593.0 Installer</w:t>
+      </w:r>
+      <w:r>
+        <w:t xml:space="preserve">. Read the words on the page. Find that same page in the numbered list below. The text under that number is the required answer.</w:t>
+      </w:r>
+    </w:p>
+    <w:p>
+      <w:pPr>
+        <w:pStyle w:val="FirstParagraph"/>
+      </w:pPr>
+      <w:r>
+        <w:t xml:space="preserve">Clicking the downloaded picture does nothing. The picture is only how you see the page. On this host the click or the typed value was sent with</w:t>
+      </w:r>
+      <w:r>
+        <w:t xml:space="preserve"> </w:t>
+      </w:r>
+      <w:r>
+        <w:rPr>
+          <w:rStyle w:val="VerbatimChar"/>
+        </w:rPr>
+        <w:t xml:space="preserve">xdotool</w:t>
+      </w:r>
+      <w:r>
+        <w:t xml:space="preserve"> </w:t>
+      </w:r>
+      <w:r>
+        <w:t xml:space="preserve">from the second SSH session, with</w:t>
+      </w:r>
+      <w:r>
+        <w:t xml:space="preserve"> </w:t>
+      </w:r>
+      <w:r>
+        <w:rPr>
+          <w:rStyle w:val="VerbatimChar"/>
+        </w:rPr>
+        <w:t xml:space="preserve">DISPLAY=:99</w:t>
+      </w:r>
+      <w:r>
+        <w:t xml:space="preserve">. The first SSH session stays inside</w:t>
+      </w:r>
+      <w:r>
+        <w:t xml:space="preserve"> </w:t>
+      </w:r>
+      <w:r>
+        <w:rPr>
+          <w:rStyle w:val="VerbatimChar"/>
+        </w:rPr>
+        <w:t xml:space="preserve">./TNMS.bin</w:t>
+      </w:r>
+      <w:r>
+        <w:t xml:space="preserve"> </w:t>
+      </w:r>
+      <w:r>
+        <w:t xml:space="preserve">and is not where answers are typed.</w:t>
+      </w:r>
+    </w:p>
+    <w:p>
+      <w:pPr>
+        <w:pStyle w:val="BodyText"/>
+      </w:pPr>
+      <w:r>
+        <w:t xml:space="preserve">After the answer, start again at action 1. Download the new picture and open it. The new picture must show the next page before you use the next number. If it shows the same page, the answer did not land. Send the answer again, then take another picture.</w:t>
+      </w:r>
+    </w:p>
+    <w:p>
+      <w:pPr>
+        <w:pStyle w:val="BodyText"/>
+      </w:pPr>
+      <w:r>
+        <w:t xml:space="preserve">Stop when the first SSH session returns to a shell prompt.</w:t>
+      </w:r>
+    </w:p>
+    <w:p>
+      <w:pPr>
+        <w:pStyle w:val="BodyText"/>
+      </w:pPr>
+      <w:r>
+        <w:t xml:space="preserve">The pages, in order:</w:t>
       </w:r>
     </w:p>
     <w:p>
       <w:pPr>
         <w:numPr>
           <w:ilvl w:val="0"/>
-          <w:numId w:val="1008"/>
+          <w:numId w:val="1009"/>
         </w:numPr>
         <w:pStyle w:val="Compact"/>
       </w:pPr>
       <w:r>
-        <w:t xml:space="preserve">PDT warning (</w:t>
-      </w:r>
-      <w:r>
-        <w:rPr>
-          <w:rStyle w:val="VerbatimChar"/>
-        </w:rPr>
-        <w:t xml:space="preserve">Check for available PDTs</w:t>
-      </w:r>
-      <w:r>
-        <w:t xml:space="preserve">, folder</w:t>
-      </w:r>
-      <w:r>
-        <w:t xml:space="preserve"> </w:t>
-      </w:r>
-      <w:r>
-        <w:rPr>
-          <w:rStyle w:val="VerbatimChar"/>
-        </w:rPr>
-        <w:t xml:space="preserve">TNMS_Installer/PUs</w:t>
-      </w:r>
-      <w:r>
-        <w:t xml:space="preserve">). Dismiss it when</w:t>
-      </w:r>
-      <w:r>
-        <w:t xml:space="preserve"> </w:t>
-      </w:r>
-      <w:r>
-        <w:rPr>
-          <w:rStyle w:val="VerbatimChar"/>
-        </w:rPr>
-        <w:t xml:space="preserve">PUs/</w:t>
-      </w:r>
-      <w:r>
-        <w:t xml:space="preserve"> </w:t>
-      </w:r>
-      <w:r>
-        <w:t xml:space="preserve">is empty.</w:t>
+        <w:t xml:space="preserve">License. Accept the terms.</w:t>
       </w:r>
     </w:p>
     <w:p>
       <w:pPr>
         <w:numPr>
           <w:ilvl w:val="0"/>
-          <w:numId w:val="1008"/>
+          <w:numId w:val="1009"/>
         </w:numPr>
         <w:pStyle w:val="Compact"/>
       </w:pPr>
       <w:r>
+        <w:t xml:space="preserve">PDT warning (</w:t>
+      </w:r>
+      <w:r>
+        <w:rPr>
+          <w:rStyle w:val="VerbatimChar"/>
+        </w:rPr>
+        <w:t xml:space="preserve">Check for available PDTs</w:t>
+      </w:r>
+      <w:r>
+        <w:t xml:space="preserve">, folder</w:t>
+      </w:r>
+      <w:r>
+        <w:t xml:space="preserve"> </w:t>
+      </w:r>
+      <w:r>
+        <w:rPr>
+          <w:rStyle w:val="VerbatimChar"/>
+        </w:rPr>
+        <w:t xml:space="preserve">TNMS_Installer/PUs</w:t>
+      </w:r>
+      <w:r>
+        <w:t xml:space="preserve">). Dismiss it when</w:t>
+      </w:r>
+      <w:r>
+        <w:t xml:space="preserve"> </w:t>
+      </w:r>
+      <w:r>
+        <w:rPr>
+          <w:rStyle w:val="VerbatimChar"/>
+        </w:rPr>
+        <w:t xml:space="preserve">PUs/</w:t>
+      </w:r>
+      <w:r>
+        <w:t xml:space="preserve"> </w:t>
+      </w:r>
+      <w:r>
+        <w:t xml:space="preserve">is empty.</w:t>
+      </w:r>
+    </w:p>
+    <w:p>
+      <w:pPr>
+        <w:numPr>
+          <w:ilvl w:val="0"/>
+          <w:numId w:val="1009"/>
+        </w:numPr>
+        <w:pStyle w:val="Compact"/>
+      </w:pPr>
+      <w:r>
         <w:t xml:space="preserve">Installation package.</w:t>
       </w:r>
       <w:r>
@@ -8780,7 +9256,7 @@
       <w:pPr>
         <w:numPr>
           <w:ilvl w:val="0"/>
-          <w:numId w:val="1008"/>
+          <w:numId w:val="1009"/>
         </w:numPr>
         <w:pStyle w:val="Compact"/>
       </w:pPr>
@@ -8792,7 +9268,7 @@
       <w:pPr>
         <w:numPr>
           <w:ilvl w:val="0"/>
-          <w:numId w:val="1008"/>
+          <w:numId w:val="1009"/>
         </w:numPr>
         <w:pStyle w:val="Compact"/>
       </w:pPr>
@@ -8817,7 +9293,7 @@
       <w:pPr>
         <w:numPr>
           <w:ilvl w:val="0"/>
-          <w:numId w:val="1008"/>
+          <w:numId w:val="1009"/>
         </w:numPr>
         <w:pStyle w:val="Compact"/>
       </w:pPr>
@@ -8945,7 +9421,7 @@
       <w:pPr>
         <w:numPr>
           <w:ilvl w:val="0"/>
-          <w:numId w:val="1008"/>
+          <w:numId w:val="1009"/>
         </w:numPr>
         <w:pStyle w:val="Compact"/>
       </w:pPr>
@@ -8970,7 +9446,7 @@
       <w:pPr>
         <w:numPr>
           <w:ilvl w:val="0"/>
-          <w:numId w:val="1008"/>
+          <w:numId w:val="1009"/>
         </w:numPr>
         <w:pStyle w:val="Compact"/>
       </w:pPr>
@@ -9096,7 +9572,7 @@
       <w:pPr>
         <w:numPr>
           <w:ilvl w:val="0"/>
-          <w:numId w:val="1008"/>
+          <w:numId w:val="1009"/>
         </w:numPr>
         <w:pStyle w:val="Compact"/>
       </w:pPr>
@@ -9108,7 +9584,7 @@
       <w:pPr>
         <w:numPr>
           <w:ilvl w:val="0"/>
-          <w:numId w:val="1008"/>
+          <w:numId w:val="1009"/>
         </w:numPr>
         <w:pStyle w:val="Compact"/>
       </w:pPr>
@@ -9120,7 +9596,7 @@
       <w:pPr>
         <w:numPr>
           <w:ilvl w:val="0"/>
-          <w:numId w:val="1008"/>
+          <w:numId w:val="1009"/>
         </w:numPr>
         <w:pStyle w:val="Compact"/>
       </w:pPr>
@@ -9132,7 +9608,7 @@
       <w:pPr>
         <w:numPr>
           <w:ilvl w:val="0"/>
-          <w:numId w:val="1008"/>
+          <w:numId w:val="1009"/>
         </w:numPr>
         <w:pStyle w:val="Compact"/>
       </w:pPr>
@@ -9144,7 +9620,7 @@
       <w:pPr>
         <w:numPr>
           <w:ilvl w:val="0"/>
-          <w:numId w:val="1008"/>
+          <w:numId w:val="1009"/>
         </w:numPr>
         <w:pStyle w:val="Compact"/>
       </w:pPr>
@@ -9156,7 +9632,7 @@
       <w:pPr>
         <w:numPr>
           <w:ilvl w:val="0"/>
-          <w:numId w:val="1008"/>
+          <w:numId w:val="1009"/>
         </w:numPr>
         <w:pStyle w:val="Compact"/>
       </w:pPr>
@@ -10568,6 +11044,9 @@
     <w:abstractNumId w:val="991"/>
   </w:num>
   <w:num w:numId="1005">
+    <w:abstractNumId w:val="991"/>
+  </w:num>
+  <w:num w:numId="1006">
     <w:abstractNumId w:val="99411"/>
     <w:lvlOverride w:ilvl="0">
       <w:startOverride w:val="1"/>
@@ -10597,7 +11076,7 @@
       <w:startOverride w:val="1"/>
     </w:lvlOverride>
   </w:num>
-  <w:num w:numId="1006">
+  <w:num w:numId="1007">
     <w:abstractNumId w:val="99412"/>
     <w:lvlOverride w:ilvl="0">
       <w:startOverride w:val="2"/>
@@ -10627,7 +11106,7 @@
       <w:startOverride w:val="2"/>
     </w:lvlOverride>
   </w:num>
-  <w:num w:numId="1007">
+  <w:num w:numId="1008">
     <w:abstractNumId w:val="99413"/>
     <w:lvlOverride w:ilvl="0">
       <w:startOverride w:val="3"/>
@@ -10657,7 +11136,7 @@
       <w:startOverride w:val="3"/>
     </w:lvlOverride>
   </w:num>
-  <w:num w:numId="1008">
+  <w:num w:numId="1009">
     <w:abstractNumId w:val="99411"/>
     <w:lvlOverride w:ilvl="0">
       <w:startOverride w:val="1"/>

</xml_diff>